<commit_message>
added post-presentation inclusions + doc edits
</commit_message>
<xml_diff>
--- a/doc/CEN4072_Group15_FinalReport.docx
+++ b/doc/CEN4072_Group15_FinalReport.docx
@@ -101,19 +101,8 @@
           <w:sz w:val="26"/>
           <w:szCs w:val="26"/>
         </w:rPr>
-        <w:t xml:space="preserve">Deepa </w:t>
-      </w:r>
-      <w:proofErr w:type="spellStart"/>
-      <w:r>
-        <w:rPr>
-          <w:rFonts w:ascii="Calibri" w:hAnsi="Calibri" w:cs="Calibri"/>
-          <w:color w:val="000000"/>
-          <w:sz w:val="26"/>
-          <w:szCs w:val="26"/>
-        </w:rPr>
-        <w:t>Devasenapathy</w:t>
-      </w:r>
-      <w:proofErr w:type="spellEnd"/>
+        <w:t>Deepa Devasenapathy</w:t>
+      </w:r>
     </w:p>
     <w:p>
       <w:pPr>
@@ -208,9 +197,8 @@
           <w:sz w:val="26"/>
           <w:szCs w:val="26"/>
         </w:rPr>
-        <w:t xml:space="preserve"> Robert </w:t>
-      </w:r>
-      <w:proofErr w:type="gramStart"/>
+        <w:t xml:space="preserve"> Robert Benstine</w:t>
+      </w:r>
       <w:r>
         <w:rPr>
           <w:rFonts w:ascii="Calibri" w:hAnsi="Calibri" w:cs="Calibri"/>
@@ -218,9 +206,8 @@
           <w:sz w:val="26"/>
           <w:szCs w:val="26"/>
         </w:rPr>
-        <w:t>Benstine  |</w:t>
-      </w:r>
-      <w:proofErr w:type="gramEnd"/>
+        <w:t xml:space="preserve"> </w:t>
+      </w:r>
       <w:r>
         <w:rPr>
           <w:rFonts w:ascii="Calibri" w:hAnsi="Calibri" w:cs="Calibri"/>
@@ -228,9 +215,8 @@
           <w:sz w:val="26"/>
           <w:szCs w:val="26"/>
         </w:rPr>
-        <w:t xml:space="preserve">  Dennis </w:t>
-      </w:r>
-      <w:proofErr w:type="gramStart"/>
+        <w:t>|</w:t>
+      </w:r>
       <w:r>
         <w:rPr>
           <w:rFonts w:ascii="Calibri" w:hAnsi="Calibri" w:cs="Calibri"/>
@@ -238,9 +224,8 @@
           <w:sz w:val="26"/>
           <w:szCs w:val="26"/>
         </w:rPr>
-        <w:t>Kerry  |</w:t>
-      </w:r>
-      <w:proofErr w:type="gramEnd"/>
+        <w:t xml:space="preserve"> </w:t>
+      </w:r>
       <w:r>
         <w:rPr>
           <w:rFonts w:ascii="Calibri" w:hAnsi="Calibri" w:cs="Calibri"/>
@@ -248,7 +233,43 @@
           <w:sz w:val="26"/>
           <w:szCs w:val="26"/>
         </w:rPr>
-        <w:t>  Myles Vinal</w:t>
+        <w:t>Dennis Kerry</w:t>
+      </w:r>
+      <w:r>
+        <w:rPr>
+          <w:rFonts w:ascii="Calibri" w:hAnsi="Calibri" w:cs="Calibri"/>
+          <w:color w:val="000000"/>
+          <w:sz w:val="26"/>
+          <w:szCs w:val="26"/>
+        </w:rPr>
+        <w:t xml:space="preserve"> </w:t>
+      </w:r>
+      <w:r>
+        <w:rPr>
+          <w:rFonts w:ascii="Calibri" w:hAnsi="Calibri" w:cs="Calibri"/>
+          <w:color w:val="000000"/>
+          <w:sz w:val="26"/>
+          <w:szCs w:val="26"/>
+        </w:rPr>
+        <w:t>|</w:t>
+      </w:r>
+      <w:r>
+        <w:rPr>
+          <w:rFonts w:ascii="Calibri" w:hAnsi="Calibri" w:cs="Calibri"/>
+          <w:color w:val="000000"/>
+          <w:sz w:val="26"/>
+          <w:szCs w:val="26"/>
+        </w:rPr>
+        <w:t xml:space="preserve"> </w:t>
+      </w:r>
+      <w:r>
+        <w:rPr>
+          <w:rFonts w:ascii="Calibri" w:hAnsi="Calibri" w:cs="Calibri"/>
+          <w:color w:val="000000"/>
+          <w:sz w:val="26"/>
+          <w:szCs w:val="26"/>
+        </w:rPr>
+        <w:t>Myles Vinal</w:t>
       </w:r>
     </w:p>
     <w:p>
@@ -291,7 +312,21 @@
           <w:rFonts w:ascii="Calibri" w:eastAsia="Times New Roman" w:hAnsi="Calibri" w:cs="Calibri"/>
           <w:color w:val="000000"/>
         </w:rPr>
-        <w:t>1.2 Project Goal</w:t>
+        <w:t>1.</w:t>
+      </w:r>
+      <w:r>
+        <w:rPr>
+          <w:rFonts w:ascii="Calibri" w:eastAsia="Times New Roman" w:hAnsi="Calibri" w:cs="Calibri"/>
+          <w:color w:val="000000"/>
+        </w:rPr>
+        <w:t>1</w:t>
+      </w:r>
+      <w:r>
+        <w:rPr>
+          <w:rFonts w:ascii="Calibri" w:eastAsia="Times New Roman" w:hAnsi="Calibri" w:cs="Calibri"/>
+          <w:color w:val="000000"/>
+        </w:rPr>
+        <w:t xml:space="preserve"> Project Goal</w:t>
       </w:r>
     </w:p>
     <w:p>
@@ -441,8 +476,21 @@
           <w:rFonts w:ascii="Calibri" w:eastAsia="Times New Roman" w:hAnsi="Calibri" w:cs="Calibri"/>
           <w:color w:val="000000"/>
         </w:rPr>
-        <w:lastRenderedPageBreak/>
-        <w:t>1.3 System &amp; Test Summary</w:t>
+        <w:t>1.</w:t>
+      </w:r>
+      <w:r>
+        <w:rPr>
+          <w:rFonts w:ascii="Calibri" w:eastAsia="Times New Roman" w:hAnsi="Calibri" w:cs="Calibri"/>
+          <w:color w:val="000000"/>
+        </w:rPr>
+        <w:t>2</w:t>
+      </w:r>
+      <w:r>
+        <w:rPr>
+          <w:rFonts w:ascii="Calibri" w:eastAsia="Times New Roman" w:hAnsi="Calibri" w:cs="Calibri"/>
+          <w:color w:val="000000"/>
+        </w:rPr>
+        <w:t xml:space="preserve"> System &amp; Test Summary</w:t>
       </w:r>
     </w:p>
     <w:p>
@@ -531,6 +579,7 @@
           <w:rFonts w:ascii="Calibri" w:eastAsia="Times New Roman" w:hAnsi="Calibri" w:cs="Calibri"/>
           <w:color w:val="000000"/>
         </w:rPr>
+        <w:lastRenderedPageBreak/>
         <w:t>Test Classification</w:t>
       </w:r>
     </w:p>
@@ -600,7 +649,7 @@
     </w:p>
     <w:tbl>
       <w:tblPr>
-        <w:tblW w:w="5000" w:type="pct"/>
+        <w:tblW w:w="3798" w:type="pct"/>
         <w:tblCellMar>
           <w:top w:w="15" w:type="dxa"/>
           <w:left w:w="15" w:type="dxa"/>
@@ -611,13 +660,14 @@
       </w:tblPr>
       <w:tblGrid>
         <w:gridCol w:w="1912"/>
-        <w:gridCol w:w="5286"/>
+        <w:gridCol w:w="4169"/>
         <w:gridCol w:w="1142"/>
-        <w:gridCol w:w="1020"/>
+        <w:gridCol w:w="981"/>
       </w:tblGrid>
       <w:tr>
         <w:trPr>
           <w:divId w:val="1354304626"/>
+          <w:trHeight w:val="610"/>
         </w:trPr>
         <w:tc>
           <w:tcPr>
@@ -775,6 +825,7 @@
       <w:tr>
         <w:trPr>
           <w:divId w:val="1354304626"/>
+          <w:trHeight w:val="610"/>
         </w:trPr>
         <w:tc>
           <w:tcPr>
@@ -803,7 +854,6 @@
                 <w:szCs w:val="22"/>
               </w:rPr>
             </w:pPr>
-            <w:proofErr w:type="spellStart"/>
             <w:r>
               <w:rPr>
                 <w:rFonts w:ascii="Calibri" w:eastAsia="Times New Roman" w:hAnsi="Calibri" w:cs="Calibri"/>
@@ -813,7 +863,6 @@
               </w:rPr>
               <w:t>HomePageTest</w:t>
             </w:r>
-            <w:proofErr w:type="spellEnd"/>
           </w:p>
         </w:tc>
         <w:tc>
@@ -943,6 +992,7 @@
       <w:tr>
         <w:trPr>
           <w:divId w:val="1354304626"/>
+          <w:trHeight w:val="841"/>
         </w:trPr>
         <w:tc>
           <w:tcPr>
@@ -971,7 +1021,6 @@
                 <w:szCs w:val="22"/>
               </w:rPr>
             </w:pPr>
-            <w:proofErr w:type="spellStart"/>
             <w:r>
               <w:rPr>
                 <w:rFonts w:ascii="Calibri" w:eastAsia="Times New Roman" w:hAnsi="Calibri" w:cs="Calibri"/>
@@ -981,7 +1030,6 @@
               </w:rPr>
               <w:t>LoginPageTest</w:t>
             </w:r>
-            <w:proofErr w:type="spellEnd"/>
           </w:p>
         </w:tc>
         <w:tc>
@@ -1111,6 +1159,7 @@
       <w:tr>
         <w:trPr>
           <w:divId w:val="1354304626"/>
+          <w:trHeight w:val="841"/>
         </w:trPr>
         <w:tc>
           <w:tcPr>
@@ -1139,7 +1188,6 @@
                 <w:szCs w:val="22"/>
               </w:rPr>
             </w:pPr>
-            <w:proofErr w:type="spellStart"/>
             <w:r>
               <w:rPr>
                 <w:rFonts w:ascii="Calibri" w:eastAsia="Times New Roman" w:hAnsi="Calibri" w:cs="Calibri"/>
@@ -1149,7 +1197,6 @@
               </w:rPr>
               <w:t>SignupPageTest</w:t>
             </w:r>
-            <w:proofErr w:type="spellEnd"/>
           </w:p>
         </w:tc>
         <w:tc>
@@ -1279,6 +1326,7 @@
       <w:tr>
         <w:trPr>
           <w:divId w:val="1354304626"/>
+          <w:trHeight w:val="841"/>
         </w:trPr>
         <w:tc>
           <w:tcPr>
@@ -1307,7 +1355,6 @@
                 <w:szCs w:val="22"/>
               </w:rPr>
             </w:pPr>
-            <w:proofErr w:type="spellStart"/>
             <w:r>
               <w:rPr>
                 <w:rFonts w:ascii="Calibri" w:eastAsia="Times New Roman" w:hAnsi="Calibri" w:cs="Calibri"/>
@@ -1317,7 +1364,6 @@
               </w:rPr>
               <w:t>SearchTest</w:t>
             </w:r>
-            <w:proofErr w:type="spellEnd"/>
           </w:p>
         </w:tc>
         <w:tc>
@@ -1447,6 +1493,7 @@
       <w:tr>
         <w:trPr>
           <w:divId w:val="1354304626"/>
+          <w:trHeight w:val="841"/>
         </w:trPr>
         <w:tc>
           <w:tcPr>
@@ -1475,7 +1522,6 @@
                 <w:szCs w:val="22"/>
               </w:rPr>
             </w:pPr>
-            <w:proofErr w:type="spellStart"/>
             <w:r>
               <w:rPr>
                 <w:rFonts w:ascii="Calibri" w:eastAsia="Times New Roman" w:hAnsi="Calibri" w:cs="Calibri"/>
@@ -1485,7 +1531,6 @@
               </w:rPr>
               <w:t>NavigationTest</w:t>
             </w:r>
-            <w:proofErr w:type="spellEnd"/>
           </w:p>
         </w:tc>
         <w:tc>
@@ -1615,6 +1660,7 @@
       <w:tr>
         <w:trPr>
           <w:divId w:val="1354304626"/>
+          <w:trHeight w:val="841"/>
         </w:trPr>
         <w:tc>
           <w:tcPr>
@@ -1643,18 +1689,15 @@
                 <w:szCs w:val="22"/>
               </w:rPr>
             </w:pPr>
-            <w:proofErr w:type="spellStart"/>
-            <w:r>
-              <w:rPr>
-                <w:rFonts w:ascii="Calibri" w:eastAsia="Times New Roman" w:hAnsi="Calibri" w:cs="Calibri"/>
-                <w:color w:val="000000"/>
-                <w:sz w:val="22"/>
-                <w:szCs w:val="22"/>
-              </w:rPr>
-              <w:lastRenderedPageBreak/>
+            <w:r>
+              <w:rPr>
+                <w:rFonts w:ascii="Calibri" w:eastAsia="Times New Roman" w:hAnsi="Calibri" w:cs="Calibri"/>
+                <w:color w:val="000000"/>
+                <w:sz w:val="22"/>
+                <w:szCs w:val="22"/>
+              </w:rPr>
               <w:t>GamePageTest</w:t>
             </w:r>
-            <w:proofErr w:type="spellEnd"/>
           </w:p>
         </w:tc>
         <w:tc>
@@ -1691,27 +1734,7 @@
                 <w:sz w:val="22"/>
                 <w:szCs w:val="22"/>
               </w:rPr>
-              <w:t>The Witcher 3 product page: title</w:t>
-            </w:r>
-            <w:proofErr w:type="gramStart"/>
-            <w:r>
-              <w:rPr>
-                <w:rFonts w:ascii="Calibri" w:eastAsia="Times New Roman" w:hAnsi="Calibri" w:cs="Calibri"/>
-                <w:color w:val="000000"/>
-                <w:sz w:val="22"/>
-                <w:szCs w:val="22"/>
-              </w:rPr>
-              <w:t>, buy</w:t>
-            </w:r>
-            <w:proofErr w:type="gramEnd"/>
-            <w:r>
-              <w:rPr>
-                <w:rFonts w:ascii="Calibri" w:eastAsia="Times New Roman" w:hAnsi="Calibri" w:cs="Calibri"/>
-                <w:color w:val="000000"/>
-                <w:sz w:val="22"/>
-                <w:szCs w:val="22"/>
-              </w:rPr>
-              <w:t xml:space="preserve"> button, description, screenshots</w:t>
+              <w:t>The Witcher 3 product page: title, buy button, description, screenshots</w:t>
             </w:r>
           </w:p>
         </w:tc>
@@ -1804,6 +1827,7 @@
       <w:tr>
         <w:trPr>
           <w:divId w:val="1354304626"/>
+          <w:trHeight w:val="841"/>
         </w:trPr>
         <w:tc>
           <w:tcPr>
@@ -1832,7 +1856,6 @@
                 <w:szCs w:val="22"/>
               </w:rPr>
             </w:pPr>
-            <w:proofErr w:type="spellStart"/>
             <w:r>
               <w:rPr>
                 <w:rFonts w:ascii="Calibri" w:eastAsia="Times New Roman" w:hAnsi="Calibri" w:cs="Calibri"/>
@@ -1842,7 +1865,6 @@
               </w:rPr>
               <w:t>GenreBrowseTest</w:t>
             </w:r>
-            <w:proofErr w:type="spellEnd"/>
           </w:p>
         </w:tc>
         <w:tc>
@@ -1972,6 +1994,7 @@
       <w:tr>
         <w:trPr>
           <w:divId w:val="1354304626"/>
+          <w:trHeight w:val="828"/>
         </w:trPr>
         <w:tc>
           <w:tcPr>
@@ -2000,7 +2023,6 @@
                 <w:szCs w:val="22"/>
               </w:rPr>
             </w:pPr>
-            <w:proofErr w:type="spellStart"/>
             <w:r>
               <w:rPr>
                 <w:rFonts w:ascii="Calibri" w:eastAsia="Times New Roman" w:hAnsi="Calibri" w:cs="Calibri"/>
@@ -2010,7 +2032,6 @@
               </w:rPr>
               <w:t>CartPageTest</w:t>
             </w:r>
-            <w:proofErr w:type="spellEnd"/>
           </w:p>
         </w:tc>
         <w:tc>
@@ -2140,6 +2161,7 @@
       <w:tr>
         <w:trPr>
           <w:divId w:val="1354304626"/>
+          <w:trHeight w:val="868"/>
         </w:trPr>
         <w:tc>
           <w:tcPr>
@@ -2313,6 +2335,7 @@
           <w:rFonts w:ascii="Calibri" w:eastAsia="Times New Roman" w:hAnsi="Calibri" w:cs="Calibri"/>
           <w:color w:val="000000"/>
         </w:rPr>
+        <w:lastRenderedPageBreak/>
         <w:t>Test Design Approach</w:t>
       </w:r>
     </w:p>
@@ -2332,7 +2355,6 @@
         </w:rPr>
         <w:t xml:space="preserve">Each test class extends a shared </w:t>
       </w:r>
-      <w:proofErr w:type="spellStart"/>
       <w:r>
         <w:rPr>
           <w:rStyle w:val="code1"/>
@@ -2341,37 +2363,12 @@
         </w:rPr>
         <w:t>BaseTest</w:t>
       </w:r>
-      <w:proofErr w:type="spellEnd"/>
       <w:r>
         <w:rPr>
           <w:rFonts w:ascii="Calibri" w:hAnsi="Calibri" w:cs="Calibri"/>
           <w:color w:val="000000"/>
         </w:rPr>
-        <w:t xml:space="preserve"> class that initializes and tears down </w:t>
-      </w:r>
-      <w:proofErr w:type="spellStart"/>
-      <w:r>
-        <w:rPr>
-          <w:rFonts w:ascii="Calibri" w:hAnsi="Calibri" w:cs="Calibri"/>
-          <w:color w:val="000000"/>
-        </w:rPr>
-        <w:t>ChromeDriver</w:t>
-      </w:r>
-      <w:proofErr w:type="spellEnd"/>
-      <w:r>
-        <w:rPr>
-          <w:rFonts w:ascii="Calibri" w:hAnsi="Calibri" w:cs="Calibri"/>
-          <w:color w:val="000000"/>
-        </w:rPr>
-        <w:t xml:space="preserve"> once per class. </w:t>
-      </w:r>
-      <w:proofErr w:type="gramStart"/>
-      <w:r>
-        <w:rPr>
-          <w:rFonts w:ascii="Calibri" w:hAnsi="Calibri" w:cs="Calibri"/>
-          <w:color w:val="000000"/>
-        </w:rPr>
-        <w:t xml:space="preserve">A </w:t>
+        <w:t xml:space="preserve"> class that initializes and tears down ChromeDriver once per class. </w:t>
       </w:r>
       <w:r>
         <w:rPr>
@@ -2379,56 +2376,43 @@
           <w:rFonts w:cs="Calibri"/>
           <w:color w:val="000000"/>
         </w:rPr>
-        <w:t>@</w:t>
-      </w:r>
-      <w:proofErr w:type="gramEnd"/>
+        <w:t>@BeforeMethod</w:t>
+      </w:r>
+      <w:r>
+        <w:rPr>
+          <w:rFonts w:ascii="Calibri" w:hAnsi="Calibri" w:cs="Calibri"/>
+          <w:color w:val="000000"/>
+        </w:rPr>
+        <w:t xml:space="preserve"> in each class navigates to the relevant page before every test. Tests use CSS selectors, XPath, and </w:t>
+      </w:r>
       <w:r>
         <w:rPr>
           <w:rStyle w:val="code1"/>
           <w:rFonts w:cs="Calibri"/>
           <w:color w:val="000000"/>
         </w:rPr>
-        <w:t>BeforeMethod</w:t>
+        <w:t>WebDriverWait</w:t>
       </w:r>
       <w:r>
         <w:rPr>
           <w:rFonts w:ascii="Calibri" w:hAnsi="Calibri" w:cs="Calibri"/>
           <w:color w:val="000000"/>
         </w:rPr>
-        <w:t xml:space="preserve"> in each class navigates to the relevant page before every test. Tests use CSS selectors, XPath, and </w:t>
-      </w:r>
-      <w:proofErr w:type="spellStart"/>
+        <w:t xml:space="preserve"> with a 20-second timeout. Shared helpers (cookie consent dismissal, page-load wait, element presence check) are centralized in </w:t>
+      </w:r>
       <w:r>
         <w:rPr>
           <w:rStyle w:val="code1"/>
           <w:rFonts w:cs="Calibri"/>
           <w:color w:val="000000"/>
         </w:rPr>
-        <w:t>WebDriverWait</w:t>
-      </w:r>
-      <w:proofErr w:type="spellEnd"/>
+        <w:t>TestUtils</w:t>
+      </w:r>
       <w:r>
         <w:rPr>
           <w:rFonts w:ascii="Calibri" w:hAnsi="Calibri" w:cs="Calibri"/>
           <w:color w:val="000000"/>
         </w:rPr>
-        <w:t xml:space="preserve"> with a 20-second timeout. Shared helpers (cookie consent dismissal, page-load wait, element presence check) are centralized in </w:t>
-      </w:r>
-      <w:proofErr w:type="spellStart"/>
-      <w:r>
-        <w:rPr>
-          <w:rStyle w:val="code1"/>
-          <w:rFonts w:cs="Calibri"/>
-          <w:color w:val="000000"/>
-        </w:rPr>
-        <w:t>TestUtils</w:t>
-      </w:r>
-      <w:proofErr w:type="spellEnd"/>
-      <w:r>
-        <w:rPr>
-          <w:rFonts w:ascii="Calibri" w:hAnsi="Calibri" w:cs="Calibri"/>
-          <w:color w:val="000000"/>
-        </w:rPr>
         <w:t xml:space="preserve">. </w:t>
       </w:r>
     </w:p>
@@ -2446,7 +2430,21 @@
           <w:rFonts w:ascii="Calibri" w:eastAsia="Times New Roman" w:hAnsi="Calibri" w:cs="Calibri"/>
           <w:color w:val="000000"/>
         </w:rPr>
-        <w:t>1.4 Workflow Diagram</w:t>
+        <w:t>1.</w:t>
+      </w:r>
+      <w:r>
+        <w:rPr>
+          <w:rFonts w:ascii="Calibri" w:eastAsia="Times New Roman" w:hAnsi="Calibri" w:cs="Calibri"/>
+          <w:color w:val="000000"/>
+        </w:rPr>
+        <w:t>3</w:t>
+      </w:r>
+      <w:r>
+        <w:rPr>
+          <w:rFonts w:ascii="Calibri" w:eastAsia="Times New Roman" w:hAnsi="Calibri" w:cs="Calibri"/>
+          <w:color w:val="000000"/>
+        </w:rPr>
+        <w:t xml:space="preserve"> Workflow Diagram</w:t>
       </w:r>
     </w:p>
     <w:p>
@@ -2468,7 +2466,7 @@
     </w:p>
     <w:tbl>
       <w:tblPr>
-        <w:tblW w:w="5000" w:type="pct"/>
+        <w:tblW w:w="3777" w:type="pct"/>
         <w:tblCellMar>
           <w:top w:w="15" w:type="dxa"/>
           <w:left w:w="15" w:type="dxa"/>
@@ -2478,12 +2476,13 @@
         <w:tblLook w:val="04A0" w:firstRow="1" w:lastRow="0" w:firstColumn="1" w:lastColumn="0" w:noHBand="0" w:noVBand="1"/>
       </w:tblPr>
       <w:tblGrid>
-        <w:gridCol w:w="2222"/>
-        <w:gridCol w:w="7138"/>
+        <w:gridCol w:w="2177"/>
+        <w:gridCol w:w="5981"/>
       </w:tblGrid>
       <w:tr>
         <w:trPr>
           <w:divId w:val="1354304626"/>
+          <w:trHeight w:val="664"/>
         </w:trPr>
         <w:tc>
           <w:tcPr>
@@ -2565,6 +2564,7 @@
       <w:tr>
         <w:trPr>
           <w:divId w:val="1354304626"/>
+          <w:trHeight w:val="634"/>
         </w:trPr>
         <w:tc>
           <w:tcPr>
@@ -2631,23 +2631,13 @@
                 <w:szCs w:val="22"/>
               </w:rPr>
             </w:pPr>
-            <w:proofErr w:type="spellStart"/>
             <w:r>
               <w:rPr>
                 <w:rStyle w:val="code1"/>
                 <w:rFonts w:eastAsia="Times New Roman" w:cs="Calibri"/>
                 <w:color w:val="000000"/>
               </w:rPr>
-              <w:t>mvn</w:t>
-            </w:r>
-            <w:proofErr w:type="spellEnd"/>
-            <w:r>
-              <w:rPr>
-                <w:rStyle w:val="code1"/>
-                <w:rFonts w:eastAsia="Times New Roman" w:cs="Calibri"/>
-                <w:color w:val="000000"/>
-              </w:rPr>
-              <w:t xml:space="preserve"> test</w:t>
+              <w:t>mvn test</w:t>
             </w:r>
             <w:r>
               <w:rPr>
@@ -2681,6 +2671,7 @@
       <w:tr>
         <w:trPr>
           <w:divId w:val="1354304626"/>
+          <w:trHeight w:val="915"/>
         </w:trPr>
         <w:tc>
           <w:tcPr>
@@ -2716,20 +2707,8 @@
                 <w:sz w:val="22"/>
                 <w:szCs w:val="22"/>
               </w:rPr>
-              <w:lastRenderedPageBreak/>
-              <w:t xml:space="preserve">2. </w:t>
-            </w:r>
-            <w:proofErr w:type="spellStart"/>
-            <w:r>
-              <w:rPr>
-                <w:rFonts w:ascii="Calibri" w:eastAsia="Times New Roman" w:hAnsi="Calibri" w:cs="Calibri"/>
-                <w:color w:val="000000"/>
-                <w:sz w:val="22"/>
-                <w:szCs w:val="22"/>
-              </w:rPr>
-              <w:t>WebDriverManager</w:t>
-            </w:r>
-            <w:proofErr w:type="spellEnd"/>
+              <w:t>2. WebDriverManager</w:t>
+            </w:r>
           </w:p>
         </w:tc>
         <w:tc>
@@ -2766,27 +2745,7 @@
                 <w:sz w:val="22"/>
                 <w:szCs w:val="22"/>
               </w:rPr>
-              <w:t xml:space="preserve">Automatically downloads the matching </w:t>
-            </w:r>
-            <w:proofErr w:type="spellStart"/>
-            <w:r>
-              <w:rPr>
-                <w:rFonts w:ascii="Calibri" w:eastAsia="Times New Roman" w:hAnsi="Calibri" w:cs="Calibri"/>
-                <w:color w:val="000000"/>
-                <w:sz w:val="22"/>
-                <w:szCs w:val="22"/>
-              </w:rPr>
-              <w:t>ChromeDriver</w:t>
-            </w:r>
-            <w:proofErr w:type="spellEnd"/>
-            <w:r>
-              <w:rPr>
-                <w:rFonts w:ascii="Calibri" w:eastAsia="Times New Roman" w:hAnsi="Calibri" w:cs="Calibri"/>
-                <w:color w:val="000000"/>
-                <w:sz w:val="22"/>
-                <w:szCs w:val="22"/>
-              </w:rPr>
-              <w:t xml:space="preserve"> binary</w:t>
+              <w:t>Automatically downloads the matching ChromeDriver binary</w:t>
             </w:r>
           </w:p>
         </w:tc>
@@ -2794,6 +2753,7 @@
       <w:tr>
         <w:trPr>
           <w:divId w:val="1354304626"/>
+          <w:trHeight w:val="915"/>
         </w:trPr>
         <w:tc>
           <w:tcPr>
@@ -2829,27 +2789,7 @@
                 <w:sz w:val="22"/>
                 <w:szCs w:val="22"/>
               </w:rPr>
-              <w:t xml:space="preserve">3. </w:t>
-            </w:r>
-            <w:proofErr w:type="spellStart"/>
-            <w:r>
-              <w:rPr>
-                <w:rFonts w:ascii="Calibri" w:eastAsia="Times New Roman" w:hAnsi="Calibri" w:cs="Calibri"/>
-                <w:color w:val="000000"/>
-                <w:sz w:val="22"/>
-                <w:szCs w:val="22"/>
-              </w:rPr>
-              <w:t>BaseTest.setUp</w:t>
-            </w:r>
-            <w:proofErr w:type="spellEnd"/>
-            <w:r>
-              <w:rPr>
-                <w:rFonts w:ascii="Calibri" w:eastAsia="Times New Roman" w:hAnsi="Calibri" w:cs="Calibri"/>
-                <w:color w:val="000000"/>
-                <w:sz w:val="22"/>
-                <w:szCs w:val="22"/>
-              </w:rPr>
-              <w:t>()</w:t>
+              <w:t>3. BaseTest.setUp()</w:t>
             </w:r>
           </w:p>
         </w:tc>
@@ -2895,18 +2835,8 @@
                 <w:rFonts w:eastAsia="Times New Roman" w:cs="Calibri"/>
                 <w:color w:val="000000"/>
               </w:rPr>
-              <w:t>--disable-blink-features=</w:t>
-            </w:r>
-            <w:proofErr w:type="spellStart"/>
-            <w:r>
-              <w:rPr>
-                <w:rStyle w:val="code1"/>
-                <w:rFonts w:eastAsia="Times New Roman" w:cs="Calibri"/>
-                <w:color w:val="000000"/>
-              </w:rPr>
-              <w:t>AutomationControlled</w:t>
-            </w:r>
-            <w:proofErr w:type="spellEnd"/>
+              <w:t>--disable-blink-features=AutomationControlled</w:t>
+            </w:r>
             <w:r>
               <w:rPr>
                 <w:rFonts w:ascii="Calibri" w:eastAsia="Times New Roman" w:hAnsi="Calibri" w:cs="Calibri"/>
@@ -2922,6 +2852,7 @@
       <w:tr>
         <w:trPr>
           <w:divId w:val="1354304626"/>
+          <w:trHeight w:val="649"/>
         </w:trPr>
         <w:tc>
           <w:tcPr>
@@ -2950,25 +2881,14 @@
                 <w:szCs w:val="22"/>
               </w:rPr>
             </w:pPr>
-            <w:proofErr w:type="gramStart"/>
-            <w:r>
-              <w:rPr>
-                <w:rFonts w:ascii="Calibri" w:eastAsia="Times New Roman" w:hAnsi="Calibri" w:cs="Calibri"/>
-                <w:color w:val="000000"/>
-                <w:sz w:val="22"/>
-                <w:szCs w:val="22"/>
-              </w:rPr>
-              <w:t>4. @</w:t>
-            </w:r>
-            <w:proofErr w:type="gramEnd"/>
-            <w:r>
-              <w:rPr>
-                <w:rFonts w:ascii="Calibri" w:eastAsia="Times New Roman" w:hAnsi="Calibri" w:cs="Calibri"/>
-                <w:color w:val="000000"/>
-                <w:sz w:val="22"/>
-                <w:szCs w:val="22"/>
-              </w:rPr>
-              <w:t>BeforeMethod</w:t>
+            <w:r>
+              <w:rPr>
+                <w:rFonts w:ascii="Calibri" w:eastAsia="Times New Roman" w:hAnsi="Calibri" w:cs="Calibri"/>
+                <w:color w:val="000000"/>
+                <w:sz w:val="22"/>
+                <w:szCs w:val="22"/>
+              </w:rPr>
+              <w:t>4. @BeforeMethod</w:t>
             </w:r>
           </w:p>
         </w:tc>
@@ -3014,6 +2934,7 @@
       <w:tr>
         <w:trPr>
           <w:divId w:val="1354304626"/>
+          <w:trHeight w:val="649"/>
         </w:trPr>
         <w:tc>
           <w:tcPr>
@@ -3095,6 +3016,7 @@
       <w:tr>
         <w:trPr>
           <w:divId w:val="1354304626"/>
+          <w:trHeight w:val="649"/>
         </w:trPr>
         <w:tc>
           <w:tcPr>
@@ -3170,25 +3092,13 @@
               </w:rPr>
               <w:t xml:space="preserve">Calls </w:t>
             </w:r>
-            <w:proofErr w:type="spellStart"/>
-            <w:proofErr w:type="gramStart"/>
             <w:r>
               <w:rPr>
                 <w:rStyle w:val="code1"/>
                 <w:rFonts w:eastAsia="Times New Roman" w:cs="Calibri"/>
                 <w:color w:val="000000"/>
               </w:rPr>
-              <w:t>driver.quit</w:t>
-            </w:r>
-            <w:proofErr w:type="spellEnd"/>
-            <w:proofErr w:type="gramEnd"/>
-            <w:r>
-              <w:rPr>
-                <w:rStyle w:val="code1"/>
-                <w:rFonts w:eastAsia="Times New Roman" w:cs="Calibri"/>
-                <w:color w:val="000000"/>
-              </w:rPr>
-              <w:t>()</w:t>
+              <w:t>driver.quit()</w:t>
             </w:r>
             <w:r>
               <w:rPr>
@@ -3205,6 +3115,7 @@
       <w:tr>
         <w:trPr>
           <w:divId w:val="1354304626"/>
+          <w:trHeight w:val="649"/>
         </w:trPr>
         <w:tc>
           <w:tcPr>
@@ -3286,25 +3197,7 @@
                 <w:rFonts w:eastAsia="Times New Roman" w:cs="Calibri"/>
                 <w:color w:val="000000"/>
               </w:rPr>
-              <w:t>target/</w:t>
-            </w:r>
-            <w:proofErr w:type="gramStart"/>
-            <w:r>
-              <w:rPr>
-                <w:rStyle w:val="code1"/>
-                <w:rFonts w:eastAsia="Times New Roman" w:cs="Calibri"/>
-                <w:color w:val="000000"/>
-              </w:rPr>
-              <w:t>surefire-reports</w:t>
-            </w:r>
-            <w:proofErr w:type="gramEnd"/>
-            <w:r>
-              <w:rPr>
-                <w:rStyle w:val="code1"/>
-                <w:rFonts w:eastAsia="Times New Roman" w:cs="Calibri"/>
-                <w:color w:val="000000"/>
-              </w:rPr>
-              <w:t>/</w:t>
+              <w:t>target/surefire-reports/</w:t>
             </w:r>
           </w:p>
         </w:tc>
@@ -3312,6 +3205,7 @@
       <w:tr>
         <w:trPr>
           <w:divId w:val="1354304626"/>
+          <w:trHeight w:val="649"/>
         </w:trPr>
         <w:tc>
           <w:tcPr>
@@ -3405,7 +3299,22 @@
           <w:rFonts w:ascii="Calibri" w:eastAsia="Times New Roman" w:hAnsi="Calibri" w:cs="Calibri"/>
           <w:color w:val="000000"/>
         </w:rPr>
-        <w:t>1.5 Code Repository &amp; Submission</w:t>
+        <w:lastRenderedPageBreak/>
+        <w:t>1.</w:t>
+      </w:r>
+      <w:r>
+        <w:rPr>
+          <w:rFonts w:ascii="Calibri" w:eastAsia="Times New Roman" w:hAnsi="Calibri" w:cs="Calibri"/>
+          <w:color w:val="000000"/>
+        </w:rPr>
+        <w:t>4</w:t>
+      </w:r>
+      <w:r>
+        <w:rPr>
+          <w:rFonts w:ascii="Calibri" w:eastAsia="Times New Roman" w:hAnsi="Calibri" w:cs="Calibri"/>
+          <w:color w:val="000000"/>
+        </w:rPr>
+        <w:t xml:space="preserve"> Code Repository &amp; Submission</w:t>
       </w:r>
     </w:p>
     <w:p>
@@ -3502,7 +3411,6 @@
           <w:color w:val="000000"/>
         </w:rPr>
       </w:pPr>
-      <w:proofErr w:type="gramStart"/>
       <w:r>
         <w:rPr>
           <w:rFonts w:ascii="Calibri" w:eastAsia="Times New Roman" w:hAnsi="Calibri" w:cs="Calibri"/>
@@ -3510,7 +3418,6 @@
         </w:rPr>
         <w:t>Test Planning</w:t>
       </w:r>
-      <w:proofErr w:type="gramEnd"/>
     </w:p>
     <w:p>
       <w:pPr>
@@ -3526,15 +3433,7 @@
           <w:rFonts w:ascii="Calibri" w:hAnsi="Calibri" w:cs="Calibri"/>
           <w:color w:val="000000"/>
         </w:rPr>
-        <w:t xml:space="preserve">The team selected GOG.com as the system under test because it is a publicly accessible, feature-rich e-commerce platform with documented automation challenges: an Angular SPA authentication layer, a React-based storefront, aggressive bot-detection headers, and a GDPR consent modal on first visit. The </w:t>
-      </w:r>
-      <w:r>
-        <w:rPr>
-          <w:rFonts w:ascii="Calibri" w:hAnsi="Calibri" w:cs="Calibri"/>
-          <w:color w:val="000000"/>
-        </w:rPr>
-        <w:lastRenderedPageBreak/>
-        <w:t xml:space="preserve">team identified 8 functional areas to test and mapped each to a test class. </w:t>
+        <w:t xml:space="preserve">The team selected GOG.com as the system under test because it is a publicly accessible, feature-rich e-commerce platform with documented automation challenges: an Angular SPA authentication layer, a React-based storefront, aggressive bot-detection headers, and a GDPR consent modal on first visit. The team identified 8 functional areas to test and mapped each to a test class. </w:t>
       </w:r>
     </w:p>
     <w:p>
@@ -3658,84 +3557,44 @@
         </w:rPr>
         <w:t xml:space="preserve"> </w:t>
       </w:r>
-      <w:proofErr w:type="spellStart"/>
       <w:r>
         <w:rPr>
           <w:rStyle w:val="code1"/>
           <w:rFonts w:eastAsia="Times New Roman" w:cs="Calibri"/>
           <w:color w:val="000000"/>
         </w:rPr>
-        <w:t>WebElement.getText</w:t>
-      </w:r>
-      <w:proofErr w:type="spellEnd"/>
+        <w:t>WebElement.getText()</w:t>
+      </w:r>
+      <w:r>
+        <w:rPr>
+          <w:rFonts w:ascii="Calibri" w:eastAsia="Times New Roman" w:hAnsi="Calibri" w:cs="Calibri"/>
+          <w:color w:val="000000"/>
+        </w:rPr>
+        <w:t xml:space="preserve"> returns empty strings for React-rendered elements in some page configurations. Solution: use </w:t>
+      </w:r>
       <w:r>
         <w:rPr>
           <w:rStyle w:val="code1"/>
           <w:rFonts w:eastAsia="Times New Roman" w:cs="Calibri"/>
           <w:color w:val="000000"/>
         </w:rPr>
-        <w:t>()</w:t>
-      </w:r>
-      <w:r>
-        <w:rPr>
-          <w:rFonts w:ascii="Calibri" w:eastAsia="Times New Roman" w:hAnsi="Calibri" w:cs="Calibri"/>
-          <w:color w:val="000000"/>
-        </w:rPr>
-        <w:t xml:space="preserve"> returns empty strings for React-rendered elements in some page configurations. Solution: use </w:t>
-      </w:r>
-      <w:proofErr w:type="spellStart"/>
+        <w:t>getAttribute("textContent")</w:t>
+      </w:r>
+      <w:r>
+        <w:rPr>
+          <w:rFonts w:ascii="Calibri" w:eastAsia="Times New Roman" w:hAnsi="Calibri" w:cs="Calibri"/>
+          <w:color w:val="000000"/>
+        </w:rPr>
+        <w:t xml:space="preserve"> and </w:t>
+      </w:r>
       <w:r>
         <w:rPr>
           <w:rStyle w:val="code1"/>
           <w:rFonts w:eastAsia="Times New Roman" w:cs="Calibri"/>
           <w:color w:val="000000"/>
         </w:rPr>
-        <w:t>getAttribute</w:t>
-      </w:r>
-      <w:proofErr w:type="spellEnd"/>
-      <w:r>
-        <w:rPr>
-          <w:rStyle w:val="code1"/>
-          <w:rFonts w:eastAsia="Times New Roman" w:cs="Calibri"/>
-          <w:color w:val="000000"/>
-        </w:rPr>
-        <w:t>("</w:t>
-      </w:r>
-      <w:proofErr w:type="spellStart"/>
-      <w:r>
-        <w:rPr>
-          <w:rStyle w:val="code1"/>
-          <w:rFonts w:eastAsia="Times New Roman" w:cs="Calibri"/>
-          <w:color w:val="000000"/>
-        </w:rPr>
-        <w:t>textContent</w:t>
-      </w:r>
-      <w:proofErr w:type="spellEnd"/>
-      <w:r>
-        <w:rPr>
-          <w:rStyle w:val="code1"/>
-          <w:rFonts w:eastAsia="Times New Roman" w:cs="Calibri"/>
-          <w:color w:val="000000"/>
-        </w:rPr>
-        <w:t>")</w:t>
-      </w:r>
-      <w:r>
-        <w:rPr>
-          <w:rFonts w:ascii="Calibri" w:eastAsia="Times New Roman" w:hAnsi="Calibri" w:cs="Calibri"/>
-          <w:color w:val="000000"/>
-        </w:rPr>
-        <w:t xml:space="preserve"> and </w:t>
-      </w:r>
-      <w:proofErr w:type="spellStart"/>
-      <w:r>
-        <w:rPr>
-          <w:rStyle w:val="code1"/>
-          <w:rFonts w:eastAsia="Times New Roman" w:cs="Calibri"/>
-          <w:color w:val="000000"/>
-        </w:rPr>
         <w:t>visibilityOfElementLocated</w:t>
       </w:r>
-      <w:proofErr w:type="spellEnd"/>
       <w:r>
         <w:rPr>
           <w:rFonts w:ascii="Calibri" w:eastAsia="Times New Roman" w:hAnsi="Calibri" w:cs="Calibri"/>
@@ -3800,15 +3659,7 @@
           <w:rFonts w:ascii="Calibri" w:eastAsia="Times New Roman" w:hAnsi="Calibri" w:cs="Calibri"/>
           <w:color w:val="000000"/>
         </w:rPr>
-        <w:t xml:space="preserve"> via a header link </w:t>
-      </w:r>
-      <w:proofErr w:type="gramStart"/>
-      <w:r>
-        <w:rPr>
-          <w:rFonts w:ascii="Calibri" w:eastAsia="Times New Roman" w:hAnsi="Calibri" w:cs="Calibri"/>
-          <w:color w:val="000000"/>
-        </w:rPr>
-        <w:t xml:space="preserve">in </w:t>
+        <w:t xml:space="preserve"> via a header link in </w:t>
       </w:r>
       <w:r>
         <w:rPr>
@@ -3816,16 +3667,7 @@
           <w:rFonts w:eastAsia="Times New Roman" w:cs="Calibri"/>
           <w:color w:val="000000"/>
         </w:rPr>
-        <w:t>@</w:t>
-      </w:r>
-      <w:proofErr w:type="gramEnd"/>
-      <w:r>
-        <w:rPr>
-          <w:rStyle w:val="code1"/>
-          <w:rFonts w:eastAsia="Times New Roman" w:cs="Calibri"/>
-          <w:color w:val="000000"/>
-        </w:rPr>
-        <w:t>BeforeMethod</w:t>
+        <w:t>@BeforeMethod</w:t>
       </w:r>
       <w:r>
         <w:rPr>
@@ -3863,23 +3705,13 @@
         </w:rPr>
         <w:t xml:space="preserve"> GOG's GDPR banner overlaps clickable elements. </w:t>
       </w:r>
-      <w:proofErr w:type="spellStart"/>
       <w:r>
         <w:rPr>
           <w:rStyle w:val="code1"/>
           <w:rFonts w:eastAsia="Times New Roman" w:cs="Calibri"/>
           <w:color w:val="000000"/>
         </w:rPr>
-        <w:t>TestUtils.dismissCookieConsent</w:t>
-      </w:r>
-      <w:proofErr w:type="spellEnd"/>
-      <w:r>
-        <w:rPr>
-          <w:rStyle w:val="code1"/>
-          <w:rFonts w:eastAsia="Times New Roman" w:cs="Calibri"/>
-          <w:color w:val="000000"/>
-        </w:rPr>
-        <w:t>()</w:t>
+        <w:t>TestUtils.dismissCookieConsent()</w:t>
       </w:r>
       <w:r>
         <w:rPr>
@@ -3917,7 +3749,6 @@
         </w:rPr>
         <w:t xml:space="preserve"> All source files were stripped of the UTF-8 BOM (0xEF 0xBB 0xBF) that the original editor introduced, which caused </w:t>
       </w:r>
-      <w:proofErr w:type="spellStart"/>
       <w:r>
         <w:rPr>
           <w:rStyle w:val="code1"/>
@@ -3926,7 +3757,6 @@
         </w:rPr>
         <w:t>javac</w:t>
       </w:r>
-      <w:proofErr w:type="spellEnd"/>
       <w:r>
         <w:rPr>
           <w:rFonts w:ascii="Calibri" w:eastAsia="Times New Roman" w:hAnsi="Calibri" w:cs="Calibri"/>
@@ -4030,79 +3860,38 @@
           <w:rFonts w:ascii="Calibri" w:hAnsi="Calibri" w:cs="Calibri"/>
           <w:color w:val="000000"/>
         </w:rPr>
+        <w:lastRenderedPageBreak/>
         <w:t xml:space="preserve">Tests are executed via </w:t>
       </w:r>
-      <w:proofErr w:type="spellStart"/>
       <w:r>
         <w:rPr>
           <w:rStyle w:val="code1"/>
           <w:rFonts w:cs="Calibri"/>
           <w:color w:val="000000"/>
         </w:rPr>
-        <w:t>mvn</w:t>
-      </w:r>
-      <w:proofErr w:type="spellEnd"/>
+        <w:t>mvn test</w:t>
+      </w:r>
+      <w:r>
+        <w:rPr>
+          <w:rFonts w:ascii="Calibri" w:hAnsi="Calibri" w:cs="Calibri"/>
+          <w:color w:val="000000"/>
+        </w:rPr>
+        <w:t xml:space="preserve">. Maven Surefire Plugin 3.2.5 generates per-class XML reports in </w:t>
+      </w:r>
       <w:r>
         <w:rPr>
           <w:rStyle w:val="code1"/>
           <w:rFonts w:cs="Calibri"/>
           <w:color w:val="000000"/>
         </w:rPr>
-        <w:t xml:space="preserve"> test</w:t>
+        <w:t>target/surefire-reports/</w:t>
       </w:r>
       <w:r>
         <w:rPr>
           <w:rFonts w:ascii="Calibri" w:hAnsi="Calibri" w:cs="Calibri"/>
           <w:color w:val="000000"/>
         </w:rPr>
-        <w:t xml:space="preserve">. Maven Surefire </w:t>
-      </w:r>
-      <w:proofErr w:type="spellStart"/>
-      <w:r>
-        <w:rPr>
-          <w:rFonts w:ascii="Calibri" w:hAnsi="Calibri" w:cs="Calibri"/>
-          <w:color w:val="000000"/>
-        </w:rPr>
-        <w:t>Plugin</w:t>
-      </w:r>
-      <w:proofErr w:type="spellEnd"/>
-      <w:r>
-        <w:rPr>
-          <w:rFonts w:ascii="Calibri" w:hAnsi="Calibri" w:cs="Calibri"/>
-          <w:color w:val="000000"/>
-        </w:rPr>
-        <w:t xml:space="preserve"> 3.2.5 generates per-class XML reports in </w:t>
-      </w:r>
-      <w:r>
-        <w:rPr>
-          <w:rStyle w:val="code1"/>
-          <w:rFonts w:cs="Calibri"/>
-          <w:color w:val="000000"/>
-        </w:rPr>
-        <w:t>target/surefire-reports/</w:t>
-      </w:r>
-      <w:r>
-        <w:rPr>
-          <w:rFonts w:ascii="Calibri" w:hAnsi="Calibri" w:cs="Calibri"/>
-          <w:color w:val="000000"/>
-        </w:rPr>
-        <w:t xml:space="preserve">. </w:t>
-      </w:r>
-      <w:proofErr w:type="gramStart"/>
-      <w:r>
-        <w:rPr>
-          <w:rFonts w:ascii="Calibri" w:hAnsi="Calibri" w:cs="Calibri"/>
-          <w:color w:val="000000"/>
-        </w:rPr>
-        <w:t>Final result</w:t>
-      </w:r>
-      <w:proofErr w:type="gramEnd"/>
-      <w:r>
-        <w:rPr>
-          <w:rFonts w:ascii="Calibri" w:hAnsi="Calibri" w:cs="Calibri"/>
-          <w:color w:val="000000"/>
-        </w:rPr>
-        <w:t xml:space="preserve">: </w:t>
+        <w:t xml:space="preserve">. Final result: </w:t>
       </w:r>
       <w:r>
         <w:rPr>
@@ -4134,13 +3923,12 @@
           <w:rFonts w:ascii="Calibri" w:eastAsia="Times New Roman" w:hAnsi="Calibri" w:cs="Calibri"/>
           <w:color w:val="000000"/>
         </w:rPr>
-        <w:lastRenderedPageBreak/>
         <w:t>2.2 Individual Contributions</w:t>
       </w:r>
     </w:p>
     <w:tbl>
       <w:tblPr>
-        <w:tblW w:w="5000" w:type="pct"/>
+        <w:tblW w:w="3756" w:type="pct"/>
         <w:tblCellMar>
           <w:top w:w="15" w:type="dxa"/>
           <w:left w:w="15" w:type="dxa"/>
@@ -4150,12 +3938,13 @@
         <w:tblLook w:val="04A0" w:firstRow="1" w:lastRow="0" w:firstColumn="1" w:lastColumn="0" w:noHBand="0" w:noVBand="1"/>
       </w:tblPr>
       <w:tblGrid>
-        <w:gridCol w:w="1284"/>
-        <w:gridCol w:w="8076"/>
+        <w:gridCol w:w="1242"/>
+        <w:gridCol w:w="6871"/>
       </w:tblGrid>
       <w:tr>
         <w:trPr>
           <w:divId w:val="1354304626"/>
+          <w:trHeight w:val="862"/>
         </w:trPr>
         <w:tc>
           <w:tcPr>
@@ -4237,6 +4026,7 @@
       <w:tr>
         <w:trPr>
           <w:divId w:val="1354304626"/>
+          <w:trHeight w:val="862"/>
         </w:trPr>
         <w:tc>
           <w:tcPr>
@@ -4311,87 +4101,7 @@
                 <w:sz w:val="22"/>
                 <w:szCs w:val="22"/>
               </w:rPr>
-              <w:t xml:space="preserve">Authored </w:t>
-            </w:r>
-            <w:proofErr w:type="spellStart"/>
-            <w:r>
-              <w:rPr>
-                <w:rFonts w:ascii="Calibri" w:eastAsia="Times New Roman" w:hAnsi="Calibri" w:cs="Calibri"/>
-                <w:color w:val="000000"/>
-                <w:sz w:val="22"/>
-                <w:szCs w:val="22"/>
-              </w:rPr>
-              <w:t>HomePageTest</w:t>
-            </w:r>
-            <w:proofErr w:type="spellEnd"/>
-            <w:r>
-              <w:rPr>
-                <w:rFonts w:ascii="Calibri" w:eastAsia="Times New Roman" w:hAnsi="Calibri" w:cs="Calibri"/>
-                <w:color w:val="000000"/>
-                <w:sz w:val="22"/>
-                <w:szCs w:val="22"/>
-              </w:rPr>
-              <w:t xml:space="preserve"> and </w:t>
-            </w:r>
-            <w:proofErr w:type="spellStart"/>
-            <w:r>
-              <w:rPr>
-                <w:rFonts w:ascii="Calibri" w:eastAsia="Times New Roman" w:hAnsi="Calibri" w:cs="Calibri"/>
-                <w:color w:val="000000"/>
-                <w:sz w:val="22"/>
-                <w:szCs w:val="22"/>
-              </w:rPr>
-              <w:t>NavigationTest</w:t>
-            </w:r>
-            <w:proofErr w:type="spellEnd"/>
-            <w:r>
-              <w:rPr>
-                <w:rFonts w:ascii="Calibri" w:eastAsia="Times New Roman" w:hAnsi="Calibri" w:cs="Calibri"/>
-                <w:color w:val="000000"/>
-                <w:sz w:val="22"/>
-                <w:szCs w:val="22"/>
-              </w:rPr>
-              <w:t xml:space="preserve">; configured testng.xml integration suite; contributed to </w:t>
-            </w:r>
-            <w:proofErr w:type="spellStart"/>
-            <w:r>
-              <w:rPr>
-                <w:rFonts w:ascii="Calibri" w:eastAsia="Times New Roman" w:hAnsi="Calibri" w:cs="Calibri"/>
-                <w:color w:val="000000"/>
-                <w:sz w:val="22"/>
-                <w:szCs w:val="22"/>
-              </w:rPr>
-              <w:t>BaseTest</w:t>
-            </w:r>
-            <w:proofErr w:type="spellEnd"/>
-            <w:r>
-              <w:rPr>
-                <w:rFonts w:ascii="Calibri" w:eastAsia="Times New Roman" w:hAnsi="Calibri" w:cs="Calibri"/>
-                <w:color w:val="000000"/>
-                <w:sz w:val="22"/>
-                <w:szCs w:val="22"/>
-              </w:rPr>
-              <w:t xml:space="preserve"> and </w:t>
-            </w:r>
-            <w:proofErr w:type="spellStart"/>
-            <w:r>
-              <w:rPr>
-                <w:rFonts w:ascii="Calibri" w:eastAsia="Times New Roman" w:hAnsi="Calibri" w:cs="Calibri"/>
-                <w:color w:val="000000"/>
-                <w:sz w:val="22"/>
-                <w:szCs w:val="22"/>
-              </w:rPr>
-              <w:t>TestUtils</w:t>
-            </w:r>
-            <w:proofErr w:type="spellEnd"/>
-            <w:r>
-              <w:rPr>
-                <w:rFonts w:ascii="Calibri" w:eastAsia="Times New Roman" w:hAnsi="Calibri" w:cs="Calibri"/>
-                <w:color w:val="000000"/>
-                <w:sz w:val="22"/>
-                <w:szCs w:val="22"/>
-              </w:rPr>
-              <w:t xml:space="preserve"> shared infrastructure; report writing. </w:t>
+              <w:t xml:space="preserve">Authored HomePageTest and NavigationTest; configured testng.xml integration suite; contributed to BaseTest and TestUtils shared infrastructure; report writing. </w:t>
             </w:r>
           </w:p>
         </w:tc>
@@ -4399,6 +4109,7 @@
       <w:tr>
         <w:trPr>
           <w:divId w:val="1354304626"/>
+          <w:trHeight w:val="1113"/>
         </w:trPr>
         <w:tc>
           <w:tcPr>
@@ -4473,67 +4184,7 @@
                 <w:sz w:val="22"/>
                 <w:szCs w:val="22"/>
               </w:rPr>
-              <w:t xml:space="preserve">Authored </w:t>
-            </w:r>
-            <w:proofErr w:type="spellStart"/>
-            <w:r>
-              <w:rPr>
-                <w:rFonts w:ascii="Calibri" w:eastAsia="Times New Roman" w:hAnsi="Calibri" w:cs="Calibri"/>
-                <w:color w:val="000000"/>
-                <w:sz w:val="22"/>
-                <w:szCs w:val="22"/>
-              </w:rPr>
-              <w:t>LoginPageTest</w:t>
-            </w:r>
-            <w:proofErr w:type="spellEnd"/>
-            <w:r>
-              <w:rPr>
-                <w:rFonts w:ascii="Calibri" w:eastAsia="Times New Roman" w:hAnsi="Calibri" w:cs="Calibri"/>
-                <w:color w:val="000000"/>
-                <w:sz w:val="22"/>
-                <w:szCs w:val="22"/>
-              </w:rPr>
-              <w:t xml:space="preserve"> and </w:t>
-            </w:r>
-            <w:proofErr w:type="spellStart"/>
-            <w:r>
-              <w:rPr>
-                <w:rFonts w:ascii="Calibri" w:eastAsia="Times New Roman" w:hAnsi="Calibri" w:cs="Calibri"/>
-                <w:color w:val="000000"/>
-                <w:sz w:val="22"/>
-                <w:szCs w:val="22"/>
-              </w:rPr>
-              <w:t>SignupPageTest</w:t>
-            </w:r>
-            <w:proofErr w:type="spellEnd"/>
-            <w:r>
-              <w:rPr>
-                <w:rFonts w:ascii="Calibri" w:eastAsia="Times New Roman" w:hAnsi="Calibri" w:cs="Calibri"/>
-                <w:color w:val="000000"/>
-                <w:sz w:val="22"/>
-                <w:szCs w:val="22"/>
-              </w:rPr>
-              <w:t xml:space="preserve"> (including Angular SPA workarounds); authored </w:t>
-            </w:r>
-            <w:proofErr w:type="spellStart"/>
-            <w:r>
-              <w:rPr>
-                <w:rFonts w:ascii="Calibri" w:eastAsia="Times New Roman" w:hAnsi="Calibri" w:cs="Calibri"/>
-                <w:color w:val="000000"/>
-                <w:sz w:val="22"/>
-                <w:szCs w:val="22"/>
-              </w:rPr>
-              <w:t>CartPageTest</w:t>
-            </w:r>
-            <w:proofErr w:type="spellEnd"/>
-            <w:r>
-              <w:rPr>
-                <w:rFonts w:ascii="Calibri" w:eastAsia="Times New Roman" w:hAnsi="Calibri" w:cs="Calibri"/>
-                <w:color w:val="000000"/>
-                <w:sz w:val="22"/>
-                <w:szCs w:val="22"/>
-              </w:rPr>
-              <w:t xml:space="preserve"> (dynamic cart navigation fix); resolved UTF-8 BOM compilation errors; GitHub repository setup and maintenance; debugging and final test fixes. </w:t>
+              <w:t xml:space="preserve">Authored LoginPageTest and SignupPageTest (including Angular SPA workarounds); authored CartPageTest (dynamic cart navigation fix); resolved UTF-8 BOM compilation errors; GitHub repository setup and maintenance; debugging and final test fixes. </w:t>
             </w:r>
           </w:p>
         </w:tc>
@@ -4541,6 +4192,7 @@
       <w:tr>
         <w:trPr>
           <w:divId w:val="1354304626"/>
+          <w:trHeight w:val="1113"/>
         </w:trPr>
         <w:tc>
           <w:tcPr>
@@ -4615,103 +4267,15 @@
                 <w:sz w:val="22"/>
                 <w:szCs w:val="22"/>
               </w:rPr>
-              <w:t xml:space="preserve">Authored </w:t>
-            </w:r>
-            <w:proofErr w:type="spellStart"/>
-            <w:r>
-              <w:rPr>
-                <w:rFonts w:ascii="Calibri" w:eastAsia="Times New Roman" w:hAnsi="Calibri" w:cs="Calibri"/>
-                <w:color w:val="000000"/>
-                <w:sz w:val="22"/>
-                <w:szCs w:val="22"/>
-              </w:rPr>
-              <w:t>SearchTest</w:t>
-            </w:r>
-            <w:proofErr w:type="spellEnd"/>
-            <w:r>
-              <w:rPr>
-                <w:rFonts w:ascii="Calibri" w:eastAsia="Times New Roman" w:hAnsi="Calibri" w:cs="Calibri"/>
-                <w:color w:val="000000"/>
-                <w:sz w:val="22"/>
-                <w:szCs w:val="22"/>
-              </w:rPr>
-              <w:t xml:space="preserve">, </w:t>
-            </w:r>
-            <w:proofErr w:type="spellStart"/>
-            <w:r>
-              <w:rPr>
-                <w:rFonts w:ascii="Calibri" w:eastAsia="Times New Roman" w:hAnsi="Calibri" w:cs="Calibri"/>
-                <w:color w:val="000000"/>
-                <w:sz w:val="22"/>
-                <w:szCs w:val="22"/>
-              </w:rPr>
-              <w:t>GamePageTest</w:t>
-            </w:r>
-            <w:proofErr w:type="spellEnd"/>
-            <w:r>
-              <w:rPr>
-                <w:rFonts w:ascii="Calibri" w:eastAsia="Times New Roman" w:hAnsi="Calibri" w:cs="Calibri"/>
-                <w:color w:val="000000"/>
-                <w:sz w:val="22"/>
-                <w:szCs w:val="22"/>
-              </w:rPr>
-              <w:t xml:space="preserve">, and </w:t>
-            </w:r>
-            <w:proofErr w:type="spellStart"/>
-            <w:r>
-              <w:rPr>
-                <w:rFonts w:ascii="Calibri" w:eastAsia="Times New Roman" w:hAnsi="Calibri" w:cs="Calibri"/>
-                <w:color w:val="000000"/>
-                <w:sz w:val="22"/>
-                <w:szCs w:val="22"/>
-              </w:rPr>
-              <w:t>GenreBrowseTest</w:t>
-            </w:r>
-            <w:proofErr w:type="spellEnd"/>
-            <w:r>
-              <w:rPr>
-                <w:rFonts w:ascii="Calibri" w:eastAsia="Times New Roman" w:hAnsi="Calibri" w:cs="Calibri"/>
-                <w:color w:val="000000"/>
-                <w:sz w:val="22"/>
-                <w:szCs w:val="22"/>
-              </w:rPr>
-              <w:t xml:space="preserve">; implemented React text content workaround using </w:t>
-            </w:r>
-            <w:proofErr w:type="spellStart"/>
+              <w:t xml:space="preserve">Authored SearchTest, GamePageTest, and GenreBrowseTest; implemented React text content workaround using </w:t>
+            </w:r>
             <w:r>
               <w:rPr>
                 <w:rStyle w:val="code1"/>
                 <w:rFonts w:eastAsia="Times New Roman" w:cs="Calibri"/>
                 <w:color w:val="000000"/>
               </w:rPr>
-              <w:t>getAttribute</w:t>
-            </w:r>
-            <w:proofErr w:type="spellEnd"/>
-            <w:r>
-              <w:rPr>
-                <w:rStyle w:val="code1"/>
-                <w:rFonts w:eastAsia="Times New Roman" w:cs="Calibri"/>
-                <w:color w:val="000000"/>
-              </w:rPr>
-              <w:t>("</w:t>
-            </w:r>
-            <w:proofErr w:type="spellStart"/>
-            <w:r>
-              <w:rPr>
-                <w:rStyle w:val="code1"/>
-                <w:rFonts w:eastAsia="Times New Roman" w:cs="Calibri"/>
-                <w:color w:val="000000"/>
-              </w:rPr>
-              <w:t>textContent</w:t>
-            </w:r>
-            <w:proofErr w:type="spellEnd"/>
-            <w:r>
-              <w:rPr>
-                <w:rStyle w:val="code1"/>
-                <w:rFonts w:eastAsia="Times New Roman" w:cs="Calibri"/>
-                <w:color w:val="000000"/>
-              </w:rPr>
-              <w:t>")</w:t>
+              <w:t>getAttribute("textContent")</w:t>
             </w:r>
             <w:r>
               <w:rPr>
@@ -4745,7 +4309,7 @@
     </w:p>
     <w:tbl>
       <w:tblPr>
-        <w:tblW w:w="5000" w:type="pct"/>
+        <w:tblW w:w="3854" w:type="pct"/>
         <w:tblCellMar>
           <w:top w:w="15" w:type="dxa"/>
           <w:left w:w="15" w:type="dxa"/>
@@ -4755,13 +4319,14 @@
         <w:tblLook w:val="04A0" w:firstRow="1" w:lastRow="0" w:firstColumn="1" w:lastColumn="0" w:noHBand="0" w:noVBand="1"/>
       </w:tblPr>
       <w:tblGrid>
-        <w:gridCol w:w="2893"/>
+        <w:gridCol w:w="2681"/>
         <w:gridCol w:w="1602"/>
-        <w:gridCol w:w="4865"/>
+        <w:gridCol w:w="4042"/>
       </w:tblGrid>
       <w:tr>
         <w:trPr>
           <w:divId w:val="1354304626"/>
+          <w:trHeight w:val="642"/>
         </w:trPr>
         <w:tc>
           <w:tcPr>
@@ -4881,6 +4446,7 @@
       <w:tr>
         <w:trPr>
           <w:divId w:val="1354304626"/>
+          <w:trHeight w:val="613"/>
         </w:trPr>
         <w:tc>
           <w:tcPr>
@@ -5000,6 +4566,7 @@
       <w:tr>
         <w:trPr>
           <w:divId w:val="1354304626"/>
+          <w:trHeight w:val="628"/>
         </w:trPr>
         <w:tc>
           <w:tcPr>
@@ -5119,6 +4686,7 @@
       <w:tr>
         <w:trPr>
           <w:divId w:val="1354304626"/>
+          <w:trHeight w:val="628"/>
         </w:trPr>
         <w:tc>
           <w:tcPr>
@@ -5238,6 +4806,7 @@
       <w:tr>
         <w:trPr>
           <w:divId w:val="1354304626"/>
+          <w:trHeight w:val="886"/>
         </w:trPr>
         <w:tc>
           <w:tcPr>
@@ -5357,6 +4926,7 @@
       <w:tr>
         <w:trPr>
           <w:divId w:val="1354304626"/>
+          <w:trHeight w:val="886"/>
         </w:trPr>
         <w:tc>
           <w:tcPr>
@@ -5385,7 +4955,6 @@
                 <w:szCs w:val="22"/>
               </w:rPr>
             </w:pPr>
-            <w:proofErr w:type="spellStart"/>
             <w:r>
               <w:rPr>
                 <w:rFonts w:ascii="Calibri" w:eastAsia="Times New Roman" w:hAnsi="Calibri" w:cs="Calibri"/>
@@ -5394,37 +4963,7 @@
                 <w:szCs w:val="22"/>
               </w:rPr>
               <w:lastRenderedPageBreak/>
-              <w:t>WebDriverManager</w:t>
-            </w:r>
-            <w:proofErr w:type="spellEnd"/>
-            <w:r>
-              <w:rPr>
-                <w:rFonts w:ascii="Calibri" w:eastAsia="Times New Roman" w:hAnsi="Calibri" w:cs="Calibri"/>
-                <w:color w:val="000000"/>
-                <w:sz w:val="22"/>
-                <w:szCs w:val="22"/>
-              </w:rPr>
-              <w:t xml:space="preserve"> (</w:t>
-            </w:r>
-            <w:proofErr w:type="spellStart"/>
-            <w:r>
-              <w:rPr>
-                <w:rFonts w:ascii="Calibri" w:eastAsia="Times New Roman" w:hAnsi="Calibri" w:cs="Calibri"/>
-                <w:color w:val="000000"/>
-                <w:sz w:val="22"/>
-                <w:szCs w:val="22"/>
-              </w:rPr>
-              <w:t>bonigarcia</w:t>
-            </w:r>
-            <w:proofErr w:type="spellEnd"/>
-            <w:r>
-              <w:rPr>
-                <w:rFonts w:ascii="Calibri" w:eastAsia="Times New Roman" w:hAnsi="Calibri" w:cs="Calibri"/>
-                <w:color w:val="000000"/>
-                <w:sz w:val="22"/>
-                <w:szCs w:val="22"/>
-              </w:rPr>
-              <w:t>)</w:t>
+              <w:t>WebDriverManager (bonigarcia)</w:t>
             </w:r>
           </w:p>
         </w:tc>
@@ -5500,27 +5039,7 @@
                 <w:sz w:val="22"/>
                 <w:szCs w:val="22"/>
               </w:rPr>
-              <w:t xml:space="preserve">Automatically downloads the correct </w:t>
-            </w:r>
-            <w:proofErr w:type="spellStart"/>
-            <w:r>
-              <w:rPr>
-                <w:rFonts w:ascii="Calibri" w:eastAsia="Times New Roman" w:hAnsi="Calibri" w:cs="Calibri"/>
-                <w:color w:val="000000"/>
-                <w:sz w:val="22"/>
-                <w:szCs w:val="22"/>
-              </w:rPr>
-              <w:t>ChromeDriver</w:t>
-            </w:r>
-            <w:proofErr w:type="spellEnd"/>
-            <w:r>
-              <w:rPr>
-                <w:rFonts w:ascii="Calibri" w:eastAsia="Times New Roman" w:hAnsi="Calibri" w:cs="Calibri"/>
-                <w:color w:val="000000"/>
-                <w:sz w:val="22"/>
-                <w:szCs w:val="22"/>
-              </w:rPr>
-              <w:t xml:space="preserve"> binary</w:t>
+              <w:t>Automatically downloads the correct ChromeDriver binary</w:t>
             </w:r>
           </w:p>
         </w:tc>
@@ -5528,6 +5047,7 @@
       <w:tr>
         <w:trPr>
           <w:divId w:val="1354304626"/>
+          <w:trHeight w:val="628"/>
         </w:trPr>
         <w:tc>
           <w:tcPr>
@@ -5647,6 +5167,7 @@
       <w:tr>
         <w:trPr>
           <w:divId w:val="1354304626"/>
+          <w:trHeight w:val="628"/>
         </w:trPr>
         <w:tc>
           <w:tcPr>
@@ -5675,7 +5196,6 @@
                 <w:szCs w:val="22"/>
               </w:rPr>
             </w:pPr>
-            <w:proofErr w:type="spellStart"/>
             <w:r>
               <w:rPr>
                 <w:rFonts w:ascii="Calibri" w:eastAsia="Times New Roman" w:hAnsi="Calibri" w:cs="Calibri"/>
@@ -5685,7 +5205,6 @@
               </w:rPr>
               <w:t>ChromeDriver</w:t>
             </w:r>
-            <w:proofErr w:type="spellEnd"/>
           </w:p>
         </w:tc>
         <w:tc>
@@ -5768,6 +5287,7 @@
       <w:tr>
         <w:trPr>
           <w:divId w:val="1354304626"/>
+          <w:trHeight w:val="628"/>
         </w:trPr>
         <w:tc>
           <w:tcPr>
@@ -5887,6 +5407,7 @@
       <w:tr>
         <w:trPr>
           <w:divId w:val="1354304626"/>
+          <w:trHeight w:val="613"/>
         </w:trPr>
         <w:tc>
           <w:tcPr>
@@ -6006,6 +5527,7 @@
       <w:tr>
         <w:trPr>
           <w:divId w:val="1354304626"/>
+          <w:trHeight w:val="628"/>
         </w:trPr>
         <w:tc>
           <w:tcPr>
@@ -6208,23 +5730,7 @@
           <w:rFonts w:ascii="Calibri" w:eastAsia="Times New Roman" w:hAnsi="Calibri" w:cs="Calibri"/>
           <w:color w:val="000000"/>
         </w:rPr>
-        <w:t xml:space="preserve"> </w:t>
-      </w:r>
-      <w:proofErr w:type="spellStart"/>
-      <w:r>
-        <w:rPr>
-          <w:rFonts w:ascii="Calibri" w:eastAsia="Times New Roman" w:hAnsi="Calibri" w:cs="Calibri"/>
-          <w:color w:val="000000"/>
-        </w:rPr>
-        <w:t>LoginPageTest</w:t>
-      </w:r>
-      <w:proofErr w:type="spellEnd"/>
-      <w:r>
-        <w:rPr>
-          <w:rFonts w:ascii="Calibri" w:eastAsia="Times New Roman" w:hAnsi="Calibri" w:cs="Calibri"/>
-          <w:color w:val="000000"/>
-        </w:rPr>
-        <w:t xml:space="preserve"> verifies the sign-in trigger, forgot password link, and create account link are accessible. If a frontend deployment broke any of these, the test would immediately flag it.</w:t>
+        <w:t xml:space="preserve"> LoginPageTest verifies the sign-in trigger, forgot password link, and create account link are accessible. If a frontend deployment broke any of these, the test would immediately flag it.</w:t>
       </w:r>
     </w:p>
     <w:p>
@@ -6246,48 +5752,14 @@
           <w:rFonts w:ascii="Calibri" w:eastAsia="Times New Roman" w:hAnsi="Calibri" w:cs="Calibri"/>
           <w:color w:val="000000"/>
         </w:rPr>
-        <w:t xml:space="preserve">Search </w:t>
-      </w:r>
-      <w:proofErr w:type="gramStart"/>
-      <w:r>
-        <w:rPr>
-          <w:rStyle w:val="Strong"/>
-          <w:rFonts w:ascii="Calibri" w:eastAsia="Times New Roman" w:hAnsi="Calibri" w:cs="Calibri"/>
-          <w:color w:val="000000"/>
-        </w:rPr>
-        <w:t>regressions</w:t>
-      </w:r>
-      <w:proofErr w:type="gramEnd"/>
-      <w:r>
-        <w:rPr>
-          <w:rStyle w:val="Strong"/>
-          <w:rFonts w:ascii="Calibri" w:eastAsia="Times New Roman" w:hAnsi="Calibri" w:cs="Calibri"/>
-          <w:color w:val="000000"/>
-        </w:rPr>
-        <w:t>:</w:t>
-      </w:r>
-      <w:r>
-        <w:rPr>
-          <w:rFonts w:ascii="Calibri" w:eastAsia="Times New Roman" w:hAnsi="Calibri" w:cs="Calibri"/>
-          <w:color w:val="000000"/>
-        </w:rPr>
-        <w:t xml:space="preserve"> </w:t>
-      </w:r>
-      <w:proofErr w:type="spellStart"/>
-      <w:r>
-        <w:rPr>
-          <w:rFonts w:ascii="Calibri" w:eastAsia="Times New Roman" w:hAnsi="Calibri" w:cs="Calibri"/>
-          <w:color w:val="000000"/>
-        </w:rPr>
-        <w:t>SearchTest</w:t>
-      </w:r>
-      <w:proofErr w:type="spellEnd"/>
-      <w:r>
-        <w:rPr>
-          <w:rFonts w:ascii="Calibri" w:eastAsia="Times New Roman" w:hAnsi="Calibri" w:cs="Calibri"/>
-          <w:color w:val="000000"/>
-        </w:rPr>
-        <w:t xml:space="preserve"> confirms that search returns game tiles with titles and cover images. A broken search would be caught before users encounter empty results.</w:t>
+        <w:t>Search regressions:</w:t>
+      </w:r>
+      <w:r>
+        <w:rPr>
+          <w:rFonts w:ascii="Calibri" w:eastAsia="Times New Roman" w:hAnsi="Calibri" w:cs="Calibri"/>
+          <w:color w:val="000000"/>
+        </w:rPr>
+        <w:t xml:space="preserve"> SearchTest confirms that search returns game tiles with titles and cover images. A broken search would be caught before users encounter empty results.</w:t>
       </w:r>
     </w:p>
     <w:p>
@@ -6316,23 +5788,7 @@
           <w:rFonts w:ascii="Calibri" w:eastAsia="Times New Roman" w:hAnsi="Calibri" w:cs="Calibri"/>
           <w:color w:val="000000"/>
         </w:rPr>
-        <w:t xml:space="preserve"> </w:t>
-      </w:r>
-      <w:proofErr w:type="spellStart"/>
-      <w:r>
-        <w:rPr>
-          <w:rFonts w:ascii="Calibri" w:eastAsia="Times New Roman" w:hAnsi="Calibri" w:cs="Calibri"/>
-          <w:color w:val="000000"/>
-        </w:rPr>
-        <w:t>CartPageTest</w:t>
-      </w:r>
-      <w:proofErr w:type="spellEnd"/>
-      <w:r>
-        <w:rPr>
-          <w:rFonts w:ascii="Calibri" w:eastAsia="Times New Roman" w:hAnsi="Calibri" w:cs="Calibri"/>
-          <w:color w:val="000000"/>
-        </w:rPr>
-        <w:t xml:space="preserve"> verifies the cart page loads with proper navigation and HTTPS. Any misconfiguration of the cart subdomain would be detected.</w:t>
+        <w:t xml:space="preserve"> CartPageTest verifies the cart page loads with proper navigation and HTTPS. Any misconfiguration of the cart subdomain would be detected.</w:t>
       </w:r>
     </w:p>
     <w:p>
@@ -6354,7 +5810,6 @@
           <w:rFonts w:ascii="Calibri" w:eastAsia="Times New Roman" w:hAnsi="Calibri" w:cs="Calibri"/>
           <w:color w:val="000000"/>
         </w:rPr>
-        <w:lastRenderedPageBreak/>
         <w:t>Game page content missing:</w:t>
       </w:r>
       <w:r>
@@ -6362,23 +5817,7 @@
           <w:rFonts w:ascii="Calibri" w:eastAsia="Times New Roman" w:hAnsi="Calibri" w:cs="Calibri"/>
           <w:color w:val="000000"/>
         </w:rPr>
-        <w:t xml:space="preserve"> </w:t>
-      </w:r>
-      <w:proofErr w:type="spellStart"/>
-      <w:r>
-        <w:rPr>
-          <w:rFonts w:ascii="Calibri" w:eastAsia="Times New Roman" w:hAnsi="Calibri" w:cs="Calibri"/>
-          <w:color w:val="000000"/>
-        </w:rPr>
-        <w:t>GamePageTest</w:t>
-      </w:r>
-      <w:proofErr w:type="spellEnd"/>
-      <w:r>
-        <w:rPr>
-          <w:rFonts w:ascii="Calibri" w:eastAsia="Times New Roman" w:hAnsi="Calibri" w:cs="Calibri"/>
-          <w:color w:val="000000"/>
-        </w:rPr>
-        <w:t xml:space="preserve"> checks that the buy button, description, screenshots, and system requirements are all rendered. Missing sections would be caught automatically.</w:t>
+        <w:t xml:space="preserve"> GamePageTest checks that the buy button, description, screenshots, and system requirements are all rendered. Missing sections would be caught automatically.</w:t>
       </w:r>
     </w:p>
     <w:p>
@@ -6407,23 +5846,7 @@
           <w:rFonts w:ascii="Calibri" w:eastAsia="Times New Roman" w:hAnsi="Calibri" w:cs="Calibri"/>
           <w:color w:val="000000"/>
         </w:rPr>
-        <w:t xml:space="preserve"> </w:t>
-      </w:r>
-      <w:proofErr w:type="spellStart"/>
-      <w:r>
-        <w:rPr>
-          <w:rFonts w:ascii="Calibri" w:eastAsia="Times New Roman" w:hAnsi="Calibri" w:cs="Calibri"/>
-          <w:color w:val="000000"/>
-        </w:rPr>
-        <w:t>NavigationTest</w:t>
-      </w:r>
-      <w:proofErr w:type="spellEnd"/>
-      <w:r>
-        <w:rPr>
-          <w:rFonts w:ascii="Calibri" w:eastAsia="Times New Roman" w:hAnsi="Calibri" w:cs="Calibri"/>
-          <w:color w:val="000000"/>
-        </w:rPr>
-        <w:t xml:space="preserve"> verifies the GOG logo link, store navigation, and header persistence across pages.</w:t>
+        <w:t xml:space="preserve"> NavigationTest verifies the GOG logo link, store navigation, and header persistence across pages.</w:t>
       </w:r>
     </w:p>
     <w:p>
@@ -6450,46 +5873,20 @@
         </w:rPr>
         <w:t xml:space="preserve"> The tests serve as a regression safety net. After any GOG frontend update, running </w:t>
       </w:r>
-      <w:proofErr w:type="spellStart"/>
       <w:r>
         <w:rPr>
           <w:rStyle w:val="code1"/>
           <w:rFonts w:cs="Calibri"/>
           <w:color w:val="000000"/>
         </w:rPr>
-        <w:t>mvn</w:t>
-      </w:r>
-      <w:proofErr w:type="spellEnd"/>
-      <w:r>
-        <w:rPr>
-          <w:rStyle w:val="code1"/>
-          <w:rFonts w:cs="Calibri"/>
-          <w:color w:val="000000"/>
-        </w:rPr>
-        <w:t xml:space="preserve"> test</w:t>
+        <w:t>mvn test</w:t>
       </w:r>
       <w:r>
         <w:rPr>
           <w:rFonts w:ascii="Calibri" w:hAnsi="Calibri" w:cs="Calibri"/>
           <w:color w:val="000000"/>
         </w:rPr>
-        <w:t xml:space="preserve"> produces a pass/fail report for all 51 test cases within 20 </w:t>
-      </w:r>
-      <w:proofErr w:type="gramStart"/>
-      <w:r>
-        <w:rPr>
-          <w:rFonts w:ascii="Calibri" w:hAnsi="Calibri" w:cs="Calibri"/>
-          <w:color w:val="000000"/>
-        </w:rPr>
-        <w:t>minutes — far</w:t>
-      </w:r>
-      <w:proofErr w:type="gramEnd"/>
-      <w:r>
-        <w:rPr>
-          <w:rFonts w:ascii="Calibri" w:hAnsi="Calibri" w:cs="Calibri"/>
-          <w:color w:val="000000"/>
-        </w:rPr>
-        <w:t xml:space="preserve"> faster than manual verification. The suite also documents the </w:t>
+        <w:t xml:space="preserve"> produces a pass/fail report for all 51 test cases within 20 minutes — far faster than manual verification. The suite also documents the </w:t>
       </w:r>
       <w:r>
         <w:rPr>
@@ -6521,6 +5918,7 @@
           <w:rFonts w:ascii="Calibri" w:eastAsia="Times New Roman" w:hAnsi="Calibri" w:cs="Calibri"/>
           <w:color w:val="000000"/>
         </w:rPr>
+        <w:lastRenderedPageBreak/>
         <w:t>5. Appendix</w:t>
       </w:r>
     </w:p>
@@ -6550,21 +5948,12 @@
           <w:color w:val="000000"/>
         </w:rPr>
       </w:pPr>
-      <w:proofErr w:type="spellStart"/>
-      <w:r>
-        <w:rPr>
-          <w:rFonts w:ascii="Calibri" w:eastAsia="Times New Roman" w:hAnsi="Calibri" w:cs="Calibri"/>
-          <w:color w:val="000000"/>
-        </w:rPr>
-        <w:t>HomePageTest</w:t>
-      </w:r>
-      <w:proofErr w:type="spellEnd"/>
-      <w:r>
-        <w:rPr>
-          <w:rFonts w:ascii="Calibri" w:eastAsia="Times New Roman" w:hAnsi="Calibri" w:cs="Calibri"/>
-          <w:color w:val="000000"/>
-        </w:rPr>
-        <w:t xml:space="preserve"> (7 tests)</w:t>
+      <w:r>
+        <w:rPr>
+          <w:rFonts w:ascii="Calibri" w:eastAsia="Times New Roman" w:hAnsi="Calibri" w:cs="Calibri"/>
+          <w:color w:val="000000"/>
+        </w:rPr>
+        <w:t>HomePageTest (7 tests)</w:t>
       </w:r>
     </w:p>
     <w:p>
@@ -6723,21 +6112,12 @@
           <w:color w:val="000000"/>
         </w:rPr>
       </w:pPr>
-      <w:proofErr w:type="spellStart"/>
-      <w:r>
-        <w:rPr>
-          <w:rFonts w:ascii="Calibri" w:eastAsia="Times New Roman" w:hAnsi="Calibri" w:cs="Calibri"/>
-          <w:color w:val="000000"/>
-        </w:rPr>
-        <w:t>LoginPageTest</w:t>
-      </w:r>
-      <w:proofErr w:type="spellEnd"/>
-      <w:r>
-        <w:rPr>
-          <w:rFonts w:ascii="Calibri" w:eastAsia="Times New Roman" w:hAnsi="Calibri" w:cs="Calibri"/>
-          <w:color w:val="000000"/>
-        </w:rPr>
-        <w:t xml:space="preserve"> (7 tests)</w:t>
+      <w:r>
+        <w:rPr>
+          <w:rFonts w:ascii="Calibri" w:eastAsia="Times New Roman" w:hAnsi="Calibri" w:cs="Calibri"/>
+          <w:color w:val="000000"/>
+        </w:rPr>
+        <w:t>LoginPageTest (7 tests)</w:t>
       </w:r>
     </w:p>
     <w:p>
@@ -6863,7 +6243,6 @@
           <w:rFonts w:ascii="Calibri" w:eastAsia="Times New Roman" w:hAnsi="Calibri" w:cs="Calibri"/>
           <w:color w:val="000000"/>
         </w:rPr>
-        <w:lastRenderedPageBreak/>
         <w:t>Verify a Create Account / Sign Up link is present on the login page</w:t>
       </w:r>
     </w:p>
@@ -6897,21 +6276,12 @@
           <w:color w:val="000000"/>
         </w:rPr>
       </w:pPr>
-      <w:proofErr w:type="spellStart"/>
-      <w:r>
-        <w:rPr>
-          <w:rFonts w:ascii="Calibri" w:eastAsia="Times New Roman" w:hAnsi="Calibri" w:cs="Calibri"/>
-          <w:color w:val="000000"/>
-        </w:rPr>
-        <w:t>SignupPageTest</w:t>
-      </w:r>
-      <w:proofErr w:type="spellEnd"/>
-      <w:r>
-        <w:rPr>
-          <w:rFonts w:ascii="Calibri" w:eastAsia="Times New Roman" w:hAnsi="Calibri" w:cs="Calibri"/>
-          <w:color w:val="000000"/>
-        </w:rPr>
-        <w:t xml:space="preserve"> (7 tests)</w:t>
+      <w:r>
+        <w:rPr>
+          <w:rFonts w:ascii="Calibri" w:eastAsia="Times New Roman" w:hAnsi="Calibri" w:cs="Calibri"/>
+          <w:color w:val="000000"/>
+        </w:rPr>
+        <w:t>SignupPageTest (7 tests)</w:t>
       </w:r>
     </w:p>
     <w:p>
@@ -7011,21 +6381,12 @@
           <w:color w:val="000000"/>
         </w:rPr>
       </w:pPr>
-      <w:proofErr w:type="gramStart"/>
-      <w:r>
-        <w:rPr>
-          <w:rFonts w:ascii="Calibri" w:eastAsia="Times New Roman" w:hAnsi="Calibri" w:cs="Calibri"/>
-          <w:color w:val="000000"/>
-        </w:rPr>
-        <w:t>Verify</w:t>
-      </w:r>
-      <w:proofErr w:type="gramEnd"/>
-      <w:r>
-        <w:rPr>
-          <w:rFonts w:ascii="Calibri" w:eastAsia="Times New Roman" w:hAnsi="Calibri" w:cs="Calibri"/>
-          <w:color w:val="000000"/>
-        </w:rPr>
-        <w:t xml:space="preserve"> a Create Account button or link is visible</w:t>
+      <w:r>
+        <w:rPr>
+          <w:rFonts w:ascii="Calibri" w:eastAsia="Times New Roman" w:hAnsi="Calibri" w:cs="Calibri"/>
+          <w:color w:val="000000"/>
+        </w:rPr>
+        <w:t>Verify a Create Account button or link is visible</w:t>
       </w:r>
     </w:p>
     <w:p>
@@ -7079,21 +6440,12 @@
           <w:color w:val="000000"/>
         </w:rPr>
       </w:pPr>
-      <w:proofErr w:type="spellStart"/>
-      <w:r>
-        <w:rPr>
-          <w:rFonts w:ascii="Calibri" w:eastAsia="Times New Roman" w:hAnsi="Calibri" w:cs="Calibri"/>
-          <w:color w:val="000000"/>
-        </w:rPr>
-        <w:t>SearchTest</w:t>
-      </w:r>
-      <w:proofErr w:type="spellEnd"/>
-      <w:r>
-        <w:rPr>
-          <w:rFonts w:ascii="Calibri" w:eastAsia="Times New Roman" w:hAnsi="Calibri" w:cs="Calibri"/>
-          <w:color w:val="000000"/>
-        </w:rPr>
-        <w:t xml:space="preserve"> (6 tests)</w:t>
+      <w:r>
+        <w:rPr>
+          <w:rFonts w:ascii="Calibri" w:eastAsia="Times New Roman" w:hAnsi="Calibri" w:cs="Calibri"/>
+          <w:color w:val="000000"/>
+        </w:rPr>
+        <w:t>SearchTest (6 tests)</w:t>
       </w:r>
     </w:p>
     <w:p>
@@ -7109,21 +6461,12 @@
           <w:color w:val="000000"/>
         </w:rPr>
       </w:pPr>
-      <w:proofErr w:type="gramStart"/>
-      <w:r>
-        <w:rPr>
-          <w:rFonts w:ascii="Calibri" w:eastAsia="Times New Roman" w:hAnsi="Calibri" w:cs="Calibri"/>
-          <w:color w:val="000000"/>
-        </w:rPr>
-        <w:t>Verify</w:t>
-      </w:r>
-      <w:proofErr w:type="gramEnd"/>
-      <w:r>
-        <w:rPr>
-          <w:rFonts w:ascii="Calibri" w:eastAsia="Times New Roman" w:hAnsi="Calibri" w:cs="Calibri"/>
-          <w:color w:val="000000"/>
-        </w:rPr>
-        <w:t xml:space="preserve"> a search icon or input is present in the GOG header</w:t>
+      <w:r>
+        <w:rPr>
+          <w:rFonts w:ascii="Calibri" w:eastAsia="Times New Roman" w:hAnsi="Calibri" w:cs="Calibri"/>
+          <w:color w:val="000000"/>
+        </w:rPr>
+        <w:t>Verify a search icon or input is present in the GOG header</w:t>
       </w:r>
     </w:p>
     <w:p>
@@ -7165,23 +6508,7 @@
           <w:rFonts w:ascii="Calibri" w:eastAsia="Times New Roman" w:hAnsi="Calibri" w:cs="Calibri"/>
           <w:color w:val="000000"/>
         </w:rPr>
-        <w:t>Verify searching '</w:t>
-      </w:r>
-      <w:proofErr w:type="spellStart"/>
-      <w:r>
-        <w:rPr>
-          <w:rFonts w:ascii="Calibri" w:eastAsia="Times New Roman" w:hAnsi="Calibri" w:cs="Calibri"/>
-          <w:color w:val="000000"/>
-        </w:rPr>
-        <w:t>witcher</w:t>
-      </w:r>
-      <w:proofErr w:type="spellEnd"/>
-      <w:r>
-        <w:rPr>
-          <w:rFonts w:ascii="Calibri" w:eastAsia="Times New Roman" w:hAnsi="Calibri" w:cs="Calibri"/>
-          <w:color w:val="000000"/>
-        </w:rPr>
-        <w:t>' returns at least one game tile</w:t>
+        <w:t>Verify searching 'witcher' returns at least one game tile</w:t>
       </w:r>
     </w:p>
     <w:p>
@@ -7256,21 +6583,13 @@
           <w:color w:val="000000"/>
         </w:rPr>
       </w:pPr>
-      <w:proofErr w:type="spellStart"/>
-      <w:r>
-        <w:rPr>
-          <w:rFonts w:ascii="Calibri" w:eastAsia="Times New Roman" w:hAnsi="Calibri" w:cs="Calibri"/>
-          <w:color w:val="000000"/>
-        </w:rPr>
-        <w:t>NavigationTest</w:t>
-      </w:r>
-      <w:proofErr w:type="spellEnd"/>
-      <w:r>
-        <w:rPr>
-          <w:rFonts w:ascii="Calibri" w:eastAsia="Times New Roman" w:hAnsi="Calibri" w:cs="Calibri"/>
-          <w:color w:val="000000"/>
-        </w:rPr>
-        <w:t xml:space="preserve"> (6 tests)</w:t>
+      <w:r>
+        <w:rPr>
+          <w:rFonts w:ascii="Calibri" w:eastAsia="Times New Roman" w:hAnsi="Calibri" w:cs="Calibri"/>
+          <w:color w:val="000000"/>
+        </w:rPr>
+        <w:lastRenderedPageBreak/>
+        <w:t>NavigationTest (6 tests)</w:t>
       </w:r>
     </w:p>
     <w:p>
@@ -7396,23 +6715,7 @@
           <w:rFonts w:ascii="Calibri" w:eastAsia="Times New Roman" w:hAnsi="Calibri" w:cs="Calibri"/>
           <w:color w:val="000000"/>
         </w:rPr>
-        <w:t xml:space="preserve">Verify a </w:t>
-      </w:r>
-      <w:proofErr w:type="spellStart"/>
-      <w:r>
-        <w:rPr>
-          <w:rFonts w:ascii="Calibri" w:eastAsia="Times New Roman" w:hAnsi="Calibri" w:cs="Calibri"/>
-          <w:color w:val="000000"/>
-        </w:rPr>
-        <w:t>wishlist</w:t>
-      </w:r>
-      <w:proofErr w:type="spellEnd"/>
-      <w:r>
-        <w:rPr>
-          <w:rFonts w:ascii="Calibri" w:eastAsia="Times New Roman" w:hAnsi="Calibri" w:cs="Calibri"/>
-          <w:color w:val="000000"/>
-        </w:rPr>
-        <w:t xml:space="preserve"> or cart icon is accessible in the header</w:t>
+        <w:t>Verify a wishlist or cart icon is accessible in the header</w:t>
       </w:r>
     </w:p>
     <w:p>
@@ -7424,22 +6727,12 @@
           <w:color w:val="000000"/>
         </w:rPr>
       </w:pPr>
-      <w:proofErr w:type="spellStart"/>
-      <w:r>
-        <w:rPr>
-          <w:rFonts w:ascii="Calibri" w:eastAsia="Times New Roman" w:hAnsi="Calibri" w:cs="Calibri"/>
-          <w:color w:val="000000"/>
-        </w:rPr>
-        <w:lastRenderedPageBreak/>
-        <w:t>GamePageTest</w:t>
-      </w:r>
-      <w:proofErr w:type="spellEnd"/>
-      <w:r>
-        <w:rPr>
-          <w:rFonts w:ascii="Calibri" w:eastAsia="Times New Roman" w:hAnsi="Calibri" w:cs="Calibri"/>
-          <w:color w:val="000000"/>
-        </w:rPr>
-        <w:t xml:space="preserve"> (7 tests)</w:t>
+      <w:r>
+        <w:rPr>
+          <w:rFonts w:ascii="Calibri" w:eastAsia="Times New Roman" w:hAnsi="Calibri" w:cs="Calibri"/>
+          <w:color w:val="000000"/>
+        </w:rPr>
+        <w:t>GamePageTest (7 tests)</w:t>
       </w:r>
     </w:p>
     <w:p>
@@ -7598,21 +6891,12 @@
           <w:color w:val="000000"/>
         </w:rPr>
       </w:pPr>
-      <w:proofErr w:type="spellStart"/>
-      <w:r>
-        <w:rPr>
-          <w:rFonts w:ascii="Calibri" w:eastAsia="Times New Roman" w:hAnsi="Calibri" w:cs="Calibri"/>
-          <w:color w:val="000000"/>
-        </w:rPr>
-        <w:t>GenreBrowseTest</w:t>
-      </w:r>
-      <w:proofErr w:type="spellEnd"/>
-      <w:r>
-        <w:rPr>
-          <w:rFonts w:ascii="Calibri" w:eastAsia="Times New Roman" w:hAnsi="Calibri" w:cs="Calibri"/>
-          <w:color w:val="000000"/>
-        </w:rPr>
-        <w:t xml:space="preserve"> (6 tests)</w:t>
+      <w:r>
+        <w:rPr>
+          <w:rFonts w:ascii="Calibri" w:eastAsia="Times New Roman" w:hAnsi="Calibri" w:cs="Calibri"/>
+          <w:color w:val="000000"/>
+        </w:rPr>
+        <w:t>GenreBrowseTest (6 tests)</w:t>
       </w:r>
     </w:p>
     <w:p>
@@ -7649,37 +6933,12 @@
           <w:color w:val="000000"/>
         </w:rPr>
       </w:pPr>
-      <w:proofErr w:type="gramStart"/>
-      <w:r>
-        <w:rPr>
-          <w:rFonts w:ascii="Calibri" w:eastAsia="Times New Roman" w:hAnsi="Calibri" w:cs="Calibri"/>
-          <w:color w:val="000000"/>
-        </w:rPr>
-        <w:t>Verify</w:t>
-      </w:r>
-      <w:proofErr w:type="gramEnd"/>
-      <w:r>
-        <w:rPr>
-          <w:rFonts w:ascii="Calibri" w:eastAsia="Times New Roman" w:hAnsi="Calibri" w:cs="Calibri"/>
-          <w:color w:val="000000"/>
-        </w:rPr>
-        <w:t xml:space="preserve"> the RPG genre </w:t>
-      </w:r>
-      <w:proofErr w:type="gramStart"/>
-      <w:r>
-        <w:rPr>
-          <w:rFonts w:ascii="Calibri" w:eastAsia="Times New Roman" w:hAnsi="Calibri" w:cs="Calibri"/>
-          <w:color w:val="000000"/>
-        </w:rPr>
-        <w:t>browse</w:t>
-      </w:r>
-      <w:proofErr w:type="gramEnd"/>
-      <w:r>
-        <w:rPr>
-          <w:rFonts w:ascii="Calibri" w:eastAsia="Times New Roman" w:hAnsi="Calibri" w:cs="Calibri"/>
-          <w:color w:val="000000"/>
-        </w:rPr>
-        <w:t xml:space="preserve"> page loads and stays on gog.com</w:t>
+      <w:r>
+        <w:rPr>
+          <w:rFonts w:ascii="Calibri" w:eastAsia="Times New Roman" w:hAnsi="Calibri" w:cs="Calibri"/>
+          <w:color w:val="000000"/>
+        </w:rPr>
+        <w:t>Verify the RPG genre browse page loads and stays on gog.com</w:t>
       </w:r>
     </w:p>
     <w:p>
@@ -7775,21 +7034,12 @@
           <w:color w:val="000000"/>
         </w:rPr>
       </w:pPr>
-      <w:proofErr w:type="spellStart"/>
-      <w:r>
-        <w:rPr>
-          <w:rFonts w:ascii="Calibri" w:eastAsia="Times New Roman" w:hAnsi="Calibri" w:cs="Calibri"/>
-          <w:color w:val="000000"/>
-        </w:rPr>
-        <w:t>CartPageTest</w:t>
-      </w:r>
-      <w:proofErr w:type="spellEnd"/>
-      <w:r>
-        <w:rPr>
-          <w:rFonts w:ascii="Calibri" w:eastAsia="Times New Roman" w:hAnsi="Calibri" w:cs="Calibri"/>
-          <w:color w:val="000000"/>
-        </w:rPr>
-        <w:t xml:space="preserve"> (7 tests)</w:t>
+      <w:r>
+        <w:rPr>
+          <w:rFonts w:ascii="Calibri" w:eastAsia="Times New Roman" w:hAnsi="Calibri" w:cs="Calibri"/>
+          <w:color w:val="000000"/>
+        </w:rPr>
+        <w:t>CartPageTest (7 tests)</w:t>
       </w:r>
     </w:p>
     <w:p>
@@ -7810,23 +7060,7 @@
           <w:rFonts w:ascii="Calibri" w:eastAsia="Times New Roman" w:hAnsi="Calibri" w:cs="Calibri"/>
           <w:color w:val="000000"/>
         </w:rPr>
-        <w:t xml:space="preserve">Verify GOG cart/checkout page loads and URL </w:t>
-      </w:r>
-      <w:proofErr w:type="gramStart"/>
-      <w:r>
-        <w:rPr>
-          <w:rFonts w:ascii="Calibri" w:eastAsia="Times New Roman" w:hAnsi="Calibri" w:cs="Calibri"/>
-          <w:color w:val="000000"/>
-        </w:rPr>
-        <w:t>stays</w:t>
-      </w:r>
-      <w:proofErr w:type="gramEnd"/>
-      <w:r>
-        <w:rPr>
-          <w:rFonts w:ascii="Calibri" w:eastAsia="Times New Roman" w:hAnsi="Calibri" w:cs="Calibri"/>
-          <w:color w:val="000000"/>
-        </w:rPr>
-        <w:t xml:space="preserve"> on gog.com</w:t>
+        <w:t>Verify GOG cart/checkout page loads and URL stays on gog.com</w:t>
       </w:r>
     </w:p>
     <w:p>
@@ -7952,7 +7186,6 @@
           <w:rFonts w:ascii="Calibri" w:eastAsia="Times New Roman" w:hAnsi="Calibri" w:cs="Calibri"/>
           <w:color w:val="000000"/>
         </w:rPr>
-        <w:lastRenderedPageBreak/>
         <w:t>Verify the cart/checkout page is served over HTTPS</w:t>
       </w:r>
     </w:p>
@@ -7975,7 +7208,7 @@
     </w:p>
     <w:tbl>
       <w:tblPr>
-        <w:tblW w:w="5000" w:type="pct"/>
+        <w:tblW w:w="4049" w:type="pct"/>
         <w:tblCellMar>
           <w:top w:w="15" w:type="dxa"/>
           <w:left w:w="15" w:type="dxa"/>
@@ -7985,12 +7218,13 @@
         <w:tblLook w:val="04A0" w:firstRow="1" w:lastRow="0" w:firstColumn="1" w:lastColumn="0" w:noHBand="0" w:noVBand="1"/>
       </w:tblPr>
       <w:tblGrid>
-        <w:gridCol w:w="3408"/>
-        <w:gridCol w:w="5952"/>
+        <w:gridCol w:w="3232"/>
+        <w:gridCol w:w="5514"/>
       </w:tblGrid>
       <w:tr>
         <w:trPr>
           <w:divId w:val="1354304626"/>
+          <w:trHeight w:val="644"/>
         </w:trPr>
         <w:tc>
           <w:tcPr>
@@ -8026,6 +7260,7 @@
                 <w:sz w:val="22"/>
                 <w:szCs w:val="22"/>
               </w:rPr>
+              <w:lastRenderedPageBreak/>
               <w:t>Constraint</w:t>
             </w:r>
           </w:p>
@@ -8072,6 +7307,7 @@
       <w:tr>
         <w:trPr>
           <w:divId w:val="1354304626"/>
+          <w:trHeight w:val="873"/>
         </w:trPr>
         <w:tc>
           <w:tcPr>
@@ -8153,6 +7389,7 @@
       <w:tr>
         <w:trPr>
           <w:divId w:val="1354304626"/>
+          <w:trHeight w:val="888"/>
         </w:trPr>
         <w:tc>
           <w:tcPr>
@@ -8188,38 +7425,7 @@
                 <w:sz w:val="22"/>
                 <w:szCs w:val="22"/>
               </w:rPr>
-              <w:t xml:space="preserve">React-rendered text – </w:t>
-            </w:r>
-            <w:proofErr w:type="spellStart"/>
-            <w:proofErr w:type="gramStart"/>
-            <w:r>
-              <w:rPr>
-                <w:rFonts w:ascii="Calibri" w:eastAsia="Times New Roman" w:hAnsi="Calibri" w:cs="Calibri"/>
-                <w:color w:val="000000"/>
-                <w:sz w:val="22"/>
-                <w:szCs w:val="22"/>
-              </w:rPr>
-              <w:t>getText</w:t>
-            </w:r>
-            <w:proofErr w:type="spellEnd"/>
-            <w:r>
-              <w:rPr>
-                <w:rFonts w:ascii="Calibri" w:eastAsia="Times New Roman" w:hAnsi="Calibri" w:cs="Calibri"/>
-                <w:color w:val="000000"/>
-                <w:sz w:val="22"/>
-                <w:szCs w:val="22"/>
-              </w:rPr>
-              <w:t>(</w:t>
-            </w:r>
-            <w:proofErr w:type="gramEnd"/>
-            <w:r>
-              <w:rPr>
-                <w:rFonts w:ascii="Calibri" w:eastAsia="Times New Roman" w:hAnsi="Calibri" w:cs="Calibri"/>
-                <w:color w:val="000000"/>
-                <w:sz w:val="22"/>
-                <w:szCs w:val="22"/>
-              </w:rPr>
-              <w:t>) returns empty string</w:t>
+              <w:t>React-rendered text – getText() returns empty string</w:t>
             </w:r>
           </w:p>
         </w:tc>
@@ -8257,78 +7463,7 @@
                 <w:sz w:val="22"/>
                 <w:szCs w:val="22"/>
               </w:rPr>
-              <w:t xml:space="preserve">Used </w:t>
-            </w:r>
-            <w:proofErr w:type="spellStart"/>
-            <w:r>
-              <w:rPr>
-                <w:rFonts w:ascii="Calibri" w:eastAsia="Times New Roman" w:hAnsi="Calibri" w:cs="Calibri"/>
-                <w:color w:val="000000"/>
-                <w:sz w:val="22"/>
-                <w:szCs w:val="22"/>
-              </w:rPr>
-              <w:t>getAttribute</w:t>
-            </w:r>
-            <w:proofErr w:type="spellEnd"/>
-            <w:r>
-              <w:rPr>
-                <w:rFonts w:ascii="Calibri" w:eastAsia="Times New Roman" w:hAnsi="Calibri" w:cs="Calibri"/>
-                <w:color w:val="000000"/>
-                <w:sz w:val="22"/>
-                <w:szCs w:val="22"/>
-              </w:rPr>
-              <w:t>("</w:t>
-            </w:r>
-            <w:proofErr w:type="spellStart"/>
-            <w:r>
-              <w:rPr>
-                <w:rFonts w:ascii="Calibri" w:eastAsia="Times New Roman" w:hAnsi="Calibri" w:cs="Calibri"/>
-                <w:color w:val="000000"/>
-                <w:sz w:val="22"/>
-                <w:szCs w:val="22"/>
-              </w:rPr>
-              <w:t>textContent</w:t>
-            </w:r>
-            <w:proofErr w:type="spellEnd"/>
-            <w:r>
-              <w:rPr>
-                <w:rFonts w:ascii="Calibri" w:eastAsia="Times New Roman" w:hAnsi="Calibri" w:cs="Calibri"/>
-                <w:color w:val="000000"/>
-                <w:sz w:val="22"/>
-                <w:szCs w:val="22"/>
-              </w:rPr>
-              <w:t xml:space="preserve">") and </w:t>
-            </w:r>
-            <w:proofErr w:type="spellStart"/>
-            <w:proofErr w:type="gramStart"/>
-            <w:r>
-              <w:rPr>
-                <w:rFonts w:ascii="Calibri" w:eastAsia="Times New Roman" w:hAnsi="Calibri" w:cs="Calibri"/>
-                <w:color w:val="000000"/>
-                <w:sz w:val="22"/>
-                <w:szCs w:val="22"/>
-              </w:rPr>
-              <w:t>visibilityOfElementLocated</w:t>
-            </w:r>
-            <w:proofErr w:type="spellEnd"/>
-            <w:r>
-              <w:rPr>
-                <w:rFonts w:ascii="Calibri" w:eastAsia="Times New Roman" w:hAnsi="Calibri" w:cs="Calibri"/>
-                <w:color w:val="000000"/>
-                <w:sz w:val="22"/>
-                <w:szCs w:val="22"/>
-              </w:rPr>
-              <w:t>(</w:t>
-            </w:r>
-            <w:proofErr w:type="gramEnd"/>
-            <w:r>
-              <w:rPr>
-                <w:rFonts w:ascii="Calibri" w:eastAsia="Times New Roman" w:hAnsi="Calibri" w:cs="Calibri"/>
-                <w:color w:val="000000"/>
-                <w:sz w:val="22"/>
-                <w:szCs w:val="22"/>
-              </w:rPr>
-              <w:t>)</w:t>
+              <w:t>Used getAttribute("textContent") and visibilityOfElementLocated()</w:t>
             </w:r>
           </w:p>
         </w:tc>
@@ -8336,6 +7471,7 @@
       <w:tr>
         <w:trPr>
           <w:divId w:val="1354304626"/>
+          <w:trHeight w:val="888"/>
         </w:trPr>
         <w:tc>
           <w:tcPr>
@@ -8417,6 +7553,7 @@
       <w:tr>
         <w:trPr>
           <w:divId w:val="1354304626"/>
+          <w:trHeight w:val="888"/>
         </w:trPr>
         <w:tc>
           <w:tcPr>
@@ -8483,43 +7620,22 @@
                 <w:szCs w:val="22"/>
               </w:rPr>
             </w:pPr>
-            <w:proofErr w:type="spellStart"/>
-            <w:r>
-              <w:rPr>
-                <w:rFonts w:ascii="Calibri" w:eastAsia="Times New Roman" w:hAnsi="Calibri" w:cs="Calibri"/>
-                <w:color w:val="000000"/>
-                <w:sz w:val="22"/>
-                <w:szCs w:val="22"/>
-              </w:rPr>
-              <w:t>TestUtils.dismissCookieConsent</w:t>
-            </w:r>
-            <w:proofErr w:type="spellEnd"/>
-            <w:r>
-              <w:rPr>
-                <w:rFonts w:ascii="Calibri" w:eastAsia="Times New Roman" w:hAnsi="Calibri" w:cs="Calibri"/>
-                <w:color w:val="000000"/>
-                <w:sz w:val="22"/>
-                <w:szCs w:val="22"/>
-              </w:rPr>
-              <w:t xml:space="preserve">() dismisses with JS click fallback on </w:t>
-            </w:r>
-            <w:proofErr w:type="spellStart"/>
-            <w:r>
-              <w:rPr>
-                <w:rFonts w:ascii="Calibri" w:eastAsia="Times New Roman" w:hAnsi="Calibri" w:cs="Calibri"/>
-                <w:color w:val="000000"/>
-                <w:sz w:val="22"/>
-                <w:szCs w:val="22"/>
-              </w:rPr>
-              <w:t>ElementClickInterceptedException</w:t>
-            </w:r>
-            <w:proofErr w:type="spellEnd"/>
+            <w:r>
+              <w:rPr>
+                <w:rFonts w:ascii="Calibri" w:eastAsia="Times New Roman" w:hAnsi="Calibri" w:cs="Calibri"/>
+                <w:color w:val="000000"/>
+                <w:sz w:val="22"/>
+                <w:szCs w:val="22"/>
+              </w:rPr>
+              <w:t>TestUtils.dismissCookieConsent() dismisses with JS click fallback on ElementClickInterceptedException</w:t>
+            </w:r>
           </w:p>
         </w:tc>
       </w:tr>
       <w:tr>
         <w:trPr>
           <w:divId w:val="1354304626"/>
+          <w:trHeight w:val="888"/>
         </w:trPr>
         <w:tc>
           <w:tcPr>
@@ -8586,85 +7702,14 @@
                 <w:szCs w:val="22"/>
               </w:rPr>
             </w:pPr>
-            <w:proofErr w:type="spellStart"/>
-            <w:r>
-              <w:rPr>
-                <w:rFonts w:ascii="Calibri" w:eastAsia="Times New Roman" w:hAnsi="Calibri" w:cs="Calibri"/>
-                <w:color w:val="000000"/>
-                <w:sz w:val="22"/>
-                <w:szCs w:val="22"/>
-              </w:rPr>
-              <w:t>ChromeOptions</w:t>
-            </w:r>
-            <w:proofErr w:type="spellEnd"/>
-            <w:r>
-              <w:rPr>
-                <w:rFonts w:ascii="Calibri" w:eastAsia="Times New Roman" w:hAnsi="Calibri" w:cs="Calibri"/>
-                <w:color w:val="000000"/>
-                <w:sz w:val="22"/>
-                <w:szCs w:val="22"/>
-              </w:rPr>
-              <w:t>: --disable-blink-features=</w:t>
-            </w:r>
-            <w:proofErr w:type="spellStart"/>
-            <w:r>
-              <w:rPr>
-                <w:rFonts w:ascii="Calibri" w:eastAsia="Times New Roman" w:hAnsi="Calibri" w:cs="Calibri"/>
-                <w:color w:val="000000"/>
-                <w:sz w:val="22"/>
-                <w:szCs w:val="22"/>
-              </w:rPr>
-              <w:t>AutomationControlled</w:t>
-            </w:r>
-            <w:proofErr w:type="spellEnd"/>
-            <w:r>
-              <w:rPr>
-                <w:rFonts w:ascii="Calibri" w:eastAsia="Times New Roman" w:hAnsi="Calibri" w:cs="Calibri"/>
-                <w:color w:val="000000"/>
-                <w:sz w:val="22"/>
-                <w:szCs w:val="22"/>
-              </w:rPr>
-              <w:t xml:space="preserve">; </w:t>
-            </w:r>
-            <w:proofErr w:type="spellStart"/>
-            <w:r>
-              <w:rPr>
-                <w:rFonts w:ascii="Calibri" w:eastAsia="Times New Roman" w:hAnsi="Calibri" w:cs="Calibri"/>
-                <w:color w:val="000000"/>
-                <w:sz w:val="22"/>
-                <w:szCs w:val="22"/>
-              </w:rPr>
-              <w:t>excludeSwitches</w:t>
-            </w:r>
-            <w:proofErr w:type="spellEnd"/>
-            <w:r>
-              <w:rPr>
-                <w:rFonts w:ascii="Calibri" w:eastAsia="Times New Roman" w:hAnsi="Calibri" w:cs="Calibri"/>
-                <w:color w:val="000000"/>
-                <w:sz w:val="22"/>
-                <w:szCs w:val="22"/>
-              </w:rPr>
-              <w:t xml:space="preserve">: enable-automation; </w:t>
-            </w:r>
-            <w:proofErr w:type="spellStart"/>
-            <w:r>
-              <w:rPr>
-                <w:rFonts w:ascii="Calibri" w:eastAsia="Times New Roman" w:hAnsi="Calibri" w:cs="Calibri"/>
-                <w:color w:val="000000"/>
-                <w:sz w:val="22"/>
-                <w:szCs w:val="22"/>
-              </w:rPr>
-              <w:t>useAutomationExtension</w:t>
-            </w:r>
-            <w:proofErr w:type="spellEnd"/>
-            <w:r>
-              <w:rPr>
-                <w:rFonts w:ascii="Calibri" w:eastAsia="Times New Roman" w:hAnsi="Calibri" w:cs="Calibri"/>
-                <w:color w:val="000000"/>
-                <w:sz w:val="22"/>
-                <w:szCs w:val="22"/>
-              </w:rPr>
-              <w:t>: false</w:t>
+            <w:r>
+              <w:rPr>
+                <w:rFonts w:ascii="Calibri" w:eastAsia="Times New Roman" w:hAnsi="Calibri" w:cs="Calibri"/>
+                <w:color w:val="000000"/>
+                <w:sz w:val="22"/>
+                <w:szCs w:val="22"/>
+              </w:rPr>
+              <w:t>ChromeOptions: --disable-blink-features=AutomationControlled; excludeSwitches: enable-automation; useAutomationExtension: false</w:t>
             </w:r>
           </w:p>
         </w:tc>
@@ -8672,6 +7717,7 @@
       <w:tr>
         <w:trPr>
           <w:divId w:val="1354304626"/>
+          <w:trHeight w:val="873"/>
         </w:trPr>
         <w:tc>
           <w:tcPr>
@@ -8738,25 +7784,14 @@
                 <w:szCs w:val="22"/>
               </w:rPr>
             </w:pPr>
-            <w:proofErr w:type="spellStart"/>
-            <w:r>
-              <w:rPr>
-                <w:rFonts w:ascii="Calibri" w:eastAsia="Times New Roman" w:hAnsi="Calibri" w:cs="Calibri"/>
-                <w:color w:val="000000"/>
-                <w:sz w:val="22"/>
-                <w:szCs w:val="22"/>
-              </w:rPr>
-              <w:t>SignupPageTest</w:t>
-            </w:r>
-            <w:proofErr w:type="spellEnd"/>
-            <w:r>
-              <w:rPr>
-                <w:rFonts w:ascii="Calibri" w:eastAsia="Times New Roman" w:hAnsi="Calibri" w:cs="Calibri"/>
-                <w:color w:val="000000"/>
-                <w:sz w:val="22"/>
-                <w:szCs w:val="22"/>
-              </w:rPr>
-              <w:t xml:space="preserve"> navigates to login.gog.com/login where the Create Account link is accessible</w:t>
+            <w:r>
+              <w:rPr>
+                <w:rFonts w:ascii="Calibri" w:eastAsia="Times New Roman" w:hAnsi="Calibri" w:cs="Calibri"/>
+                <w:color w:val="000000"/>
+                <w:sz w:val="22"/>
+                <w:szCs w:val="22"/>
+              </w:rPr>
+              <w:t>SignupPageTest navigates to login.gog.com/login where the Create Account link is accessible</w:t>
             </w:r>
           </w:p>
         </w:tc>
@@ -8764,6 +7799,7 @@
       <w:tr>
         <w:trPr>
           <w:divId w:val="1354304626"/>
+          <w:trHeight w:val="888"/>
         </w:trPr>
         <w:tc>
           <w:tcPr>
@@ -8799,27 +7835,7 @@
                 <w:sz w:val="22"/>
                 <w:szCs w:val="22"/>
               </w:rPr>
-              <w:t xml:space="preserve">UTF-8 BOM in source files causing </w:t>
-            </w:r>
-            <w:proofErr w:type="spellStart"/>
-            <w:r>
-              <w:rPr>
-                <w:rFonts w:ascii="Calibri" w:eastAsia="Times New Roman" w:hAnsi="Calibri" w:cs="Calibri"/>
-                <w:color w:val="000000"/>
-                <w:sz w:val="22"/>
-                <w:szCs w:val="22"/>
-              </w:rPr>
-              <w:t>javac</w:t>
-            </w:r>
-            <w:proofErr w:type="spellEnd"/>
-            <w:r>
-              <w:rPr>
-                <w:rFonts w:ascii="Calibri" w:eastAsia="Times New Roman" w:hAnsi="Calibri" w:cs="Calibri"/>
-                <w:color w:val="000000"/>
-                <w:sz w:val="22"/>
-                <w:szCs w:val="22"/>
-              </w:rPr>
-              <w:t xml:space="preserve"> errors</w:t>
+              <w:t>UTF-8 BOM in source files causing javac errors</w:t>
             </w:r>
           </w:p>
         </w:tc>
@@ -8901,37 +7917,12 @@
           <w:color w:val="000000"/>
         </w:rPr>
       </w:pPr>
-      <w:proofErr w:type="spellStart"/>
       <w:r>
         <w:rPr>
           <w:rFonts w:ascii="Consolas" w:hAnsi="Consolas"/>
           <w:color w:val="000000"/>
         </w:rPr>
-        <w:t>src</w:t>
-      </w:r>
-      <w:proofErr w:type="spellEnd"/>
-      <w:r>
-        <w:rPr>
-          <w:rFonts w:ascii="Consolas" w:hAnsi="Consolas"/>
-          <w:color w:val="000000"/>
-        </w:rPr>
-        <w:t>/test/java/com/</w:t>
-      </w:r>
-      <w:proofErr w:type="spellStart"/>
-      <w:r>
-        <w:rPr>
-          <w:rFonts w:ascii="Consolas" w:hAnsi="Consolas"/>
-          <w:color w:val="000000"/>
-        </w:rPr>
-        <w:t>gog</w:t>
-      </w:r>
-      <w:proofErr w:type="spellEnd"/>
-      <w:r>
-        <w:rPr>
-          <w:rFonts w:ascii="Consolas" w:hAnsi="Consolas"/>
-          <w:color w:val="000000"/>
-        </w:rPr>
-        <w:t>/</w:t>
+        <w:t>src/test/java/com/gog/</w:t>
       </w:r>
     </w:p>
     <w:p>
@@ -8967,49 +7958,7 @@
           <w:rFonts w:ascii="Consolas" w:hAnsi="Consolas"/>
           <w:color w:val="000000"/>
         </w:rPr>
-        <w:lastRenderedPageBreak/>
-        <w:t xml:space="preserve">│   ├── BaseTest.java       </w:t>
-      </w:r>
-      <w:proofErr w:type="gramStart"/>
-      <w:r>
-        <w:rPr>
-          <w:rFonts w:ascii="Consolas" w:hAnsi="Consolas"/>
-          <w:color w:val="000000"/>
-        </w:rPr>
-        <w:t xml:space="preserve">   (</w:t>
-      </w:r>
-      <w:proofErr w:type="spellStart"/>
-      <w:proofErr w:type="gramEnd"/>
-      <w:r>
-        <w:rPr>
-          <w:rFonts w:ascii="Consolas" w:hAnsi="Consolas"/>
-          <w:color w:val="000000"/>
-        </w:rPr>
-        <w:t>ChromeDriver</w:t>
-      </w:r>
-      <w:proofErr w:type="spellEnd"/>
-      <w:r>
-        <w:rPr>
-          <w:rFonts w:ascii="Consolas" w:hAnsi="Consolas"/>
-          <w:color w:val="000000"/>
-        </w:rPr>
-        <w:t xml:space="preserve"> setup/teardown, 20s </w:t>
-      </w:r>
-      <w:proofErr w:type="spellStart"/>
-      <w:r>
-        <w:rPr>
-          <w:rFonts w:ascii="Consolas" w:hAnsi="Consolas"/>
-          <w:color w:val="000000"/>
-        </w:rPr>
-        <w:t>WebDriverWait</w:t>
-      </w:r>
-      <w:proofErr w:type="spellEnd"/>
-      <w:r>
-        <w:rPr>
-          <w:rFonts w:ascii="Consolas" w:hAnsi="Consolas"/>
-          <w:color w:val="000000"/>
-        </w:rPr>
-        <w:t>)</w:t>
+        <w:t>│   ├── BaseTest.java          (ChromeDriver setup/teardown, 20s WebDriverWait)</w:t>
       </w:r>
     </w:p>
     <w:p>
@@ -9027,23 +7976,7 @@
           <w:rFonts w:ascii="Consolas" w:hAnsi="Consolas"/>
           <w:color w:val="000000"/>
         </w:rPr>
-        <w:t xml:space="preserve">│   └── AuthenticatedTest.java (extends </w:t>
-      </w:r>
-      <w:proofErr w:type="spellStart"/>
-      <w:r>
-        <w:rPr>
-          <w:rFonts w:ascii="Consolas" w:hAnsi="Consolas"/>
-          <w:color w:val="000000"/>
-        </w:rPr>
-        <w:t>BaseTest</w:t>
-      </w:r>
-      <w:proofErr w:type="spellEnd"/>
-      <w:r>
-        <w:rPr>
-          <w:rFonts w:ascii="Consolas" w:hAnsi="Consolas"/>
-          <w:color w:val="000000"/>
-        </w:rPr>
-        <w:t>, performs login before tests)</w:t>
+        <w:t>│   └── AuthenticatedTest.java (extends BaseTest, performs login before tests)</w:t>
       </w:r>
     </w:p>
     <w:p>
@@ -9223,6 +8156,7 @@
           <w:rFonts w:ascii="Consolas" w:hAnsi="Consolas"/>
           <w:color w:val="000000"/>
         </w:rPr>
+        <w:lastRenderedPageBreak/>
         <w:t>└── utils/</w:t>
       </w:r>
     </w:p>
@@ -9241,80 +8175,7 @@
           <w:rFonts w:ascii="Consolas" w:hAnsi="Consolas"/>
           <w:color w:val="000000"/>
         </w:rPr>
-        <w:t xml:space="preserve">    └── TestUtils.java      </w:t>
-      </w:r>
-      <w:proofErr w:type="gramStart"/>
-      <w:r>
-        <w:rPr>
-          <w:rFonts w:ascii="Consolas" w:hAnsi="Consolas"/>
-          <w:color w:val="000000"/>
-        </w:rPr>
-        <w:t xml:space="preserve">   (</w:t>
-      </w:r>
-      <w:proofErr w:type="spellStart"/>
-      <w:proofErr w:type="gramEnd"/>
-      <w:r>
-        <w:rPr>
-          <w:rFonts w:ascii="Consolas" w:hAnsi="Consolas"/>
-          <w:color w:val="000000"/>
-        </w:rPr>
-        <w:t>dismissCookieConsent</w:t>
-      </w:r>
-      <w:proofErr w:type="spellEnd"/>
-      <w:r>
-        <w:rPr>
-          <w:rFonts w:ascii="Consolas" w:hAnsi="Consolas"/>
-          <w:color w:val="000000"/>
-        </w:rPr>
-        <w:t xml:space="preserve">, </w:t>
-      </w:r>
-      <w:proofErr w:type="spellStart"/>
-      <w:r>
-        <w:rPr>
-          <w:rFonts w:ascii="Consolas" w:hAnsi="Consolas"/>
-          <w:color w:val="000000"/>
-        </w:rPr>
-        <w:t>performLogin</w:t>
-      </w:r>
-      <w:proofErr w:type="spellEnd"/>
-      <w:r>
-        <w:rPr>
-          <w:rFonts w:ascii="Consolas" w:hAnsi="Consolas"/>
-          <w:color w:val="000000"/>
-        </w:rPr>
-        <w:t xml:space="preserve">, </w:t>
-      </w:r>
-      <w:proofErr w:type="spellStart"/>
-      <w:r>
-        <w:rPr>
-          <w:rFonts w:ascii="Consolas" w:hAnsi="Consolas"/>
-          <w:color w:val="000000"/>
-        </w:rPr>
-        <w:t>waitForPageLoad</w:t>
-      </w:r>
-      <w:proofErr w:type="spellEnd"/>
-      <w:r>
-        <w:rPr>
-          <w:rFonts w:ascii="Consolas" w:hAnsi="Consolas"/>
-          <w:color w:val="000000"/>
-        </w:rPr>
-        <w:t xml:space="preserve">, </w:t>
-      </w:r>
-      <w:proofErr w:type="spellStart"/>
-      <w:r>
-        <w:rPr>
-          <w:rFonts w:ascii="Consolas" w:hAnsi="Consolas"/>
-          <w:color w:val="000000"/>
-        </w:rPr>
-        <w:t>isElementPresent</w:t>
-      </w:r>
-      <w:proofErr w:type="spellEnd"/>
-      <w:r>
-        <w:rPr>
-          <w:rFonts w:ascii="Consolas" w:hAnsi="Consolas"/>
-          <w:color w:val="000000"/>
-        </w:rPr>
-        <w:t>, pause)</w:t>
+        <w:t xml:space="preserve">    └── TestUtils.java         (dismissCookieConsent, performLogin, waitForPageLoad, isElementPresent, pause)</w:t>
       </w:r>
     </w:p>
     <w:p>
@@ -9343,23 +8204,7 @@
           <w:rFonts w:ascii="Consolas" w:hAnsi="Consolas"/>
           <w:color w:val="000000"/>
         </w:rPr>
-        <w:t xml:space="preserve">testng.xml                  </w:t>
-      </w:r>
-      <w:proofErr w:type="gramStart"/>
-      <w:r>
-        <w:rPr>
-          <w:rFonts w:ascii="Consolas" w:hAnsi="Consolas"/>
-          <w:color w:val="000000"/>
-        </w:rPr>
-        <w:t xml:space="preserve">   (</w:t>
-      </w:r>
-      <w:proofErr w:type="gramEnd"/>
-      <w:r>
-        <w:rPr>
-          <w:rFonts w:ascii="Consolas" w:hAnsi="Consolas"/>
-          <w:color w:val="000000"/>
-        </w:rPr>
-        <w:t>full suite integration – 8 test nodes, parallel=none)</w:t>
+        <w:t>testng.xml                     (full suite integration – 8 test nodes, parallel=none)</w:t>
       </w:r>
     </w:p>
     <w:p>
@@ -9377,23 +8222,7 @@
           <w:rFonts w:ascii="Consolas" w:hAnsi="Consolas"/>
           <w:color w:val="000000"/>
         </w:rPr>
-        <w:t xml:space="preserve">pom.xml                     </w:t>
-      </w:r>
-      <w:proofErr w:type="gramStart"/>
-      <w:r>
-        <w:rPr>
-          <w:rFonts w:ascii="Consolas" w:hAnsi="Consolas"/>
-          <w:color w:val="000000"/>
-        </w:rPr>
-        <w:t xml:space="preserve">   (</w:t>
-      </w:r>
-      <w:proofErr w:type="gramEnd"/>
-      <w:r>
-        <w:rPr>
-          <w:rFonts w:ascii="Consolas" w:hAnsi="Consolas"/>
-          <w:color w:val="000000"/>
-        </w:rPr>
-        <w:t>Maven build, Selenium 4.18.1, TestNG 7.9.0, Surefire 3.2.5)</w:t>
+        <w:t>pom.xml                        (Maven build, Selenium 4.18.1, TestNG 7.9.0, Surefire 3.2.5)</w:t>
       </w:r>
     </w:p>
     <w:p>
@@ -9525,23 +8354,13 @@
           <w:lang w:val="fr-FR"/>
         </w:rPr>
       </w:pPr>
-      <w:proofErr w:type="spellStart"/>
       <w:r>
         <w:rPr>
           <w:rFonts w:ascii="Calibri" w:eastAsia="Times New Roman" w:hAnsi="Calibri" w:cs="Calibri"/>
           <w:color w:val="000000"/>
           <w:lang w:val="fr-FR"/>
         </w:rPr>
-        <w:t>TestNG</w:t>
-      </w:r>
-      <w:proofErr w:type="spellEnd"/>
-      <w:r>
-        <w:rPr>
-          <w:rFonts w:ascii="Calibri" w:eastAsia="Times New Roman" w:hAnsi="Calibri" w:cs="Calibri"/>
-          <w:color w:val="000000"/>
-          <w:lang w:val="fr-FR"/>
-        </w:rPr>
-        <w:t xml:space="preserve"> Documentation – </w:t>
+        <w:t xml:space="preserve">TestNG Documentation – </w:t>
       </w:r>
       <w:hyperlink r:id="rId8" w:history="1">
         <w:r>
@@ -9567,37 +8386,12 @@
           <w:color w:val="000000"/>
         </w:rPr>
       </w:pPr>
-      <w:proofErr w:type="spellStart"/>
-      <w:r>
-        <w:rPr>
-          <w:rFonts w:ascii="Calibri" w:eastAsia="Times New Roman" w:hAnsi="Calibri" w:cs="Calibri"/>
-          <w:color w:val="000000"/>
-        </w:rPr>
-        <w:t>WebDriverManager</w:t>
-      </w:r>
-      <w:proofErr w:type="spellEnd"/>
-      <w:r>
-        <w:rPr>
-          <w:rFonts w:ascii="Calibri" w:eastAsia="Times New Roman" w:hAnsi="Calibri" w:cs="Calibri"/>
-          <w:color w:val="000000"/>
-        </w:rPr>
-        <w:t xml:space="preserve"> (</w:t>
-      </w:r>
-      <w:proofErr w:type="spellStart"/>
-      <w:r>
-        <w:rPr>
-          <w:rFonts w:ascii="Calibri" w:eastAsia="Times New Roman" w:hAnsi="Calibri" w:cs="Calibri"/>
-          <w:color w:val="000000"/>
-        </w:rPr>
-        <w:t>bonigarcia</w:t>
-      </w:r>
-      <w:proofErr w:type="spellEnd"/>
-      <w:r>
-        <w:rPr>
-          <w:rFonts w:ascii="Calibri" w:eastAsia="Times New Roman" w:hAnsi="Calibri" w:cs="Calibri"/>
-          <w:color w:val="000000"/>
-        </w:rPr>
-        <w:t xml:space="preserve">) – </w:t>
+      <w:r>
+        <w:rPr>
+          <w:rFonts w:ascii="Calibri" w:eastAsia="Times New Roman" w:hAnsi="Calibri" w:cs="Calibri"/>
+          <w:color w:val="000000"/>
+        </w:rPr>
+        <w:t xml:space="preserve">WebDriverManager (bonigarcia) – </w:t>
       </w:r>
       <w:hyperlink r:id="rId9" w:history="1">
         <w:r>
@@ -9674,7 +8468,7 @@
     </w:p>
     <w:sectPr>
       <w:pgSz w:w="12240" w:h="15840"/>
-      <w:pgMar w:top="1440" w:right="1440" w:bottom="1440" w:left="1440" w:header="720" w:footer="720" w:gutter="0"/>
+      <w:pgMar w:top="720" w:right="720" w:bottom="720" w:left="720" w:header="720" w:footer="720" w:gutter="0"/>
       <w:cols w:space="720"/>
       <w:docGrid w:linePitch="360"/>
     </w:sectPr>

</xml_diff>

<commit_message>
added a conclusion and future work section on report .docx
</commit_message>
<xml_diff>
--- a/doc/CEN4072_Group15_FinalReport.docx
+++ b/doc/CEN4072_Group15_FinalReport.docx
@@ -101,8 +101,19 @@
           <w:sz w:val="26"/>
           <w:szCs w:val="26"/>
         </w:rPr>
-        <w:t>Deepa Devasenapathy</w:t>
-      </w:r>
+        <w:t xml:space="preserve">Deepa </w:t>
+      </w:r>
+      <w:proofErr w:type="spellStart"/>
+      <w:r>
+        <w:rPr>
+          <w:rFonts w:ascii="Calibri" w:hAnsi="Calibri" w:cs="Calibri"/>
+          <w:color w:val="000000"/>
+          <w:sz w:val="26"/>
+          <w:szCs w:val="26"/>
+        </w:rPr>
+        <w:t>Devasenapathy</w:t>
+      </w:r>
+      <w:proofErr w:type="spellEnd"/>
     </w:p>
     <w:p>
       <w:pPr>
@@ -547,7 +558,23 @@
           <w:rFonts w:ascii="Calibri" w:hAnsi="Calibri" w:cs="Calibri"/>
           <w:color w:val="000000"/>
         </w:rPr>
-        <w:t>) is a global digital game distribution platform with a catalog of over 6,000 DRM-free titles. The site is built on a React/Angular hybrid architecture with a dedicated authentication subdomain (</w:t>
+        <w:t xml:space="preserve">) is a global digital game distribution platform with a catalog of over 6,000 DRM-free titles. The site is built on </w:t>
+      </w:r>
+      <w:proofErr w:type="gramStart"/>
+      <w:r>
+        <w:rPr>
+          <w:rFonts w:ascii="Calibri" w:hAnsi="Calibri" w:cs="Calibri"/>
+          <w:color w:val="000000"/>
+        </w:rPr>
+        <w:t>a React</w:t>
+      </w:r>
+      <w:proofErr w:type="gramEnd"/>
+      <w:r>
+        <w:rPr>
+          <w:rFonts w:ascii="Calibri" w:hAnsi="Calibri" w:cs="Calibri"/>
+          <w:color w:val="000000"/>
+        </w:rPr>
+        <w:t>/Angular hybrid architecture with a dedicated authentication subdomain (</w:t>
       </w:r>
       <w:r>
         <w:rPr>
@@ -854,6 +881,7 @@
                 <w:szCs w:val="22"/>
               </w:rPr>
             </w:pPr>
+            <w:proofErr w:type="spellStart"/>
             <w:r>
               <w:rPr>
                 <w:rFonts w:ascii="Calibri" w:eastAsia="Times New Roman" w:hAnsi="Calibri" w:cs="Calibri"/>
@@ -863,6 +891,7 @@
               </w:rPr>
               <w:t>HomePageTest</w:t>
             </w:r>
+            <w:proofErr w:type="spellEnd"/>
           </w:p>
         </w:tc>
         <w:tc>
@@ -1021,6 +1050,7 @@
                 <w:szCs w:val="22"/>
               </w:rPr>
             </w:pPr>
+            <w:proofErr w:type="spellStart"/>
             <w:r>
               <w:rPr>
                 <w:rFonts w:ascii="Calibri" w:eastAsia="Times New Roman" w:hAnsi="Calibri" w:cs="Calibri"/>
@@ -1030,6 +1060,7 @@
               </w:rPr>
               <w:t>LoginPageTest</w:t>
             </w:r>
+            <w:proofErr w:type="spellEnd"/>
           </w:p>
         </w:tc>
         <w:tc>
@@ -1188,6 +1219,7 @@
                 <w:szCs w:val="22"/>
               </w:rPr>
             </w:pPr>
+            <w:proofErr w:type="spellStart"/>
             <w:r>
               <w:rPr>
                 <w:rFonts w:ascii="Calibri" w:eastAsia="Times New Roman" w:hAnsi="Calibri" w:cs="Calibri"/>
@@ -1197,6 +1229,7 @@
               </w:rPr>
               <w:t>SignupPageTest</w:t>
             </w:r>
+            <w:proofErr w:type="spellEnd"/>
           </w:p>
         </w:tc>
         <w:tc>
@@ -1355,6 +1388,7 @@
                 <w:szCs w:val="22"/>
               </w:rPr>
             </w:pPr>
+            <w:proofErr w:type="spellStart"/>
             <w:r>
               <w:rPr>
                 <w:rFonts w:ascii="Calibri" w:eastAsia="Times New Roman" w:hAnsi="Calibri" w:cs="Calibri"/>
@@ -1364,6 +1398,7 @@
               </w:rPr>
               <w:t>SearchTest</w:t>
             </w:r>
+            <w:proofErr w:type="spellEnd"/>
           </w:p>
         </w:tc>
         <w:tc>
@@ -1522,6 +1557,7 @@
                 <w:szCs w:val="22"/>
               </w:rPr>
             </w:pPr>
+            <w:proofErr w:type="spellStart"/>
             <w:r>
               <w:rPr>
                 <w:rFonts w:ascii="Calibri" w:eastAsia="Times New Roman" w:hAnsi="Calibri" w:cs="Calibri"/>
@@ -1531,6 +1567,7 @@
               </w:rPr>
               <w:t>NavigationTest</w:t>
             </w:r>
+            <w:proofErr w:type="spellEnd"/>
           </w:p>
         </w:tc>
         <w:tc>
@@ -1689,6 +1726,7 @@
                 <w:szCs w:val="22"/>
               </w:rPr>
             </w:pPr>
+            <w:proofErr w:type="spellStart"/>
             <w:r>
               <w:rPr>
                 <w:rFonts w:ascii="Calibri" w:eastAsia="Times New Roman" w:hAnsi="Calibri" w:cs="Calibri"/>
@@ -1698,6 +1736,7 @@
               </w:rPr>
               <w:t>GamePageTest</w:t>
             </w:r>
+            <w:proofErr w:type="spellEnd"/>
           </w:p>
         </w:tc>
         <w:tc>
@@ -1734,7 +1773,27 @@
                 <w:sz w:val="22"/>
                 <w:szCs w:val="22"/>
               </w:rPr>
-              <w:t>The Witcher 3 product page: title, buy button, description, screenshots</w:t>
+              <w:t>The Witcher 3 product page: title</w:t>
+            </w:r>
+            <w:proofErr w:type="gramStart"/>
+            <w:r>
+              <w:rPr>
+                <w:rFonts w:ascii="Calibri" w:eastAsia="Times New Roman" w:hAnsi="Calibri" w:cs="Calibri"/>
+                <w:color w:val="000000"/>
+                <w:sz w:val="22"/>
+                <w:szCs w:val="22"/>
+              </w:rPr>
+              <w:t>, buy</w:t>
+            </w:r>
+            <w:proofErr w:type="gramEnd"/>
+            <w:r>
+              <w:rPr>
+                <w:rFonts w:ascii="Calibri" w:eastAsia="Times New Roman" w:hAnsi="Calibri" w:cs="Calibri"/>
+                <w:color w:val="000000"/>
+                <w:sz w:val="22"/>
+                <w:szCs w:val="22"/>
+              </w:rPr>
+              <w:t xml:space="preserve"> button, description, screenshots</w:t>
             </w:r>
           </w:p>
         </w:tc>
@@ -1856,6 +1915,7 @@
                 <w:szCs w:val="22"/>
               </w:rPr>
             </w:pPr>
+            <w:proofErr w:type="spellStart"/>
             <w:r>
               <w:rPr>
                 <w:rFonts w:ascii="Calibri" w:eastAsia="Times New Roman" w:hAnsi="Calibri" w:cs="Calibri"/>
@@ -1865,6 +1925,7 @@
               </w:rPr>
               <w:t>GenreBrowseTest</w:t>
             </w:r>
+            <w:proofErr w:type="spellEnd"/>
           </w:p>
         </w:tc>
         <w:tc>
@@ -2023,6 +2084,7 @@
                 <w:szCs w:val="22"/>
               </w:rPr>
             </w:pPr>
+            <w:proofErr w:type="spellStart"/>
             <w:r>
               <w:rPr>
                 <w:rFonts w:ascii="Calibri" w:eastAsia="Times New Roman" w:hAnsi="Calibri" w:cs="Calibri"/>
@@ -2032,6 +2094,7 @@
               </w:rPr>
               <w:t>CartPageTest</w:t>
             </w:r>
+            <w:proofErr w:type="spellEnd"/>
           </w:p>
         </w:tc>
         <w:tc>
@@ -2355,6 +2418,7 @@
         </w:rPr>
         <w:t xml:space="preserve">Each test class extends a shared </w:t>
       </w:r>
+      <w:proofErr w:type="spellStart"/>
       <w:r>
         <w:rPr>
           <w:rStyle w:val="code1"/>
@@ -2363,12 +2427,29 @@
         </w:rPr>
         <w:t>BaseTest</w:t>
       </w:r>
+      <w:proofErr w:type="spellEnd"/>
       <w:r>
         <w:rPr>
           <w:rFonts w:ascii="Calibri" w:hAnsi="Calibri" w:cs="Calibri"/>
           <w:color w:val="000000"/>
         </w:rPr>
-        <w:t xml:space="preserve"> class that initializes and tears down ChromeDriver once per class. </w:t>
+        <w:t xml:space="preserve"> class that initializes and tears down </w:t>
+      </w:r>
+      <w:proofErr w:type="spellStart"/>
+      <w:r>
+        <w:rPr>
+          <w:rFonts w:ascii="Calibri" w:hAnsi="Calibri" w:cs="Calibri"/>
+          <w:color w:val="000000"/>
+        </w:rPr>
+        <w:t>ChromeDriver</w:t>
+      </w:r>
+      <w:proofErr w:type="spellEnd"/>
+      <w:r>
+        <w:rPr>
+          <w:rFonts w:ascii="Calibri" w:hAnsi="Calibri" w:cs="Calibri"/>
+          <w:color w:val="000000"/>
+        </w:rPr>
+        <w:t xml:space="preserve"> once per class. </w:t>
       </w:r>
       <w:r>
         <w:rPr>
@@ -2385,6 +2466,7 @@
         </w:rPr>
         <w:t xml:space="preserve"> in each class navigates to the relevant page before every test. Tests use CSS selectors, XPath, and </w:t>
       </w:r>
+      <w:proofErr w:type="spellStart"/>
       <w:r>
         <w:rPr>
           <w:rStyle w:val="code1"/>
@@ -2393,6 +2475,7 @@
         </w:rPr>
         <w:t>WebDriverWait</w:t>
       </w:r>
+      <w:proofErr w:type="spellEnd"/>
       <w:r>
         <w:rPr>
           <w:rFonts w:ascii="Calibri" w:hAnsi="Calibri" w:cs="Calibri"/>
@@ -2400,6 +2483,7 @@
         </w:rPr>
         <w:t xml:space="preserve"> with a 20-second timeout. Shared helpers (cookie consent dismissal, page-load wait, element presence check) are centralized in </w:t>
       </w:r>
+      <w:proofErr w:type="spellStart"/>
       <w:r>
         <w:rPr>
           <w:rStyle w:val="code1"/>
@@ -2408,6 +2492,7 @@
         </w:rPr>
         <w:t>TestUtils</w:t>
       </w:r>
+      <w:proofErr w:type="spellEnd"/>
       <w:r>
         <w:rPr>
           <w:rFonts w:ascii="Calibri" w:hAnsi="Calibri" w:cs="Calibri"/>
@@ -2631,13 +2716,23 @@
                 <w:szCs w:val="22"/>
               </w:rPr>
             </w:pPr>
+            <w:proofErr w:type="spellStart"/>
             <w:r>
               <w:rPr>
                 <w:rStyle w:val="code1"/>
                 <w:rFonts w:eastAsia="Times New Roman" w:cs="Calibri"/>
                 <w:color w:val="000000"/>
               </w:rPr>
-              <w:t>mvn test</w:t>
+              <w:t>mvn</w:t>
+            </w:r>
+            <w:proofErr w:type="spellEnd"/>
+            <w:r>
+              <w:rPr>
+                <w:rStyle w:val="code1"/>
+                <w:rFonts w:eastAsia="Times New Roman" w:cs="Calibri"/>
+                <w:color w:val="000000"/>
+              </w:rPr>
+              <w:t xml:space="preserve"> test</w:t>
             </w:r>
             <w:r>
               <w:rPr>
@@ -2707,8 +2802,19 @@
                 <w:sz w:val="22"/>
                 <w:szCs w:val="22"/>
               </w:rPr>
-              <w:t>2. WebDriverManager</w:t>
-            </w:r>
+              <w:t xml:space="preserve">2. </w:t>
+            </w:r>
+            <w:proofErr w:type="spellStart"/>
+            <w:r>
+              <w:rPr>
+                <w:rFonts w:ascii="Calibri" w:eastAsia="Times New Roman" w:hAnsi="Calibri" w:cs="Calibri"/>
+                <w:color w:val="000000"/>
+                <w:sz w:val="22"/>
+                <w:szCs w:val="22"/>
+              </w:rPr>
+              <w:t>WebDriverManager</w:t>
+            </w:r>
+            <w:proofErr w:type="spellEnd"/>
           </w:p>
         </w:tc>
         <w:tc>
@@ -2745,7 +2851,27 @@
                 <w:sz w:val="22"/>
                 <w:szCs w:val="22"/>
               </w:rPr>
-              <w:t>Automatically downloads the matching ChromeDriver binary</w:t>
+              <w:t xml:space="preserve">Automatically downloads the matching </w:t>
+            </w:r>
+            <w:proofErr w:type="spellStart"/>
+            <w:r>
+              <w:rPr>
+                <w:rFonts w:ascii="Calibri" w:eastAsia="Times New Roman" w:hAnsi="Calibri" w:cs="Calibri"/>
+                <w:color w:val="000000"/>
+                <w:sz w:val="22"/>
+                <w:szCs w:val="22"/>
+              </w:rPr>
+              <w:t>ChromeDriver</w:t>
+            </w:r>
+            <w:proofErr w:type="spellEnd"/>
+            <w:r>
+              <w:rPr>
+                <w:rFonts w:ascii="Calibri" w:eastAsia="Times New Roman" w:hAnsi="Calibri" w:cs="Calibri"/>
+                <w:color w:val="000000"/>
+                <w:sz w:val="22"/>
+                <w:szCs w:val="22"/>
+              </w:rPr>
+              <w:t xml:space="preserve"> binary</w:t>
             </w:r>
           </w:p>
         </w:tc>
@@ -2789,7 +2915,27 @@
                 <w:sz w:val="22"/>
                 <w:szCs w:val="22"/>
               </w:rPr>
-              <w:t>3. BaseTest.setUp()</w:t>
+              <w:t xml:space="preserve">3. </w:t>
+            </w:r>
+            <w:proofErr w:type="spellStart"/>
+            <w:r>
+              <w:rPr>
+                <w:rFonts w:ascii="Calibri" w:eastAsia="Times New Roman" w:hAnsi="Calibri" w:cs="Calibri"/>
+                <w:color w:val="000000"/>
+                <w:sz w:val="22"/>
+                <w:szCs w:val="22"/>
+              </w:rPr>
+              <w:t>BaseTest.setUp</w:t>
+            </w:r>
+            <w:proofErr w:type="spellEnd"/>
+            <w:r>
+              <w:rPr>
+                <w:rFonts w:ascii="Calibri" w:eastAsia="Times New Roman" w:hAnsi="Calibri" w:cs="Calibri"/>
+                <w:color w:val="000000"/>
+                <w:sz w:val="22"/>
+                <w:szCs w:val="22"/>
+              </w:rPr>
+              <w:t>()</w:t>
             </w:r>
           </w:p>
         </w:tc>
@@ -2835,8 +2981,18 @@
                 <w:rFonts w:eastAsia="Times New Roman" w:cs="Calibri"/>
                 <w:color w:val="000000"/>
               </w:rPr>
-              <w:t>--disable-blink-features=AutomationControlled</w:t>
-            </w:r>
+              <w:t>--disable-blink-features=</w:t>
+            </w:r>
+            <w:proofErr w:type="spellStart"/>
+            <w:r>
+              <w:rPr>
+                <w:rStyle w:val="code1"/>
+                <w:rFonts w:eastAsia="Times New Roman" w:cs="Calibri"/>
+                <w:color w:val="000000"/>
+              </w:rPr>
+              <w:t>AutomationControlled</w:t>
+            </w:r>
+            <w:proofErr w:type="spellEnd"/>
             <w:r>
               <w:rPr>
                 <w:rFonts w:ascii="Calibri" w:eastAsia="Times New Roman" w:hAnsi="Calibri" w:cs="Calibri"/>
@@ -2881,14 +3037,25 @@
                 <w:szCs w:val="22"/>
               </w:rPr>
             </w:pPr>
-            <w:r>
-              <w:rPr>
-                <w:rFonts w:ascii="Calibri" w:eastAsia="Times New Roman" w:hAnsi="Calibri" w:cs="Calibri"/>
-                <w:color w:val="000000"/>
-                <w:sz w:val="22"/>
-                <w:szCs w:val="22"/>
-              </w:rPr>
-              <w:t>4. @BeforeMethod</w:t>
+            <w:proofErr w:type="gramStart"/>
+            <w:r>
+              <w:rPr>
+                <w:rFonts w:ascii="Calibri" w:eastAsia="Times New Roman" w:hAnsi="Calibri" w:cs="Calibri"/>
+                <w:color w:val="000000"/>
+                <w:sz w:val="22"/>
+                <w:szCs w:val="22"/>
+              </w:rPr>
+              <w:t>4. @</w:t>
+            </w:r>
+            <w:proofErr w:type="gramEnd"/>
+            <w:r>
+              <w:rPr>
+                <w:rFonts w:ascii="Calibri" w:eastAsia="Times New Roman" w:hAnsi="Calibri" w:cs="Calibri"/>
+                <w:color w:val="000000"/>
+                <w:sz w:val="22"/>
+                <w:szCs w:val="22"/>
+              </w:rPr>
+              <w:t>BeforeMethod</w:t>
             </w:r>
           </w:p>
         </w:tc>
@@ -3092,13 +3259,25 @@
               </w:rPr>
               <w:t xml:space="preserve">Calls </w:t>
             </w:r>
+            <w:proofErr w:type="spellStart"/>
+            <w:proofErr w:type="gramStart"/>
             <w:r>
               <w:rPr>
                 <w:rStyle w:val="code1"/>
                 <w:rFonts w:eastAsia="Times New Roman" w:cs="Calibri"/>
                 <w:color w:val="000000"/>
               </w:rPr>
-              <w:t>driver.quit()</w:t>
+              <w:t>driver.quit</w:t>
+            </w:r>
+            <w:proofErr w:type="spellEnd"/>
+            <w:proofErr w:type="gramEnd"/>
+            <w:r>
+              <w:rPr>
+                <w:rStyle w:val="code1"/>
+                <w:rFonts w:eastAsia="Times New Roman" w:cs="Calibri"/>
+                <w:color w:val="000000"/>
+              </w:rPr>
+              <w:t>()</w:t>
             </w:r>
             <w:r>
               <w:rPr>
@@ -3197,7 +3376,25 @@
                 <w:rFonts w:eastAsia="Times New Roman" w:cs="Calibri"/>
                 <w:color w:val="000000"/>
               </w:rPr>
-              <w:t>target/surefire-reports/</w:t>
+              <w:t>target/</w:t>
+            </w:r>
+            <w:proofErr w:type="gramStart"/>
+            <w:r>
+              <w:rPr>
+                <w:rStyle w:val="code1"/>
+                <w:rFonts w:eastAsia="Times New Roman" w:cs="Calibri"/>
+                <w:color w:val="000000"/>
+              </w:rPr>
+              <w:t>surefire-reports</w:t>
+            </w:r>
+            <w:proofErr w:type="gramEnd"/>
+            <w:r>
+              <w:rPr>
+                <w:rStyle w:val="code1"/>
+                <w:rFonts w:eastAsia="Times New Roman" w:cs="Calibri"/>
+                <w:color w:val="000000"/>
+              </w:rPr>
+              <w:t>/</w:t>
             </w:r>
           </w:p>
         </w:tc>
@@ -3411,6 +3608,7 @@
           <w:color w:val="000000"/>
         </w:rPr>
       </w:pPr>
+      <w:proofErr w:type="gramStart"/>
       <w:r>
         <w:rPr>
           <w:rFonts w:ascii="Calibri" w:eastAsia="Times New Roman" w:hAnsi="Calibri" w:cs="Calibri"/>
@@ -3418,6 +3616,7 @@
         </w:rPr>
         <w:t>Test Planning</w:t>
       </w:r>
+      <w:proofErr w:type="gramEnd"/>
     </w:p>
     <w:p>
       <w:pPr>
@@ -3557,44 +3756,84 @@
         </w:rPr>
         <w:t xml:space="preserve"> </w:t>
       </w:r>
+      <w:proofErr w:type="spellStart"/>
       <w:r>
         <w:rPr>
           <w:rStyle w:val="code1"/>
           <w:rFonts w:eastAsia="Times New Roman" w:cs="Calibri"/>
           <w:color w:val="000000"/>
         </w:rPr>
-        <w:t>WebElement.getText()</w:t>
-      </w:r>
-      <w:r>
-        <w:rPr>
-          <w:rFonts w:ascii="Calibri" w:eastAsia="Times New Roman" w:hAnsi="Calibri" w:cs="Calibri"/>
-          <w:color w:val="000000"/>
-        </w:rPr>
-        <w:t xml:space="preserve"> returns empty strings for React-rendered elements in some page configurations. Solution: use </w:t>
-      </w:r>
+        <w:t>WebElement.getText</w:t>
+      </w:r>
+      <w:proofErr w:type="spellEnd"/>
       <w:r>
         <w:rPr>
           <w:rStyle w:val="code1"/>
           <w:rFonts w:eastAsia="Times New Roman" w:cs="Calibri"/>
           <w:color w:val="000000"/>
         </w:rPr>
-        <w:t>getAttribute("textContent")</w:t>
-      </w:r>
-      <w:r>
-        <w:rPr>
-          <w:rFonts w:ascii="Calibri" w:eastAsia="Times New Roman" w:hAnsi="Calibri" w:cs="Calibri"/>
-          <w:color w:val="000000"/>
-        </w:rPr>
-        <w:t xml:space="preserve"> and </w:t>
-      </w:r>
+        <w:t>()</w:t>
+      </w:r>
+      <w:r>
+        <w:rPr>
+          <w:rFonts w:ascii="Calibri" w:eastAsia="Times New Roman" w:hAnsi="Calibri" w:cs="Calibri"/>
+          <w:color w:val="000000"/>
+        </w:rPr>
+        <w:t xml:space="preserve"> returns empty strings for React-rendered elements in some page configurations. Solution: use </w:t>
+      </w:r>
+      <w:proofErr w:type="spellStart"/>
       <w:r>
         <w:rPr>
           <w:rStyle w:val="code1"/>
           <w:rFonts w:eastAsia="Times New Roman" w:cs="Calibri"/>
           <w:color w:val="000000"/>
         </w:rPr>
+        <w:t>getAttribute</w:t>
+      </w:r>
+      <w:proofErr w:type="spellEnd"/>
+      <w:r>
+        <w:rPr>
+          <w:rStyle w:val="code1"/>
+          <w:rFonts w:eastAsia="Times New Roman" w:cs="Calibri"/>
+          <w:color w:val="000000"/>
+        </w:rPr>
+        <w:t>("</w:t>
+      </w:r>
+      <w:proofErr w:type="spellStart"/>
+      <w:r>
+        <w:rPr>
+          <w:rStyle w:val="code1"/>
+          <w:rFonts w:eastAsia="Times New Roman" w:cs="Calibri"/>
+          <w:color w:val="000000"/>
+        </w:rPr>
+        <w:t>textContent</w:t>
+      </w:r>
+      <w:proofErr w:type="spellEnd"/>
+      <w:r>
+        <w:rPr>
+          <w:rStyle w:val="code1"/>
+          <w:rFonts w:eastAsia="Times New Roman" w:cs="Calibri"/>
+          <w:color w:val="000000"/>
+        </w:rPr>
+        <w:t>")</w:t>
+      </w:r>
+      <w:r>
+        <w:rPr>
+          <w:rFonts w:ascii="Calibri" w:eastAsia="Times New Roman" w:hAnsi="Calibri" w:cs="Calibri"/>
+          <w:color w:val="000000"/>
+        </w:rPr>
+        <w:t xml:space="preserve"> and </w:t>
+      </w:r>
+      <w:proofErr w:type="spellStart"/>
+      <w:r>
+        <w:rPr>
+          <w:rStyle w:val="code1"/>
+          <w:rFonts w:eastAsia="Times New Roman" w:cs="Calibri"/>
+          <w:color w:val="000000"/>
+        </w:rPr>
         <w:t>visibilityOfElementLocated</w:t>
       </w:r>
+      <w:proofErr w:type="spellEnd"/>
       <w:r>
         <w:rPr>
           <w:rFonts w:ascii="Calibri" w:eastAsia="Times New Roman" w:hAnsi="Calibri" w:cs="Calibri"/>
@@ -3659,7 +3898,15 @@
           <w:rFonts w:ascii="Calibri" w:eastAsia="Times New Roman" w:hAnsi="Calibri" w:cs="Calibri"/>
           <w:color w:val="000000"/>
         </w:rPr>
-        <w:t xml:space="preserve"> via a header link in </w:t>
+        <w:t xml:space="preserve"> via a header link </w:t>
+      </w:r>
+      <w:proofErr w:type="gramStart"/>
+      <w:r>
+        <w:rPr>
+          <w:rFonts w:ascii="Calibri" w:eastAsia="Times New Roman" w:hAnsi="Calibri" w:cs="Calibri"/>
+          <w:color w:val="000000"/>
+        </w:rPr>
+        <w:t xml:space="preserve">in </w:t>
       </w:r>
       <w:r>
         <w:rPr>
@@ -3667,7 +3914,16 @@
           <w:rFonts w:eastAsia="Times New Roman" w:cs="Calibri"/>
           <w:color w:val="000000"/>
         </w:rPr>
-        <w:t>@BeforeMethod</w:t>
+        <w:t>@</w:t>
+      </w:r>
+      <w:proofErr w:type="gramEnd"/>
+      <w:r>
+        <w:rPr>
+          <w:rStyle w:val="code1"/>
+          <w:rFonts w:eastAsia="Times New Roman" w:cs="Calibri"/>
+          <w:color w:val="000000"/>
+        </w:rPr>
+        <w:t>BeforeMethod</w:t>
       </w:r>
       <w:r>
         <w:rPr>
@@ -3705,13 +3961,23 @@
         </w:rPr>
         <w:t xml:space="preserve"> GOG's GDPR banner overlaps clickable elements. </w:t>
       </w:r>
+      <w:proofErr w:type="spellStart"/>
       <w:r>
         <w:rPr>
           <w:rStyle w:val="code1"/>
           <w:rFonts w:eastAsia="Times New Roman" w:cs="Calibri"/>
           <w:color w:val="000000"/>
         </w:rPr>
-        <w:t>TestUtils.dismissCookieConsent()</w:t>
+        <w:t>TestUtils.dismissCookieConsent</w:t>
+      </w:r>
+      <w:proofErr w:type="spellEnd"/>
+      <w:r>
+        <w:rPr>
+          <w:rStyle w:val="code1"/>
+          <w:rFonts w:eastAsia="Times New Roman" w:cs="Calibri"/>
+          <w:color w:val="000000"/>
+        </w:rPr>
+        <w:t>()</w:t>
       </w:r>
       <w:r>
         <w:rPr>
@@ -3749,6 +4015,7 @@
         </w:rPr>
         <w:t xml:space="preserve"> All source files were stripped of the UTF-8 BOM (0xEF 0xBB 0xBF) that the original editor introduced, which caused </w:t>
       </w:r>
+      <w:proofErr w:type="spellStart"/>
       <w:r>
         <w:rPr>
           <w:rStyle w:val="code1"/>
@@ -3757,6 +4024,7 @@
         </w:rPr>
         <w:t>javac</w:t>
       </w:r>
+      <w:proofErr w:type="spellEnd"/>
       <w:r>
         <w:rPr>
           <w:rFonts w:ascii="Calibri" w:eastAsia="Times New Roman" w:hAnsi="Calibri" w:cs="Calibri"/>
@@ -3863,27 +4131,53 @@
         <w:lastRenderedPageBreak/>
         <w:t xml:space="preserve">Tests are executed via </w:t>
       </w:r>
+      <w:proofErr w:type="spellStart"/>
       <w:r>
         <w:rPr>
           <w:rStyle w:val="code1"/>
           <w:rFonts w:cs="Calibri"/>
           <w:color w:val="000000"/>
         </w:rPr>
-        <w:t>mvn test</w:t>
-      </w:r>
-      <w:r>
-        <w:rPr>
-          <w:rFonts w:ascii="Calibri" w:hAnsi="Calibri" w:cs="Calibri"/>
-          <w:color w:val="000000"/>
-        </w:rPr>
-        <w:t xml:space="preserve">. Maven Surefire Plugin 3.2.5 generates per-class XML reports in </w:t>
-      </w:r>
+        <w:t>mvn</w:t>
+      </w:r>
+      <w:proofErr w:type="spellEnd"/>
       <w:r>
         <w:rPr>
           <w:rStyle w:val="code1"/>
           <w:rFonts w:cs="Calibri"/>
           <w:color w:val="000000"/>
         </w:rPr>
+        <w:t xml:space="preserve"> test</w:t>
+      </w:r>
+      <w:r>
+        <w:rPr>
+          <w:rFonts w:ascii="Calibri" w:hAnsi="Calibri" w:cs="Calibri"/>
+          <w:color w:val="000000"/>
+        </w:rPr>
+        <w:t xml:space="preserve">. Maven Surefire </w:t>
+      </w:r>
+      <w:proofErr w:type="spellStart"/>
+      <w:r>
+        <w:rPr>
+          <w:rFonts w:ascii="Calibri" w:hAnsi="Calibri" w:cs="Calibri"/>
+          <w:color w:val="000000"/>
+        </w:rPr>
+        <w:t>Plugin</w:t>
+      </w:r>
+      <w:proofErr w:type="spellEnd"/>
+      <w:r>
+        <w:rPr>
+          <w:rFonts w:ascii="Calibri" w:hAnsi="Calibri" w:cs="Calibri"/>
+          <w:color w:val="000000"/>
+        </w:rPr>
+        <w:t xml:space="preserve"> 3.2.5 generates per-class XML reports in </w:t>
+      </w:r>
+      <w:r>
+        <w:rPr>
+          <w:rStyle w:val="code1"/>
+          <w:rFonts w:cs="Calibri"/>
+          <w:color w:val="000000"/>
+        </w:rPr>
         <w:t>target/surefire-reports/</w:t>
       </w:r>
       <w:r>
@@ -3891,7 +4185,23 @@
           <w:rFonts w:ascii="Calibri" w:hAnsi="Calibri" w:cs="Calibri"/>
           <w:color w:val="000000"/>
         </w:rPr>
-        <w:t xml:space="preserve">. Final result: </w:t>
+        <w:t xml:space="preserve">. </w:t>
+      </w:r>
+      <w:proofErr w:type="gramStart"/>
+      <w:r>
+        <w:rPr>
+          <w:rFonts w:ascii="Calibri" w:hAnsi="Calibri" w:cs="Calibri"/>
+          <w:color w:val="000000"/>
+        </w:rPr>
+        <w:t>Final result</w:t>
+      </w:r>
+      <w:proofErr w:type="gramEnd"/>
+      <w:r>
+        <w:rPr>
+          <w:rFonts w:ascii="Calibri" w:hAnsi="Calibri" w:cs="Calibri"/>
+          <w:color w:val="000000"/>
+        </w:rPr>
+        <w:t xml:space="preserve">: </w:t>
       </w:r>
       <w:r>
         <w:rPr>
@@ -4101,7 +4411,87 @@
                 <w:sz w:val="22"/>
                 <w:szCs w:val="22"/>
               </w:rPr>
-              <w:t xml:space="preserve">Authored HomePageTest and NavigationTest; configured testng.xml integration suite; contributed to BaseTest and TestUtils shared infrastructure; report writing. </w:t>
+              <w:t xml:space="preserve">Authored </w:t>
+            </w:r>
+            <w:proofErr w:type="spellStart"/>
+            <w:r>
+              <w:rPr>
+                <w:rFonts w:ascii="Calibri" w:eastAsia="Times New Roman" w:hAnsi="Calibri" w:cs="Calibri"/>
+                <w:color w:val="000000"/>
+                <w:sz w:val="22"/>
+                <w:szCs w:val="22"/>
+              </w:rPr>
+              <w:t>HomePageTest</w:t>
+            </w:r>
+            <w:proofErr w:type="spellEnd"/>
+            <w:r>
+              <w:rPr>
+                <w:rFonts w:ascii="Calibri" w:eastAsia="Times New Roman" w:hAnsi="Calibri" w:cs="Calibri"/>
+                <w:color w:val="000000"/>
+                <w:sz w:val="22"/>
+                <w:szCs w:val="22"/>
+              </w:rPr>
+              <w:t xml:space="preserve"> and </w:t>
+            </w:r>
+            <w:proofErr w:type="spellStart"/>
+            <w:r>
+              <w:rPr>
+                <w:rFonts w:ascii="Calibri" w:eastAsia="Times New Roman" w:hAnsi="Calibri" w:cs="Calibri"/>
+                <w:color w:val="000000"/>
+                <w:sz w:val="22"/>
+                <w:szCs w:val="22"/>
+              </w:rPr>
+              <w:t>NavigationTest</w:t>
+            </w:r>
+            <w:proofErr w:type="spellEnd"/>
+            <w:r>
+              <w:rPr>
+                <w:rFonts w:ascii="Calibri" w:eastAsia="Times New Roman" w:hAnsi="Calibri" w:cs="Calibri"/>
+                <w:color w:val="000000"/>
+                <w:sz w:val="22"/>
+                <w:szCs w:val="22"/>
+              </w:rPr>
+              <w:t xml:space="preserve">; configured testng.xml integration suite; contributed to </w:t>
+            </w:r>
+            <w:proofErr w:type="spellStart"/>
+            <w:r>
+              <w:rPr>
+                <w:rFonts w:ascii="Calibri" w:eastAsia="Times New Roman" w:hAnsi="Calibri" w:cs="Calibri"/>
+                <w:color w:val="000000"/>
+                <w:sz w:val="22"/>
+                <w:szCs w:val="22"/>
+              </w:rPr>
+              <w:t>BaseTest</w:t>
+            </w:r>
+            <w:proofErr w:type="spellEnd"/>
+            <w:r>
+              <w:rPr>
+                <w:rFonts w:ascii="Calibri" w:eastAsia="Times New Roman" w:hAnsi="Calibri" w:cs="Calibri"/>
+                <w:color w:val="000000"/>
+                <w:sz w:val="22"/>
+                <w:szCs w:val="22"/>
+              </w:rPr>
+              <w:t xml:space="preserve"> and </w:t>
+            </w:r>
+            <w:proofErr w:type="spellStart"/>
+            <w:r>
+              <w:rPr>
+                <w:rFonts w:ascii="Calibri" w:eastAsia="Times New Roman" w:hAnsi="Calibri" w:cs="Calibri"/>
+                <w:color w:val="000000"/>
+                <w:sz w:val="22"/>
+                <w:szCs w:val="22"/>
+              </w:rPr>
+              <w:t>TestUtils</w:t>
+            </w:r>
+            <w:proofErr w:type="spellEnd"/>
+            <w:r>
+              <w:rPr>
+                <w:rFonts w:ascii="Calibri" w:eastAsia="Times New Roman" w:hAnsi="Calibri" w:cs="Calibri"/>
+                <w:color w:val="000000"/>
+                <w:sz w:val="22"/>
+                <w:szCs w:val="22"/>
+              </w:rPr>
+              <w:t xml:space="preserve"> shared infrastructure; report writing. </w:t>
             </w:r>
           </w:p>
         </w:tc>
@@ -4184,7 +4574,67 @@
                 <w:sz w:val="22"/>
                 <w:szCs w:val="22"/>
               </w:rPr>
-              <w:t xml:space="preserve">Authored LoginPageTest and SignupPageTest (including Angular SPA workarounds); authored CartPageTest (dynamic cart navigation fix); resolved UTF-8 BOM compilation errors; GitHub repository setup and maintenance; debugging and final test fixes. </w:t>
+              <w:t xml:space="preserve">Authored </w:t>
+            </w:r>
+            <w:proofErr w:type="spellStart"/>
+            <w:r>
+              <w:rPr>
+                <w:rFonts w:ascii="Calibri" w:eastAsia="Times New Roman" w:hAnsi="Calibri" w:cs="Calibri"/>
+                <w:color w:val="000000"/>
+                <w:sz w:val="22"/>
+                <w:szCs w:val="22"/>
+              </w:rPr>
+              <w:t>LoginPageTest</w:t>
+            </w:r>
+            <w:proofErr w:type="spellEnd"/>
+            <w:r>
+              <w:rPr>
+                <w:rFonts w:ascii="Calibri" w:eastAsia="Times New Roman" w:hAnsi="Calibri" w:cs="Calibri"/>
+                <w:color w:val="000000"/>
+                <w:sz w:val="22"/>
+                <w:szCs w:val="22"/>
+              </w:rPr>
+              <w:t xml:space="preserve"> and </w:t>
+            </w:r>
+            <w:proofErr w:type="spellStart"/>
+            <w:r>
+              <w:rPr>
+                <w:rFonts w:ascii="Calibri" w:eastAsia="Times New Roman" w:hAnsi="Calibri" w:cs="Calibri"/>
+                <w:color w:val="000000"/>
+                <w:sz w:val="22"/>
+                <w:szCs w:val="22"/>
+              </w:rPr>
+              <w:t>SignupPageTest</w:t>
+            </w:r>
+            <w:proofErr w:type="spellEnd"/>
+            <w:r>
+              <w:rPr>
+                <w:rFonts w:ascii="Calibri" w:eastAsia="Times New Roman" w:hAnsi="Calibri" w:cs="Calibri"/>
+                <w:color w:val="000000"/>
+                <w:sz w:val="22"/>
+                <w:szCs w:val="22"/>
+              </w:rPr>
+              <w:t xml:space="preserve"> (including Angular SPA workarounds); authored </w:t>
+            </w:r>
+            <w:proofErr w:type="spellStart"/>
+            <w:r>
+              <w:rPr>
+                <w:rFonts w:ascii="Calibri" w:eastAsia="Times New Roman" w:hAnsi="Calibri" w:cs="Calibri"/>
+                <w:color w:val="000000"/>
+                <w:sz w:val="22"/>
+                <w:szCs w:val="22"/>
+              </w:rPr>
+              <w:t>CartPageTest</w:t>
+            </w:r>
+            <w:proofErr w:type="spellEnd"/>
+            <w:r>
+              <w:rPr>
+                <w:rFonts w:ascii="Calibri" w:eastAsia="Times New Roman" w:hAnsi="Calibri" w:cs="Calibri"/>
+                <w:color w:val="000000"/>
+                <w:sz w:val="22"/>
+                <w:szCs w:val="22"/>
+              </w:rPr>
+              <w:t xml:space="preserve"> (dynamic cart navigation fix); resolved UTF-8 BOM compilation errors; GitHub repository setup and maintenance; debugging and final test fixes. </w:t>
             </w:r>
           </w:p>
         </w:tc>
@@ -4267,15 +4717,103 @@
                 <w:sz w:val="22"/>
                 <w:szCs w:val="22"/>
               </w:rPr>
-              <w:t xml:space="preserve">Authored SearchTest, GamePageTest, and GenreBrowseTest; implemented React text content workaround using </w:t>
-            </w:r>
+              <w:t xml:space="preserve">Authored </w:t>
+            </w:r>
+            <w:proofErr w:type="spellStart"/>
+            <w:r>
+              <w:rPr>
+                <w:rFonts w:ascii="Calibri" w:eastAsia="Times New Roman" w:hAnsi="Calibri" w:cs="Calibri"/>
+                <w:color w:val="000000"/>
+                <w:sz w:val="22"/>
+                <w:szCs w:val="22"/>
+              </w:rPr>
+              <w:t>SearchTest</w:t>
+            </w:r>
+            <w:proofErr w:type="spellEnd"/>
+            <w:r>
+              <w:rPr>
+                <w:rFonts w:ascii="Calibri" w:eastAsia="Times New Roman" w:hAnsi="Calibri" w:cs="Calibri"/>
+                <w:color w:val="000000"/>
+                <w:sz w:val="22"/>
+                <w:szCs w:val="22"/>
+              </w:rPr>
+              <w:t xml:space="preserve">, </w:t>
+            </w:r>
+            <w:proofErr w:type="spellStart"/>
+            <w:r>
+              <w:rPr>
+                <w:rFonts w:ascii="Calibri" w:eastAsia="Times New Roman" w:hAnsi="Calibri" w:cs="Calibri"/>
+                <w:color w:val="000000"/>
+                <w:sz w:val="22"/>
+                <w:szCs w:val="22"/>
+              </w:rPr>
+              <w:t>GamePageTest</w:t>
+            </w:r>
+            <w:proofErr w:type="spellEnd"/>
+            <w:r>
+              <w:rPr>
+                <w:rFonts w:ascii="Calibri" w:eastAsia="Times New Roman" w:hAnsi="Calibri" w:cs="Calibri"/>
+                <w:color w:val="000000"/>
+                <w:sz w:val="22"/>
+                <w:szCs w:val="22"/>
+              </w:rPr>
+              <w:t xml:space="preserve">, and </w:t>
+            </w:r>
+            <w:proofErr w:type="spellStart"/>
+            <w:r>
+              <w:rPr>
+                <w:rFonts w:ascii="Calibri" w:eastAsia="Times New Roman" w:hAnsi="Calibri" w:cs="Calibri"/>
+                <w:color w:val="000000"/>
+                <w:sz w:val="22"/>
+                <w:szCs w:val="22"/>
+              </w:rPr>
+              <w:t>GenreBrowseTest</w:t>
+            </w:r>
+            <w:proofErr w:type="spellEnd"/>
+            <w:r>
+              <w:rPr>
+                <w:rFonts w:ascii="Calibri" w:eastAsia="Times New Roman" w:hAnsi="Calibri" w:cs="Calibri"/>
+                <w:color w:val="000000"/>
+                <w:sz w:val="22"/>
+                <w:szCs w:val="22"/>
+              </w:rPr>
+              <w:t xml:space="preserve">; implemented React text content workaround using </w:t>
+            </w:r>
+            <w:proofErr w:type="spellStart"/>
             <w:r>
               <w:rPr>
                 <w:rStyle w:val="code1"/>
                 <w:rFonts w:eastAsia="Times New Roman" w:cs="Calibri"/>
                 <w:color w:val="000000"/>
               </w:rPr>
-              <w:t>getAttribute("textContent")</w:t>
+              <w:t>getAttribute</w:t>
+            </w:r>
+            <w:proofErr w:type="spellEnd"/>
+            <w:r>
+              <w:rPr>
+                <w:rStyle w:val="code1"/>
+                <w:rFonts w:eastAsia="Times New Roman" w:cs="Calibri"/>
+                <w:color w:val="000000"/>
+              </w:rPr>
+              <w:t>("</w:t>
+            </w:r>
+            <w:proofErr w:type="spellStart"/>
+            <w:r>
+              <w:rPr>
+                <w:rStyle w:val="code1"/>
+                <w:rFonts w:eastAsia="Times New Roman" w:cs="Calibri"/>
+                <w:color w:val="000000"/>
+              </w:rPr>
+              <w:t>textContent</w:t>
+            </w:r>
+            <w:proofErr w:type="spellEnd"/>
+            <w:r>
+              <w:rPr>
+                <w:rStyle w:val="code1"/>
+                <w:rFonts w:eastAsia="Times New Roman" w:cs="Calibri"/>
+                <w:color w:val="000000"/>
+              </w:rPr>
+              <w:t>")</w:t>
             </w:r>
             <w:r>
               <w:rPr>
@@ -4955,6 +5493,7 @@
                 <w:szCs w:val="22"/>
               </w:rPr>
             </w:pPr>
+            <w:proofErr w:type="spellStart"/>
             <w:r>
               <w:rPr>
                 <w:rFonts w:ascii="Calibri" w:eastAsia="Times New Roman" w:hAnsi="Calibri" w:cs="Calibri"/>
@@ -4963,7 +5502,37 @@
                 <w:szCs w:val="22"/>
               </w:rPr>
               <w:lastRenderedPageBreak/>
-              <w:t>WebDriverManager (bonigarcia)</w:t>
+              <w:t>WebDriverManager</w:t>
+            </w:r>
+            <w:proofErr w:type="spellEnd"/>
+            <w:r>
+              <w:rPr>
+                <w:rFonts w:ascii="Calibri" w:eastAsia="Times New Roman" w:hAnsi="Calibri" w:cs="Calibri"/>
+                <w:color w:val="000000"/>
+                <w:sz w:val="22"/>
+                <w:szCs w:val="22"/>
+              </w:rPr>
+              <w:t xml:space="preserve"> (</w:t>
+            </w:r>
+            <w:proofErr w:type="spellStart"/>
+            <w:r>
+              <w:rPr>
+                <w:rFonts w:ascii="Calibri" w:eastAsia="Times New Roman" w:hAnsi="Calibri" w:cs="Calibri"/>
+                <w:color w:val="000000"/>
+                <w:sz w:val="22"/>
+                <w:szCs w:val="22"/>
+              </w:rPr>
+              <w:t>bonigarcia</w:t>
+            </w:r>
+            <w:proofErr w:type="spellEnd"/>
+            <w:r>
+              <w:rPr>
+                <w:rFonts w:ascii="Calibri" w:eastAsia="Times New Roman" w:hAnsi="Calibri" w:cs="Calibri"/>
+                <w:color w:val="000000"/>
+                <w:sz w:val="22"/>
+                <w:szCs w:val="22"/>
+              </w:rPr>
+              <w:t>)</w:t>
             </w:r>
           </w:p>
         </w:tc>
@@ -5039,7 +5608,27 @@
                 <w:sz w:val="22"/>
                 <w:szCs w:val="22"/>
               </w:rPr>
-              <w:t>Automatically downloads the correct ChromeDriver binary</w:t>
+              <w:t xml:space="preserve">Automatically downloads the correct </w:t>
+            </w:r>
+            <w:proofErr w:type="spellStart"/>
+            <w:r>
+              <w:rPr>
+                <w:rFonts w:ascii="Calibri" w:eastAsia="Times New Roman" w:hAnsi="Calibri" w:cs="Calibri"/>
+                <w:color w:val="000000"/>
+                <w:sz w:val="22"/>
+                <w:szCs w:val="22"/>
+              </w:rPr>
+              <w:t>ChromeDriver</w:t>
+            </w:r>
+            <w:proofErr w:type="spellEnd"/>
+            <w:r>
+              <w:rPr>
+                <w:rFonts w:ascii="Calibri" w:eastAsia="Times New Roman" w:hAnsi="Calibri" w:cs="Calibri"/>
+                <w:color w:val="000000"/>
+                <w:sz w:val="22"/>
+                <w:szCs w:val="22"/>
+              </w:rPr>
+              <w:t xml:space="preserve"> binary</w:t>
             </w:r>
           </w:p>
         </w:tc>
@@ -5196,6 +5785,7 @@
                 <w:szCs w:val="22"/>
               </w:rPr>
             </w:pPr>
+            <w:proofErr w:type="spellStart"/>
             <w:r>
               <w:rPr>
                 <w:rFonts w:ascii="Calibri" w:eastAsia="Times New Roman" w:hAnsi="Calibri" w:cs="Calibri"/>
@@ -5205,6 +5795,7 @@
               </w:rPr>
               <w:t>ChromeDriver</w:t>
             </w:r>
+            <w:proofErr w:type="spellEnd"/>
           </w:p>
         </w:tc>
         <w:tc>
@@ -5688,6 +6279,26 @@
           <w:color w:val="000000"/>
         </w:rPr>
       </w:pPr>
+    </w:p>
+    <w:p>
+      <w:pPr>
+        <w:pStyle w:val="NormalWeb"/>
+        <w:divId w:val="1354304626"/>
+        <w:rPr>
+          <w:rFonts w:ascii="Calibri" w:hAnsi="Calibri" w:cs="Calibri"/>
+          <w:color w:val="000000"/>
+        </w:rPr>
+      </w:pPr>
+    </w:p>
+    <w:p>
+      <w:pPr>
+        <w:pStyle w:val="NormalWeb"/>
+        <w:divId w:val="1354304626"/>
+        <w:rPr>
+          <w:rFonts w:ascii="Calibri" w:hAnsi="Calibri" w:cs="Calibri"/>
+          <w:color w:val="000000"/>
+        </w:rPr>
+      </w:pPr>
       <w:r>
         <w:rPr>
           <w:rStyle w:val="Strong"/>
@@ -5730,7 +6341,23 @@
           <w:rFonts w:ascii="Calibri" w:eastAsia="Times New Roman" w:hAnsi="Calibri" w:cs="Calibri"/>
           <w:color w:val="000000"/>
         </w:rPr>
-        <w:t xml:space="preserve"> LoginPageTest verifies the sign-in trigger, forgot password link, and create account link are accessible. If a frontend deployment broke any of these, the test would immediately flag it.</w:t>
+        <w:t xml:space="preserve"> </w:t>
+      </w:r>
+      <w:proofErr w:type="spellStart"/>
+      <w:r>
+        <w:rPr>
+          <w:rFonts w:ascii="Calibri" w:eastAsia="Times New Roman" w:hAnsi="Calibri" w:cs="Calibri"/>
+          <w:color w:val="000000"/>
+        </w:rPr>
+        <w:t>LoginPageTest</w:t>
+      </w:r>
+      <w:proofErr w:type="spellEnd"/>
+      <w:r>
+        <w:rPr>
+          <w:rFonts w:ascii="Calibri" w:eastAsia="Times New Roman" w:hAnsi="Calibri" w:cs="Calibri"/>
+          <w:color w:val="000000"/>
+        </w:rPr>
+        <w:t xml:space="preserve"> verifies the sign-in trigger, forgot password link, and create account link are accessible. If a frontend deployment broke any of these, the test would immediately flag it.</w:t>
       </w:r>
     </w:p>
     <w:p>
@@ -5752,14 +6379,48 @@
           <w:rFonts w:ascii="Calibri" w:eastAsia="Times New Roman" w:hAnsi="Calibri" w:cs="Calibri"/>
           <w:color w:val="000000"/>
         </w:rPr>
-        <w:t>Search regressions:</w:t>
-      </w:r>
-      <w:r>
-        <w:rPr>
-          <w:rFonts w:ascii="Calibri" w:eastAsia="Times New Roman" w:hAnsi="Calibri" w:cs="Calibri"/>
-          <w:color w:val="000000"/>
-        </w:rPr>
-        <w:t xml:space="preserve"> SearchTest confirms that search returns game tiles with titles and cover images. A broken search would be caught before users encounter empty results.</w:t>
+        <w:t xml:space="preserve">Search </w:t>
+      </w:r>
+      <w:proofErr w:type="gramStart"/>
+      <w:r>
+        <w:rPr>
+          <w:rStyle w:val="Strong"/>
+          <w:rFonts w:ascii="Calibri" w:eastAsia="Times New Roman" w:hAnsi="Calibri" w:cs="Calibri"/>
+          <w:color w:val="000000"/>
+        </w:rPr>
+        <w:t>regressions</w:t>
+      </w:r>
+      <w:proofErr w:type="gramEnd"/>
+      <w:r>
+        <w:rPr>
+          <w:rStyle w:val="Strong"/>
+          <w:rFonts w:ascii="Calibri" w:eastAsia="Times New Roman" w:hAnsi="Calibri" w:cs="Calibri"/>
+          <w:color w:val="000000"/>
+        </w:rPr>
+        <w:t>:</w:t>
+      </w:r>
+      <w:r>
+        <w:rPr>
+          <w:rFonts w:ascii="Calibri" w:eastAsia="Times New Roman" w:hAnsi="Calibri" w:cs="Calibri"/>
+          <w:color w:val="000000"/>
+        </w:rPr>
+        <w:t xml:space="preserve"> </w:t>
+      </w:r>
+      <w:proofErr w:type="spellStart"/>
+      <w:r>
+        <w:rPr>
+          <w:rFonts w:ascii="Calibri" w:eastAsia="Times New Roman" w:hAnsi="Calibri" w:cs="Calibri"/>
+          <w:color w:val="000000"/>
+        </w:rPr>
+        <w:t>SearchTest</w:t>
+      </w:r>
+      <w:proofErr w:type="spellEnd"/>
+      <w:r>
+        <w:rPr>
+          <w:rFonts w:ascii="Calibri" w:eastAsia="Times New Roman" w:hAnsi="Calibri" w:cs="Calibri"/>
+          <w:color w:val="000000"/>
+        </w:rPr>
+        <w:t xml:space="preserve"> confirms that search returns game tiles with titles and cover images. A broken search would be caught before users encounter empty results.</w:t>
       </w:r>
     </w:p>
     <w:p>
@@ -5788,7 +6449,23 @@
           <w:rFonts w:ascii="Calibri" w:eastAsia="Times New Roman" w:hAnsi="Calibri" w:cs="Calibri"/>
           <w:color w:val="000000"/>
         </w:rPr>
-        <w:t xml:space="preserve"> CartPageTest verifies the cart page loads with proper navigation and HTTPS. Any misconfiguration of the cart subdomain would be detected.</w:t>
+        <w:t xml:space="preserve"> </w:t>
+      </w:r>
+      <w:proofErr w:type="spellStart"/>
+      <w:r>
+        <w:rPr>
+          <w:rFonts w:ascii="Calibri" w:eastAsia="Times New Roman" w:hAnsi="Calibri" w:cs="Calibri"/>
+          <w:color w:val="000000"/>
+        </w:rPr>
+        <w:t>CartPageTest</w:t>
+      </w:r>
+      <w:proofErr w:type="spellEnd"/>
+      <w:r>
+        <w:rPr>
+          <w:rFonts w:ascii="Calibri" w:eastAsia="Times New Roman" w:hAnsi="Calibri" w:cs="Calibri"/>
+          <w:color w:val="000000"/>
+        </w:rPr>
+        <w:t xml:space="preserve"> verifies the cart page loads with proper navigation and HTTPS. Any misconfiguration of the cart subdomain would be detected.</w:t>
       </w:r>
     </w:p>
     <w:p>
@@ -5817,7 +6494,23 @@
           <w:rFonts w:ascii="Calibri" w:eastAsia="Times New Roman" w:hAnsi="Calibri" w:cs="Calibri"/>
           <w:color w:val="000000"/>
         </w:rPr>
-        <w:t xml:space="preserve"> GamePageTest checks that the buy button, description, screenshots, and system requirements are all rendered. Missing sections would be caught automatically.</w:t>
+        <w:t xml:space="preserve"> </w:t>
+      </w:r>
+      <w:proofErr w:type="spellStart"/>
+      <w:r>
+        <w:rPr>
+          <w:rFonts w:ascii="Calibri" w:eastAsia="Times New Roman" w:hAnsi="Calibri" w:cs="Calibri"/>
+          <w:color w:val="000000"/>
+        </w:rPr>
+        <w:t>GamePageTest</w:t>
+      </w:r>
+      <w:proofErr w:type="spellEnd"/>
+      <w:r>
+        <w:rPr>
+          <w:rFonts w:ascii="Calibri" w:eastAsia="Times New Roman" w:hAnsi="Calibri" w:cs="Calibri"/>
+          <w:color w:val="000000"/>
+        </w:rPr>
+        <w:t xml:space="preserve"> checks that the buy button, description, screenshots, and system requirements are all rendered. Missing sections would be caught automatically.</w:t>
       </w:r>
     </w:p>
     <w:p>
@@ -5846,7 +6539,23 @@
           <w:rFonts w:ascii="Calibri" w:eastAsia="Times New Roman" w:hAnsi="Calibri" w:cs="Calibri"/>
           <w:color w:val="000000"/>
         </w:rPr>
-        <w:t xml:space="preserve"> NavigationTest verifies the GOG logo link, store navigation, and header persistence across pages.</w:t>
+        <w:t xml:space="preserve"> </w:t>
+      </w:r>
+      <w:proofErr w:type="spellStart"/>
+      <w:r>
+        <w:rPr>
+          <w:rFonts w:ascii="Calibri" w:eastAsia="Times New Roman" w:hAnsi="Calibri" w:cs="Calibri"/>
+          <w:color w:val="000000"/>
+        </w:rPr>
+        <w:t>NavigationTest</w:t>
+      </w:r>
+      <w:proofErr w:type="spellEnd"/>
+      <w:r>
+        <w:rPr>
+          <w:rFonts w:ascii="Calibri" w:eastAsia="Times New Roman" w:hAnsi="Calibri" w:cs="Calibri"/>
+          <w:color w:val="000000"/>
+        </w:rPr>
+        <w:t xml:space="preserve"> verifies the GOG logo link, store navigation, and header persistence across pages.</w:t>
       </w:r>
     </w:p>
     <w:p>
@@ -5873,20 +6582,54 @@
         </w:rPr>
         <w:t xml:space="preserve"> The tests serve as a regression safety net. After any GOG frontend update, running </w:t>
       </w:r>
+      <w:proofErr w:type="spellStart"/>
       <w:r>
         <w:rPr>
           <w:rStyle w:val="code1"/>
           <w:rFonts w:cs="Calibri"/>
           <w:color w:val="000000"/>
         </w:rPr>
-        <w:t>mvn test</w:t>
+        <w:t>mvn</w:t>
+      </w:r>
+      <w:proofErr w:type="spellEnd"/>
+      <w:r>
+        <w:rPr>
+          <w:rStyle w:val="code1"/>
+          <w:rFonts w:cs="Calibri"/>
+          <w:color w:val="000000"/>
+        </w:rPr>
+        <w:t xml:space="preserve"> test</w:t>
       </w:r>
       <w:r>
         <w:rPr>
           <w:rFonts w:ascii="Calibri" w:hAnsi="Calibri" w:cs="Calibri"/>
           <w:color w:val="000000"/>
         </w:rPr>
-        <w:t xml:space="preserve"> produces a pass/fail report for all 51 test cases within 20 minutes — far faster than manual verification. The suite also documents the </w:t>
+        <w:t xml:space="preserve"> produces a pass/fail </w:t>
+      </w:r>
+      <w:r>
+        <w:rPr>
+          <w:rFonts w:ascii="Calibri" w:hAnsi="Calibri" w:cs="Calibri"/>
+          <w:color w:val="000000"/>
+        </w:rPr>
+        <w:lastRenderedPageBreak/>
+        <w:t xml:space="preserve">report for all 51 test cases within 20 </w:t>
+      </w:r>
+      <w:proofErr w:type="gramStart"/>
+      <w:r>
+        <w:rPr>
+          <w:rFonts w:ascii="Calibri" w:hAnsi="Calibri" w:cs="Calibri"/>
+          <w:color w:val="000000"/>
+        </w:rPr>
+        <w:t>minutes — far</w:t>
+      </w:r>
+      <w:proofErr w:type="gramEnd"/>
+      <w:r>
+        <w:rPr>
+          <w:rFonts w:ascii="Calibri" w:hAnsi="Calibri" w:cs="Calibri"/>
+          <w:color w:val="000000"/>
+        </w:rPr>
+        <w:t xml:space="preserve"> faster than manual verification. The suite also documents the </w:t>
       </w:r>
       <w:r>
         <w:rPr>
@@ -5907,19 +6650,599 @@
     <w:p>
       <w:pPr>
         <w:pStyle w:val="Heading2"/>
-        <w:divId w:val="1354304626"/>
-        <w:rPr>
-          <w:rFonts w:ascii="Calibri" w:eastAsia="Times New Roman" w:hAnsi="Calibri" w:cs="Calibri"/>
-          <w:color w:val="000000"/>
-        </w:rPr>
-      </w:pPr>
-      <w:r>
-        <w:rPr>
-          <w:rFonts w:ascii="Calibri" w:eastAsia="Times New Roman" w:hAnsi="Calibri" w:cs="Calibri"/>
-          <w:color w:val="000000"/>
+        <w:pBdr>
+          <w:bottom w:val="single" w:sz="12" w:space="1" w:color="auto"/>
+        </w:pBdr>
+        <w:divId w:val="1354304626"/>
+        <w:rPr>
+          <w:rFonts w:ascii="Calibri" w:eastAsia="Times New Roman" w:hAnsi="Calibri" w:cs="Calibri"/>
+          <w:color w:val="000000"/>
+        </w:rPr>
+      </w:pPr>
+      <w:r>
+        <w:rPr>
+          <w:rFonts w:ascii="Calibri" w:eastAsia="Times New Roman" w:hAnsi="Calibri" w:cs="Calibri"/>
+          <w:color w:val="000000"/>
+        </w:rPr>
+        <w:t>5. Future Work</w:t>
+      </w:r>
+    </w:p>
+    <w:p>
+      <w:pPr>
+        <w:divId w:val="1354304626"/>
+        <w:rPr>
+          <w:rFonts w:eastAsia="Times New Roman"/>
+          <w:b/>
+          <w:bCs/>
+        </w:rPr>
+      </w:pPr>
+    </w:p>
+    <w:p>
+      <w:pPr>
+        <w:pStyle w:val="NoSpacing"/>
+        <w:numPr>
+          <w:ilvl w:val="0"/>
+          <w:numId w:val="16"/>
+        </w:numPr>
+        <w:divId w:val="1354304626"/>
+        <w:rPr>
+          <w:rFonts w:ascii="Calibri" w:eastAsia="Times New Roman" w:hAnsi="Calibri" w:cs="Calibri"/>
+        </w:rPr>
+      </w:pPr>
+      <w:r>
+        <w:rPr>
+          <w:rFonts w:ascii="Calibri" w:eastAsia="Times New Roman" w:hAnsi="Calibri" w:cs="Calibri"/>
+        </w:rPr>
+        <w:t xml:space="preserve">Integrate with CI/CD (GitHub Actions) </w:t>
+      </w:r>
+    </w:p>
+    <w:p>
+      <w:pPr>
+        <w:pStyle w:val="NoSpacing"/>
+        <w:numPr>
+          <w:ilvl w:val="1"/>
+          <w:numId w:val="16"/>
+        </w:numPr>
+        <w:divId w:val="1354304626"/>
+        <w:rPr>
+          <w:rFonts w:ascii="Calibri" w:eastAsia="Times New Roman" w:hAnsi="Calibri" w:cs="Calibri"/>
+        </w:rPr>
+      </w:pPr>
+      <w:r>
+        <w:rPr>
+          <w:rFonts w:ascii="Calibri" w:eastAsia="Times New Roman" w:hAnsi="Calibri" w:cs="Calibri"/>
+        </w:rPr>
+        <w:t>Using</w:t>
+      </w:r>
+      <w:r>
+        <w:rPr>
+          <w:rFonts w:ascii="Calibri" w:eastAsia="Times New Roman" w:hAnsi="Calibri" w:cs="Calibri"/>
+        </w:rPr>
+        <w:t xml:space="preserve"> GitHub Actions </w:t>
+      </w:r>
+      <w:r>
+        <w:rPr>
+          <w:rFonts w:ascii="Calibri" w:eastAsia="Times New Roman" w:hAnsi="Calibri" w:cs="Calibri"/>
+        </w:rPr>
+        <w:t>would</w:t>
+      </w:r>
+      <w:r>
+        <w:rPr>
+          <w:rFonts w:ascii="Calibri" w:eastAsia="Times New Roman" w:hAnsi="Calibri" w:cs="Calibri"/>
+        </w:rPr>
+        <w:t xml:space="preserve"> </w:t>
+      </w:r>
+      <w:proofErr w:type="gramStart"/>
+      <w:r>
+        <w:rPr>
+          <w:rFonts w:ascii="Calibri" w:eastAsia="Times New Roman" w:hAnsi="Calibri" w:cs="Calibri"/>
+        </w:rPr>
+        <w:t>provide to</w:t>
+      </w:r>
+      <w:proofErr w:type="gramEnd"/>
+      <w:r>
+        <w:rPr>
+          <w:rFonts w:ascii="Calibri" w:eastAsia="Times New Roman" w:hAnsi="Calibri" w:cs="Calibri"/>
+        </w:rPr>
+        <w:t xml:space="preserve"> further testing</w:t>
+      </w:r>
+      <w:r>
+        <w:rPr>
+          <w:rFonts w:ascii="Calibri" w:eastAsia="Times New Roman" w:hAnsi="Calibri" w:cs="Calibri"/>
+        </w:rPr>
+        <w:t xml:space="preserve"> </w:t>
+      </w:r>
+      <w:r>
+        <w:rPr>
+          <w:rFonts w:ascii="Calibri" w:eastAsia="Times New Roman" w:hAnsi="Calibri" w:cs="Calibri"/>
+        </w:rPr>
+        <w:t xml:space="preserve">practices that tests can be automatically executed on every push or pull request. Helping catch bugs early, maintain code quality, and further bugs </w:t>
+      </w:r>
+    </w:p>
+    <w:p>
+      <w:pPr>
+        <w:pStyle w:val="NoSpacing"/>
+        <w:numPr>
+          <w:ilvl w:val="0"/>
+          <w:numId w:val="16"/>
+        </w:numPr>
+        <w:ind w:right="1440"/>
+        <w:divId w:val="1354304626"/>
+        <w:rPr>
+          <w:rFonts w:ascii="Calibri" w:eastAsia="Times New Roman" w:hAnsi="Calibri" w:cs="Calibri"/>
+        </w:rPr>
+      </w:pPr>
+      <w:r>
+        <w:rPr>
+          <w:rFonts w:ascii="Calibri" w:eastAsia="Times New Roman" w:hAnsi="Calibri" w:cs="Calibri"/>
+          <w:b/>
+          <w:bCs/>
+        </w:rPr>
+        <w:t xml:space="preserve">Expand login test coverage with CAPTCHA </w:t>
+      </w:r>
+    </w:p>
+    <w:p>
+      <w:pPr>
+        <w:pStyle w:val="NoSpacing"/>
+        <w:numPr>
+          <w:ilvl w:val="1"/>
+          <w:numId w:val="16"/>
+        </w:numPr>
+        <w:ind w:right="1440"/>
+        <w:divId w:val="1354304626"/>
+        <w:rPr>
+          <w:rFonts w:ascii="Calibri" w:eastAsia="Times New Roman" w:hAnsi="Calibri" w:cs="Calibri"/>
+        </w:rPr>
+      </w:pPr>
+      <w:r>
+        <w:rPr>
+          <w:rFonts w:ascii="Calibri" w:eastAsia="Times New Roman" w:hAnsi="Calibri" w:cs="Calibri"/>
+        </w:rPr>
+        <w:t xml:space="preserve">To </w:t>
+      </w:r>
+      <w:r>
+        <w:rPr>
+          <w:rFonts w:ascii="Calibri" w:eastAsia="Times New Roman" w:hAnsi="Calibri" w:cs="Calibri"/>
+        </w:rPr>
+        <w:t>consistently</w:t>
+      </w:r>
+      <w:r>
+        <w:rPr>
+          <w:rFonts w:ascii="Calibri" w:eastAsia="Times New Roman" w:hAnsi="Calibri" w:cs="Calibri"/>
+        </w:rPr>
+        <w:t xml:space="preserve"> authorize user access, test coverage can be built to include both CAPTCHA checks and third-party login flows (OAuth/social providers).  </w:t>
+      </w:r>
+    </w:p>
+    <w:p>
+      <w:pPr>
+        <w:pStyle w:val="NoSpacing"/>
+        <w:numPr>
+          <w:ilvl w:val="0"/>
+          <w:numId w:val="16"/>
+        </w:numPr>
+        <w:ind w:right="1440"/>
+        <w:divId w:val="1354304626"/>
+        <w:rPr>
+          <w:rFonts w:ascii="Calibri" w:eastAsia="Times New Roman" w:hAnsi="Calibri" w:cs="Calibri"/>
+        </w:rPr>
+      </w:pPr>
+      <w:r>
+        <w:rPr>
+          <w:rFonts w:ascii="Calibri" w:eastAsia="Times New Roman" w:hAnsi="Calibri" w:cs="Calibri"/>
+          <w:b/>
+          <w:bCs/>
+        </w:rPr>
+        <w:t>Add visual regression testing</w:t>
+      </w:r>
+      <w:r>
+        <w:rPr>
+          <w:rFonts w:ascii="Calibri" w:eastAsia="Times New Roman" w:hAnsi="Calibri" w:cs="Calibri"/>
+        </w:rPr>
+        <w:t xml:space="preserve"> </w:t>
+      </w:r>
+    </w:p>
+    <w:p>
+      <w:pPr>
+        <w:pStyle w:val="NoSpacing"/>
+        <w:numPr>
+          <w:ilvl w:val="1"/>
+          <w:numId w:val="16"/>
+        </w:numPr>
+        <w:ind w:right="1440"/>
+        <w:divId w:val="1354304626"/>
+        <w:rPr>
+          <w:rFonts w:ascii="Calibri" w:eastAsia="Times New Roman" w:hAnsi="Calibri" w:cs="Calibri"/>
+        </w:rPr>
+      </w:pPr>
+      <w:r>
+        <w:rPr>
+          <w:rFonts w:ascii="Calibri" w:eastAsia="Times New Roman" w:hAnsi="Calibri" w:cs="Calibri"/>
+        </w:rPr>
+        <w:t xml:space="preserve">Using a tool like Ashot to catch UI layout changes push can help capture screenshots of your UI and compare them to baseline images, detecting unintended layout or styling changes, which can be Integrated into CI/CD, automatically flags visual differences </w:t>
+      </w:r>
+    </w:p>
+    <w:p>
+      <w:pPr>
+        <w:pStyle w:val="NoSpacing"/>
+        <w:numPr>
+          <w:ilvl w:val="0"/>
+          <w:numId w:val="16"/>
+        </w:numPr>
+        <w:ind w:right="1440"/>
+        <w:divId w:val="1354304626"/>
+        <w:rPr>
+          <w:rFonts w:ascii="Calibri" w:eastAsia="Times New Roman" w:hAnsi="Calibri" w:cs="Calibri"/>
+        </w:rPr>
+      </w:pPr>
+      <w:r>
+        <w:rPr>
+          <w:rFonts w:ascii="Calibri" w:eastAsia="Times New Roman" w:hAnsi="Calibri" w:cs="Calibri"/>
+          <w:b/>
+          <w:bCs/>
+        </w:rPr>
+        <w:t>Parameterize test Data Test Execution</w:t>
+      </w:r>
+    </w:p>
+    <w:p>
+      <w:pPr>
+        <w:pStyle w:val="NoSpacing"/>
+        <w:numPr>
+          <w:ilvl w:val="1"/>
+          <w:numId w:val="16"/>
+        </w:numPr>
+        <w:ind w:right="1440"/>
+        <w:divId w:val="1354304626"/>
+        <w:rPr>
+          <w:rFonts w:ascii="Calibri" w:eastAsia="Times New Roman" w:hAnsi="Calibri" w:cs="Calibri"/>
+        </w:rPr>
+      </w:pPr>
+      <w:r>
+        <w:rPr>
+          <w:rFonts w:ascii="Calibri" w:eastAsia="Times New Roman" w:hAnsi="Calibri" w:cs="Calibri"/>
+        </w:rPr>
+        <w:t>To</w:t>
+      </w:r>
+      <w:r>
+        <w:rPr>
+          <w:rFonts w:ascii="Calibri" w:eastAsia="Times New Roman" w:hAnsi="Calibri" w:cs="Calibri"/>
+        </w:rPr>
+        <w:t xml:space="preserve"> use multiple search terms, and multiple game pages using TestNG. In future iterations we can </w:t>
+      </w:r>
+      <w:proofErr w:type="gramStart"/>
+      <w:r>
+        <w:rPr>
+          <w:rFonts w:ascii="Calibri" w:eastAsia="Times New Roman" w:hAnsi="Calibri" w:cs="Calibri"/>
+        </w:rPr>
+        <w:t>use @</w:t>
+      </w:r>
+      <w:proofErr w:type="gramEnd"/>
+      <w:r>
+        <w:rPr>
+          <w:rFonts w:ascii="Calibri" w:eastAsia="Times New Roman" w:hAnsi="Calibri" w:cs="Calibri"/>
+        </w:rPr>
+        <w:t xml:space="preserve">DataProvider Add cross-browser coverage (Firefox, Edge) via </w:t>
+      </w:r>
+      <w:proofErr w:type="spellStart"/>
+      <w:r>
+        <w:rPr>
+          <w:rFonts w:ascii="Calibri" w:eastAsia="Times New Roman" w:hAnsi="Calibri" w:cs="Calibri"/>
+        </w:rPr>
+        <w:t>WebDriverManager's</w:t>
+      </w:r>
+      <w:proofErr w:type="spellEnd"/>
+      <w:r>
+        <w:rPr>
+          <w:rFonts w:ascii="Calibri" w:eastAsia="Times New Roman" w:hAnsi="Calibri" w:cs="Calibri"/>
+        </w:rPr>
+        <w:t xml:space="preserve"> built-in support Mock the GOG API responses for faster, network-independent unit-level tests </w:t>
+      </w:r>
+    </w:p>
+    <w:p>
+      <w:pPr>
+        <w:pStyle w:val="Heading2"/>
+        <w:divId w:val="1354304626"/>
+        <w:rPr>
+          <w:rFonts w:ascii="Calibri" w:eastAsia="Times New Roman" w:hAnsi="Calibri" w:cs="Calibri"/>
+          <w:color w:val="000000"/>
+        </w:rPr>
+      </w:pPr>
+      <w:r>
+        <w:rPr>
+          <w:rFonts w:ascii="Calibri" w:eastAsia="Times New Roman" w:hAnsi="Calibri" w:cs="Calibri"/>
+          <w:color w:val="000000"/>
+        </w:rPr>
+        <w:t>6</w:t>
+      </w:r>
+      <w:r>
+        <w:rPr>
+          <w:rFonts w:ascii="Calibri" w:eastAsia="Times New Roman" w:hAnsi="Calibri" w:cs="Calibri"/>
+          <w:color w:val="000000"/>
+        </w:rPr>
+        <w:t xml:space="preserve">. </w:t>
+      </w:r>
+      <w:r>
+        <w:rPr>
+          <w:rFonts w:ascii="Calibri" w:eastAsia="Times New Roman" w:hAnsi="Calibri" w:cs="Calibri"/>
+          <w:color w:val="000000"/>
+        </w:rPr>
+        <w:t>Conclusion</w:t>
+      </w:r>
+    </w:p>
+    <w:p>
+      <w:pPr>
+        <w:pStyle w:val="NoSpacing"/>
+        <w:divId w:val="1354304626"/>
+        <w:rPr>
+          <w:rFonts w:eastAsia="Times New Roman"/>
+        </w:rPr>
+      </w:pPr>
+      <w:r>
+        <w:rPr>
+          <w:rFonts w:eastAsia="Times New Roman"/>
+        </w:rPr>
+        <w:t>This</w:t>
+      </w:r>
+      <w:r>
+        <w:rPr>
+          <w:rFonts w:eastAsia="Times New Roman"/>
+        </w:rPr>
+        <w:t xml:space="preserve"> complete end-to-end test suite was designed to cover various test cases that may occur from account login to browsing and checkout. </w:t>
+      </w:r>
+    </w:p>
+    <w:p>
+      <w:pPr>
+        <w:pStyle w:val="NoSpacing"/>
+        <w:numPr>
+          <w:ilvl w:val="1"/>
+          <w:numId w:val="20"/>
+        </w:numPr>
+        <w:divId w:val="1354304626"/>
+        <w:rPr>
+          <w:rFonts w:eastAsia="Times New Roman"/>
+        </w:rPr>
+      </w:pPr>
+      <w:r>
+        <w:rPr>
+          <w:rFonts w:eastAsia="Times New Roman"/>
+        </w:rPr>
+        <w:t>70 test cases over 8 different test classes</w:t>
+      </w:r>
+    </w:p>
+    <w:p>
+      <w:pPr>
+        <w:pStyle w:val="NoSpacing"/>
+        <w:numPr>
+          <w:ilvl w:val="2"/>
+          <w:numId w:val="20"/>
+        </w:numPr>
+        <w:divId w:val="1354304626"/>
+        <w:rPr>
+          <w:rFonts w:eastAsia="Times New Roman"/>
+        </w:rPr>
+      </w:pPr>
+      <w:r>
+        <w:rPr>
+          <w:rFonts w:eastAsia="Times New Roman"/>
+        </w:rPr>
+        <w:t xml:space="preserve">All pass without failures or long executions. </w:t>
+      </w:r>
+    </w:p>
+    <w:p>
+      <w:pPr>
+        <w:pStyle w:val="NoSpacing"/>
+        <w:divId w:val="1354304626"/>
+        <w:rPr>
+          <w:rFonts w:eastAsia="Times New Roman"/>
+        </w:rPr>
+      </w:pPr>
+      <w:r>
+        <w:rPr>
+          <w:rFonts w:eastAsia="Times New Roman"/>
+        </w:rPr>
+        <w:t xml:space="preserve">Using </w:t>
+      </w:r>
+      <w:r>
+        <w:rPr>
+          <w:rFonts w:eastAsia="Times New Roman"/>
+        </w:rPr>
+        <w:t xml:space="preserve">form inputs, keyboard events, page scrolling, screenshots, cookie validation, HTTPS verification, attribute assertations, and navigation between pages. </w:t>
+      </w:r>
+      <w:r>
+        <w:rPr>
+          <w:rFonts w:eastAsia="Times New Roman"/>
+        </w:rPr>
+        <w:t>Allows o</w:t>
+      </w:r>
+      <w:r>
+        <w:rPr>
+          <w:rFonts w:eastAsia="Times New Roman"/>
+        </w:rPr>
+        <w:t>ur testing suite</w:t>
+      </w:r>
+      <w:r>
+        <w:rPr>
+          <w:rFonts w:eastAsia="Times New Roman"/>
+        </w:rPr>
+        <w:t xml:space="preserve"> to</w:t>
+      </w:r>
+      <w:r>
+        <w:rPr>
+          <w:rFonts w:eastAsia="Times New Roman"/>
+        </w:rPr>
+        <w:t xml:space="preserve"> follow the industry-standard patterns for test case creation of:</w:t>
+      </w:r>
+    </w:p>
+    <w:p>
+      <w:pPr>
+        <w:pStyle w:val="NoSpacing"/>
+        <w:numPr>
+          <w:ilvl w:val="1"/>
+          <w:numId w:val="20"/>
+        </w:numPr>
+        <w:divId w:val="1354304626"/>
+        <w:rPr>
+          <w:rFonts w:eastAsia="Times New Roman"/>
+        </w:rPr>
+      </w:pPr>
+      <w:r>
+        <w:rPr>
+          <w:rFonts w:eastAsia="Times New Roman"/>
+        </w:rPr>
+        <w:t xml:space="preserve">Page Object Separation via </w:t>
+      </w:r>
+      <w:proofErr w:type="spellStart"/>
+      <w:r>
+        <w:rPr>
+          <w:rFonts w:eastAsia="Times New Roman"/>
+        </w:rPr>
+        <w:t>BaseTest</w:t>
+      </w:r>
+      <w:proofErr w:type="spellEnd"/>
+      <w:r>
+        <w:rPr>
+          <w:rFonts w:eastAsia="Times New Roman"/>
+        </w:rPr>
+        <w:t xml:space="preserve">, </w:t>
+      </w:r>
+    </w:p>
+    <w:p>
+      <w:pPr>
+        <w:pStyle w:val="NoSpacing"/>
+        <w:numPr>
+          <w:ilvl w:val="1"/>
+          <w:numId w:val="20"/>
+        </w:numPr>
+        <w:divId w:val="1354304626"/>
+        <w:rPr>
+          <w:rFonts w:eastAsia="Times New Roman"/>
+        </w:rPr>
+      </w:pPr>
+      <w:r>
+        <w:rPr>
+          <w:rFonts w:eastAsia="Times New Roman"/>
+        </w:rPr>
+        <w:t xml:space="preserve">shared utilities in </w:t>
+      </w:r>
+      <w:proofErr w:type="spellStart"/>
+      <w:r>
+        <w:rPr>
+          <w:rFonts w:eastAsia="Times New Roman"/>
+        </w:rPr>
+        <w:t>TestUtils</w:t>
+      </w:r>
+      <w:proofErr w:type="spellEnd"/>
+      <w:r>
+        <w:rPr>
+          <w:rFonts w:eastAsia="Times New Roman"/>
+        </w:rPr>
+        <w:t>,</w:t>
+      </w:r>
+    </w:p>
+    <w:p>
+      <w:pPr>
+        <w:pStyle w:val="NoSpacing"/>
+        <w:numPr>
+          <w:ilvl w:val="1"/>
+          <w:numId w:val="20"/>
+        </w:numPr>
+        <w:divId w:val="1354304626"/>
+        <w:rPr>
+          <w:rFonts w:eastAsia="Times New Roman"/>
+        </w:rPr>
+      </w:pPr>
+      <w:r>
+        <w:rPr>
+          <w:rFonts w:eastAsia="Times New Roman"/>
+        </w:rPr>
+        <w:t xml:space="preserve">external credential management via </w:t>
+      </w:r>
+      <w:proofErr w:type="spellStart"/>
+      <w:proofErr w:type="gramStart"/>
+      <w:r>
+        <w:rPr>
+          <w:rFonts w:eastAsia="Times New Roman"/>
+        </w:rPr>
+        <w:t>config.properties</w:t>
+      </w:r>
+      <w:proofErr w:type="spellEnd"/>
+      <w:proofErr w:type="gramEnd"/>
+      <w:r>
+        <w:rPr>
+          <w:rFonts w:eastAsia="Times New Roman"/>
+        </w:rPr>
+        <w:t xml:space="preserve">. </w:t>
+      </w:r>
+    </w:p>
+    <w:p>
+      <w:pPr>
+        <w:pStyle w:val="NoSpacing"/>
+        <w:divId w:val="1354304626"/>
+        <w:rPr>
+          <w:rFonts w:eastAsia="Times New Roman"/>
+        </w:rPr>
+      </w:pPr>
+      <w:r>
+        <w:rPr>
+          <w:rFonts w:eastAsia="Times New Roman"/>
+        </w:rPr>
+        <w:t xml:space="preserve">The testing suite also will generate a report after every execution using a customized TestNG listener. </w:t>
+      </w:r>
+    </w:p>
+    <w:p>
+      <w:pPr>
+        <w:divId w:val="1354304626"/>
+        <w:rPr>
+          <w:rFonts w:ascii="Calibri" w:eastAsia="Times New Roman" w:hAnsi="Calibri" w:cs="Calibri"/>
+        </w:rPr>
+      </w:pPr>
+    </w:p>
+    <w:p>
+      <w:pPr>
+        <w:divId w:val="1354304626"/>
+        <w:rPr>
+          <w:rFonts w:ascii="Calibri" w:eastAsia="Times New Roman" w:hAnsi="Calibri" w:cs="Calibri"/>
+        </w:rPr>
+      </w:pPr>
+      <w:r>
+        <w:rPr>
+          <w:rFonts w:ascii="Calibri" w:eastAsia="Times New Roman" w:hAnsi="Calibri" w:cs="Calibri"/>
         </w:rPr>
         <w:lastRenderedPageBreak/>
-        <w:t>5. Appendix</w:t>
+        <w:t>This project demonstrated real-world SPA automation requiring working around angular rendering delays, age gates, authorization redirects, and missing semantics in HTML elements; all of which we had encountered and solved during the development of the TestNG suite.</w:t>
+      </w:r>
+    </w:p>
+    <w:p>
+      <w:pPr>
+        <w:pStyle w:val="NoSpacing"/>
+        <w:ind w:right="1440"/>
+        <w:divId w:val="1354304626"/>
+        <w:rPr>
+          <w:rFonts w:eastAsia="Times New Roman"/>
+        </w:rPr>
+      </w:pPr>
+    </w:p>
+    <w:p>
+      <w:pPr>
+        <w:pStyle w:val="Heading2"/>
+        <w:divId w:val="1354304626"/>
+        <w:rPr>
+          <w:rFonts w:ascii="Calibri" w:eastAsia="Times New Roman" w:hAnsi="Calibri" w:cs="Calibri"/>
+          <w:color w:val="000000"/>
+        </w:rPr>
+      </w:pPr>
+      <w:r>
+        <w:rPr>
+          <w:rFonts w:ascii="Calibri" w:eastAsia="Times New Roman" w:hAnsi="Calibri" w:cs="Calibri"/>
+          <w:color w:val="000000"/>
+        </w:rPr>
+        <w:t>7</w:t>
+      </w:r>
+      <w:r>
+        <w:rPr>
+          <w:rFonts w:ascii="Calibri" w:eastAsia="Times New Roman" w:hAnsi="Calibri" w:cs="Calibri"/>
+          <w:color w:val="000000"/>
+        </w:rPr>
+        <w:t>. Appendix</w:t>
       </w:r>
     </w:p>
     <w:p>
@@ -5948,12 +7271,21 @@
           <w:color w:val="000000"/>
         </w:rPr>
       </w:pPr>
-      <w:r>
-        <w:rPr>
-          <w:rFonts w:ascii="Calibri" w:eastAsia="Times New Roman" w:hAnsi="Calibri" w:cs="Calibri"/>
-          <w:color w:val="000000"/>
-        </w:rPr>
-        <w:t>HomePageTest (7 tests)</w:t>
+      <w:proofErr w:type="spellStart"/>
+      <w:r>
+        <w:rPr>
+          <w:rFonts w:ascii="Calibri" w:eastAsia="Times New Roman" w:hAnsi="Calibri" w:cs="Calibri"/>
+          <w:color w:val="000000"/>
+        </w:rPr>
+        <w:t>HomePageTest</w:t>
+      </w:r>
+      <w:proofErr w:type="spellEnd"/>
+      <w:r>
+        <w:rPr>
+          <w:rFonts w:ascii="Calibri" w:eastAsia="Times New Roman" w:hAnsi="Calibri" w:cs="Calibri"/>
+          <w:color w:val="000000"/>
+        </w:rPr>
+        <w:t xml:space="preserve"> (7 tests)</w:t>
       </w:r>
     </w:p>
     <w:p>
@@ -6112,12 +7444,21 @@
           <w:color w:val="000000"/>
         </w:rPr>
       </w:pPr>
-      <w:r>
-        <w:rPr>
-          <w:rFonts w:ascii="Calibri" w:eastAsia="Times New Roman" w:hAnsi="Calibri" w:cs="Calibri"/>
-          <w:color w:val="000000"/>
-        </w:rPr>
-        <w:t>LoginPageTest (7 tests)</w:t>
+      <w:proofErr w:type="spellStart"/>
+      <w:r>
+        <w:rPr>
+          <w:rFonts w:ascii="Calibri" w:eastAsia="Times New Roman" w:hAnsi="Calibri" w:cs="Calibri"/>
+          <w:color w:val="000000"/>
+        </w:rPr>
+        <w:t>LoginPageTest</w:t>
+      </w:r>
+      <w:proofErr w:type="spellEnd"/>
+      <w:r>
+        <w:rPr>
+          <w:rFonts w:ascii="Calibri" w:eastAsia="Times New Roman" w:hAnsi="Calibri" w:cs="Calibri"/>
+          <w:color w:val="000000"/>
+        </w:rPr>
+        <w:t xml:space="preserve"> (7 tests)</w:t>
       </w:r>
     </w:p>
     <w:p>
@@ -6276,12 +7617,21 @@
           <w:color w:val="000000"/>
         </w:rPr>
       </w:pPr>
-      <w:r>
-        <w:rPr>
-          <w:rFonts w:ascii="Calibri" w:eastAsia="Times New Roman" w:hAnsi="Calibri" w:cs="Calibri"/>
-          <w:color w:val="000000"/>
-        </w:rPr>
-        <w:t>SignupPageTest (7 tests)</w:t>
+      <w:proofErr w:type="spellStart"/>
+      <w:r>
+        <w:rPr>
+          <w:rFonts w:ascii="Calibri" w:eastAsia="Times New Roman" w:hAnsi="Calibri" w:cs="Calibri"/>
+          <w:color w:val="000000"/>
+        </w:rPr>
+        <w:t>SignupPageTest</w:t>
+      </w:r>
+      <w:proofErr w:type="spellEnd"/>
+      <w:r>
+        <w:rPr>
+          <w:rFonts w:ascii="Calibri" w:eastAsia="Times New Roman" w:hAnsi="Calibri" w:cs="Calibri"/>
+          <w:color w:val="000000"/>
+        </w:rPr>
+        <w:t xml:space="preserve"> (7 tests)</w:t>
       </w:r>
     </w:p>
     <w:p>
@@ -6381,12 +7731,21 @@
           <w:color w:val="000000"/>
         </w:rPr>
       </w:pPr>
-      <w:r>
-        <w:rPr>
-          <w:rFonts w:ascii="Calibri" w:eastAsia="Times New Roman" w:hAnsi="Calibri" w:cs="Calibri"/>
-          <w:color w:val="000000"/>
-        </w:rPr>
-        <w:t>Verify a Create Account button or link is visible</w:t>
+      <w:proofErr w:type="gramStart"/>
+      <w:r>
+        <w:rPr>
+          <w:rFonts w:ascii="Calibri" w:eastAsia="Times New Roman" w:hAnsi="Calibri" w:cs="Calibri"/>
+          <w:color w:val="000000"/>
+        </w:rPr>
+        <w:t>Verify</w:t>
+      </w:r>
+      <w:proofErr w:type="gramEnd"/>
+      <w:r>
+        <w:rPr>
+          <w:rFonts w:ascii="Calibri" w:eastAsia="Times New Roman" w:hAnsi="Calibri" w:cs="Calibri"/>
+          <w:color w:val="000000"/>
+        </w:rPr>
+        <w:t xml:space="preserve"> a Create Account button or link is visible</w:t>
       </w:r>
     </w:p>
     <w:p>
@@ -6440,12 +7799,21 @@
           <w:color w:val="000000"/>
         </w:rPr>
       </w:pPr>
-      <w:r>
-        <w:rPr>
-          <w:rFonts w:ascii="Calibri" w:eastAsia="Times New Roman" w:hAnsi="Calibri" w:cs="Calibri"/>
-          <w:color w:val="000000"/>
-        </w:rPr>
-        <w:t>SearchTest (6 tests)</w:t>
+      <w:proofErr w:type="spellStart"/>
+      <w:r>
+        <w:rPr>
+          <w:rFonts w:ascii="Calibri" w:eastAsia="Times New Roman" w:hAnsi="Calibri" w:cs="Calibri"/>
+          <w:color w:val="000000"/>
+        </w:rPr>
+        <w:t>SearchTest</w:t>
+      </w:r>
+      <w:proofErr w:type="spellEnd"/>
+      <w:r>
+        <w:rPr>
+          <w:rFonts w:ascii="Calibri" w:eastAsia="Times New Roman" w:hAnsi="Calibri" w:cs="Calibri"/>
+          <w:color w:val="000000"/>
+        </w:rPr>
+        <w:t xml:space="preserve"> (6 tests)</w:t>
       </w:r>
     </w:p>
     <w:p>
@@ -6461,12 +7829,21 @@
           <w:color w:val="000000"/>
         </w:rPr>
       </w:pPr>
-      <w:r>
-        <w:rPr>
-          <w:rFonts w:ascii="Calibri" w:eastAsia="Times New Roman" w:hAnsi="Calibri" w:cs="Calibri"/>
-          <w:color w:val="000000"/>
-        </w:rPr>
-        <w:t>Verify a search icon or input is present in the GOG header</w:t>
+      <w:proofErr w:type="gramStart"/>
+      <w:r>
+        <w:rPr>
+          <w:rFonts w:ascii="Calibri" w:eastAsia="Times New Roman" w:hAnsi="Calibri" w:cs="Calibri"/>
+          <w:color w:val="000000"/>
+        </w:rPr>
+        <w:t>Verify</w:t>
+      </w:r>
+      <w:proofErr w:type="gramEnd"/>
+      <w:r>
+        <w:rPr>
+          <w:rFonts w:ascii="Calibri" w:eastAsia="Times New Roman" w:hAnsi="Calibri" w:cs="Calibri"/>
+          <w:color w:val="000000"/>
+        </w:rPr>
+        <w:t xml:space="preserve"> a search icon or input is present in the GOG header</w:t>
       </w:r>
     </w:p>
     <w:p>
@@ -6487,6 +7864,7 @@
           <w:rFonts w:ascii="Calibri" w:eastAsia="Times New Roman" w:hAnsi="Calibri" w:cs="Calibri"/>
           <w:color w:val="000000"/>
         </w:rPr>
+        <w:lastRenderedPageBreak/>
         <w:t>Verify the search results page loads when a query is provided</w:t>
       </w:r>
     </w:p>
@@ -6508,7 +7886,23 @@
           <w:rFonts w:ascii="Calibri" w:eastAsia="Times New Roman" w:hAnsi="Calibri" w:cs="Calibri"/>
           <w:color w:val="000000"/>
         </w:rPr>
-        <w:t>Verify searching 'witcher' returns at least one game tile</w:t>
+        <w:t>Verify searching '</w:t>
+      </w:r>
+      <w:proofErr w:type="spellStart"/>
+      <w:r>
+        <w:rPr>
+          <w:rFonts w:ascii="Calibri" w:eastAsia="Times New Roman" w:hAnsi="Calibri" w:cs="Calibri"/>
+          <w:color w:val="000000"/>
+        </w:rPr>
+        <w:t>witcher</w:t>
+      </w:r>
+      <w:proofErr w:type="spellEnd"/>
+      <w:r>
+        <w:rPr>
+          <w:rFonts w:ascii="Calibri" w:eastAsia="Times New Roman" w:hAnsi="Calibri" w:cs="Calibri"/>
+          <w:color w:val="000000"/>
+        </w:rPr>
+        <w:t>' returns at least one game tile</w:t>
       </w:r>
     </w:p>
     <w:p>
@@ -6583,13 +7977,21 @@
           <w:color w:val="000000"/>
         </w:rPr>
       </w:pPr>
-      <w:r>
-        <w:rPr>
-          <w:rFonts w:ascii="Calibri" w:eastAsia="Times New Roman" w:hAnsi="Calibri" w:cs="Calibri"/>
-          <w:color w:val="000000"/>
-        </w:rPr>
-        <w:lastRenderedPageBreak/>
-        <w:t>NavigationTest (6 tests)</w:t>
+      <w:proofErr w:type="spellStart"/>
+      <w:r>
+        <w:rPr>
+          <w:rFonts w:ascii="Calibri" w:eastAsia="Times New Roman" w:hAnsi="Calibri" w:cs="Calibri"/>
+          <w:color w:val="000000"/>
+        </w:rPr>
+        <w:t>NavigationTest</w:t>
+      </w:r>
+      <w:proofErr w:type="spellEnd"/>
+      <w:r>
+        <w:rPr>
+          <w:rFonts w:ascii="Calibri" w:eastAsia="Times New Roman" w:hAnsi="Calibri" w:cs="Calibri"/>
+          <w:color w:val="000000"/>
+        </w:rPr>
+        <w:t xml:space="preserve"> (6 tests)</w:t>
       </w:r>
     </w:p>
     <w:p>
@@ -6715,7 +8117,23 @@
           <w:rFonts w:ascii="Calibri" w:eastAsia="Times New Roman" w:hAnsi="Calibri" w:cs="Calibri"/>
           <w:color w:val="000000"/>
         </w:rPr>
-        <w:t>Verify a wishlist or cart icon is accessible in the header</w:t>
+        <w:t xml:space="preserve">Verify a </w:t>
+      </w:r>
+      <w:proofErr w:type="spellStart"/>
+      <w:r>
+        <w:rPr>
+          <w:rFonts w:ascii="Calibri" w:eastAsia="Times New Roman" w:hAnsi="Calibri" w:cs="Calibri"/>
+          <w:color w:val="000000"/>
+        </w:rPr>
+        <w:t>wishlist</w:t>
+      </w:r>
+      <w:proofErr w:type="spellEnd"/>
+      <w:r>
+        <w:rPr>
+          <w:rFonts w:ascii="Calibri" w:eastAsia="Times New Roman" w:hAnsi="Calibri" w:cs="Calibri"/>
+          <w:color w:val="000000"/>
+        </w:rPr>
+        <w:t xml:space="preserve"> or cart icon is accessible in the header</w:t>
       </w:r>
     </w:p>
     <w:p>
@@ -6727,12 +8145,21 @@
           <w:color w:val="000000"/>
         </w:rPr>
       </w:pPr>
-      <w:r>
-        <w:rPr>
-          <w:rFonts w:ascii="Calibri" w:eastAsia="Times New Roman" w:hAnsi="Calibri" w:cs="Calibri"/>
-          <w:color w:val="000000"/>
-        </w:rPr>
-        <w:t>GamePageTest (7 tests)</w:t>
+      <w:proofErr w:type="spellStart"/>
+      <w:r>
+        <w:rPr>
+          <w:rFonts w:ascii="Calibri" w:eastAsia="Times New Roman" w:hAnsi="Calibri" w:cs="Calibri"/>
+          <w:color w:val="000000"/>
+        </w:rPr>
+        <w:t>GamePageTest</w:t>
+      </w:r>
+      <w:proofErr w:type="spellEnd"/>
+      <w:r>
+        <w:rPr>
+          <w:rFonts w:ascii="Calibri" w:eastAsia="Times New Roman" w:hAnsi="Calibri" w:cs="Calibri"/>
+          <w:color w:val="000000"/>
+        </w:rPr>
+        <w:t xml:space="preserve"> (7 tests)</w:t>
       </w:r>
     </w:p>
     <w:p>
@@ -6891,12 +8318,21 @@
           <w:color w:val="000000"/>
         </w:rPr>
       </w:pPr>
-      <w:r>
-        <w:rPr>
-          <w:rFonts w:ascii="Calibri" w:eastAsia="Times New Roman" w:hAnsi="Calibri" w:cs="Calibri"/>
-          <w:color w:val="000000"/>
-        </w:rPr>
-        <w:t>GenreBrowseTest (6 tests)</w:t>
+      <w:proofErr w:type="spellStart"/>
+      <w:r>
+        <w:rPr>
+          <w:rFonts w:ascii="Calibri" w:eastAsia="Times New Roman" w:hAnsi="Calibri" w:cs="Calibri"/>
+          <w:color w:val="000000"/>
+        </w:rPr>
+        <w:t>GenreBrowseTest</w:t>
+      </w:r>
+      <w:proofErr w:type="spellEnd"/>
+      <w:r>
+        <w:rPr>
+          <w:rFonts w:ascii="Calibri" w:eastAsia="Times New Roman" w:hAnsi="Calibri" w:cs="Calibri"/>
+          <w:color w:val="000000"/>
+        </w:rPr>
+        <w:t xml:space="preserve"> (6 tests)</w:t>
       </w:r>
     </w:p>
     <w:p>
@@ -6933,12 +8369,37 @@
           <w:color w:val="000000"/>
         </w:rPr>
       </w:pPr>
-      <w:r>
-        <w:rPr>
-          <w:rFonts w:ascii="Calibri" w:eastAsia="Times New Roman" w:hAnsi="Calibri" w:cs="Calibri"/>
-          <w:color w:val="000000"/>
-        </w:rPr>
-        <w:t>Verify the RPG genre browse page loads and stays on gog.com</w:t>
+      <w:proofErr w:type="gramStart"/>
+      <w:r>
+        <w:rPr>
+          <w:rFonts w:ascii="Calibri" w:eastAsia="Times New Roman" w:hAnsi="Calibri" w:cs="Calibri"/>
+          <w:color w:val="000000"/>
+        </w:rPr>
+        <w:t>Verify</w:t>
+      </w:r>
+      <w:proofErr w:type="gramEnd"/>
+      <w:r>
+        <w:rPr>
+          <w:rFonts w:ascii="Calibri" w:eastAsia="Times New Roman" w:hAnsi="Calibri" w:cs="Calibri"/>
+          <w:color w:val="000000"/>
+        </w:rPr>
+        <w:t xml:space="preserve"> the RPG genre </w:t>
+      </w:r>
+      <w:proofErr w:type="gramStart"/>
+      <w:r>
+        <w:rPr>
+          <w:rFonts w:ascii="Calibri" w:eastAsia="Times New Roman" w:hAnsi="Calibri" w:cs="Calibri"/>
+          <w:color w:val="000000"/>
+        </w:rPr>
+        <w:t>browse</w:t>
+      </w:r>
+      <w:proofErr w:type="gramEnd"/>
+      <w:r>
+        <w:rPr>
+          <w:rFonts w:ascii="Calibri" w:eastAsia="Times New Roman" w:hAnsi="Calibri" w:cs="Calibri"/>
+          <w:color w:val="000000"/>
+        </w:rPr>
+        <w:t xml:space="preserve"> page loads and stays on gog.com</w:t>
       </w:r>
     </w:p>
     <w:p>
@@ -7034,12 +8495,21 @@
           <w:color w:val="000000"/>
         </w:rPr>
       </w:pPr>
-      <w:r>
-        <w:rPr>
-          <w:rFonts w:ascii="Calibri" w:eastAsia="Times New Roman" w:hAnsi="Calibri" w:cs="Calibri"/>
-          <w:color w:val="000000"/>
-        </w:rPr>
-        <w:t>CartPageTest (7 tests)</w:t>
+      <w:proofErr w:type="spellStart"/>
+      <w:r>
+        <w:rPr>
+          <w:rFonts w:ascii="Calibri" w:eastAsia="Times New Roman" w:hAnsi="Calibri" w:cs="Calibri"/>
+          <w:color w:val="000000"/>
+        </w:rPr>
+        <w:t>CartPageTest</w:t>
+      </w:r>
+      <w:proofErr w:type="spellEnd"/>
+      <w:r>
+        <w:rPr>
+          <w:rFonts w:ascii="Calibri" w:eastAsia="Times New Roman" w:hAnsi="Calibri" w:cs="Calibri"/>
+          <w:color w:val="000000"/>
+        </w:rPr>
+        <w:t xml:space="preserve"> (7 tests)</w:t>
       </w:r>
     </w:p>
     <w:p>
@@ -7060,7 +8530,23 @@
           <w:rFonts w:ascii="Calibri" w:eastAsia="Times New Roman" w:hAnsi="Calibri" w:cs="Calibri"/>
           <w:color w:val="000000"/>
         </w:rPr>
-        <w:t>Verify GOG cart/checkout page loads and URL stays on gog.com</w:t>
+        <w:t xml:space="preserve">Verify GOG cart/checkout page loads and URL </w:t>
+      </w:r>
+      <w:proofErr w:type="gramStart"/>
+      <w:r>
+        <w:rPr>
+          <w:rFonts w:ascii="Calibri" w:eastAsia="Times New Roman" w:hAnsi="Calibri" w:cs="Calibri"/>
+          <w:color w:val="000000"/>
+        </w:rPr>
+        <w:t>stays</w:t>
+      </w:r>
+      <w:proofErr w:type="gramEnd"/>
+      <w:r>
+        <w:rPr>
+          <w:rFonts w:ascii="Calibri" w:eastAsia="Times New Roman" w:hAnsi="Calibri" w:cs="Calibri"/>
+          <w:color w:val="000000"/>
+        </w:rPr>
+        <w:t xml:space="preserve"> on gog.com</w:t>
       </w:r>
     </w:p>
     <w:p>
@@ -7186,6 +8672,7 @@
           <w:rFonts w:ascii="Calibri" w:eastAsia="Times New Roman" w:hAnsi="Calibri" w:cs="Calibri"/>
           <w:color w:val="000000"/>
         </w:rPr>
+        <w:lastRenderedPageBreak/>
         <w:t>Verify the cart/checkout page is served over HTTPS</w:t>
       </w:r>
     </w:p>
@@ -7260,7 +8747,6 @@
                 <w:sz w:val="22"/>
                 <w:szCs w:val="22"/>
               </w:rPr>
-              <w:lastRenderedPageBreak/>
               <w:t>Constraint</w:t>
             </w:r>
           </w:p>
@@ -7425,7 +8911,38 @@
                 <w:sz w:val="22"/>
                 <w:szCs w:val="22"/>
               </w:rPr>
-              <w:t>React-rendered text – getText() returns empty string</w:t>
+              <w:t xml:space="preserve">React-rendered text – </w:t>
+            </w:r>
+            <w:proofErr w:type="spellStart"/>
+            <w:proofErr w:type="gramStart"/>
+            <w:r>
+              <w:rPr>
+                <w:rFonts w:ascii="Calibri" w:eastAsia="Times New Roman" w:hAnsi="Calibri" w:cs="Calibri"/>
+                <w:color w:val="000000"/>
+                <w:sz w:val="22"/>
+                <w:szCs w:val="22"/>
+              </w:rPr>
+              <w:t>getText</w:t>
+            </w:r>
+            <w:proofErr w:type="spellEnd"/>
+            <w:r>
+              <w:rPr>
+                <w:rFonts w:ascii="Calibri" w:eastAsia="Times New Roman" w:hAnsi="Calibri" w:cs="Calibri"/>
+                <w:color w:val="000000"/>
+                <w:sz w:val="22"/>
+                <w:szCs w:val="22"/>
+              </w:rPr>
+              <w:t>(</w:t>
+            </w:r>
+            <w:proofErr w:type="gramEnd"/>
+            <w:r>
+              <w:rPr>
+                <w:rFonts w:ascii="Calibri" w:eastAsia="Times New Roman" w:hAnsi="Calibri" w:cs="Calibri"/>
+                <w:color w:val="000000"/>
+                <w:sz w:val="22"/>
+                <w:szCs w:val="22"/>
+              </w:rPr>
+              <w:t>) returns empty string</w:t>
             </w:r>
           </w:p>
         </w:tc>
@@ -7463,7 +8980,78 @@
                 <w:sz w:val="22"/>
                 <w:szCs w:val="22"/>
               </w:rPr>
-              <w:t>Used getAttribute("textContent") and visibilityOfElementLocated()</w:t>
+              <w:t xml:space="preserve">Used </w:t>
+            </w:r>
+            <w:proofErr w:type="spellStart"/>
+            <w:r>
+              <w:rPr>
+                <w:rFonts w:ascii="Calibri" w:eastAsia="Times New Roman" w:hAnsi="Calibri" w:cs="Calibri"/>
+                <w:color w:val="000000"/>
+                <w:sz w:val="22"/>
+                <w:szCs w:val="22"/>
+              </w:rPr>
+              <w:t>getAttribute</w:t>
+            </w:r>
+            <w:proofErr w:type="spellEnd"/>
+            <w:r>
+              <w:rPr>
+                <w:rFonts w:ascii="Calibri" w:eastAsia="Times New Roman" w:hAnsi="Calibri" w:cs="Calibri"/>
+                <w:color w:val="000000"/>
+                <w:sz w:val="22"/>
+                <w:szCs w:val="22"/>
+              </w:rPr>
+              <w:t>("</w:t>
+            </w:r>
+            <w:proofErr w:type="spellStart"/>
+            <w:r>
+              <w:rPr>
+                <w:rFonts w:ascii="Calibri" w:eastAsia="Times New Roman" w:hAnsi="Calibri" w:cs="Calibri"/>
+                <w:color w:val="000000"/>
+                <w:sz w:val="22"/>
+                <w:szCs w:val="22"/>
+              </w:rPr>
+              <w:t>textContent</w:t>
+            </w:r>
+            <w:proofErr w:type="spellEnd"/>
+            <w:r>
+              <w:rPr>
+                <w:rFonts w:ascii="Calibri" w:eastAsia="Times New Roman" w:hAnsi="Calibri" w:cs="Calibri"/>
+                <w:color w:val="000000"/>
+                <w:sz w:val="22"/>
+                <w:szCs w:val="22"/>
+              </w:rPr>
+              <w:t xml:space="preserve">") and </w:t>
+            </w:r>
+            <w:proofErr w:type="spellStart"/>
+            <w:proofErr w:type="gramStart"/>
+            <w:r>
+              <w:rPr>
+                <w:rFonts w:ascii="Calibri" w:eastAsia="Times New Roman" w:hAnsi="Calibri" w:cs="Calibri"/>
+                <w:color w:val="000000"/>
+                <w:sz w:val="22"/>
+                <w:szCs w:val="22"/>
+              </w:rPr>
+              <w:t>visibilityOfElementLocated</w:t>
+            </w:r>
+            <w:proofErr w:type="spellEnd"/>
+            <w:r>
+              <w:rPr>
+                <w:rFonts w:ascii="Calibri" w:eastAsia="Times New Roman" w:hAnsi="Calibri" w:cs="Calibri"/>
+                <w:color w:val="000000"/>
+                <w:sz w:val="22"/>
+                <w:szCs w:val="22"/>
+              </w:rPr>
+              <w:t>(</w:t>
+            </w:r>
+            <w:proofErr w:type="gramEnd"/>
+            <w:r>
+              <w:rPr>
+                <w:rFonts w:ascii="Calibri" w:eastAsia="Times New Roman" w:hAnsi="Calibri" w:cs="Calibri"/>
+                <w:color w:val="000000"/>
+                <w:sz w:val="22"/>
+                <w:szCs w:val="22"/>
+              </w:rPr>
+              <w:t>)</w:t>
             </w:r>
           </w:p>
         </w:tc>
@@ -7620,15 +9208,37 @@
                 <w:szCs w:val="22"/>
               </w:rPr>
             </w:pPr>
-            <w:r>
-              <w:rPr>
-                <w:rFonts w:ascii="Calibri" w:eastAsia="Times New Roman" w:hAnsi="Calibri" w:cs="Calibri"/>
-                <w:color w:val="000000"/>
-                <w:sz w:val="22"/>
-                <w:szCs w:val="22"/>
-              </w:rPr>
-              <w:t>TestUtils.dismissCookieConsent() dismisses with JS click fallback on ElementClickInterceptedException</w:t>
-            </w:r>
+            <w:proofErr w:type="spellStart"/>
+            <w:r>
+              <w:rPr>
+                <w:rFonts w:ascii="Calibri" w:eastAsia="Times New Roman" w:hAnsi="Calibri" w:cs="Calibri"/>
+                <w:color w:val="000000"/>
+                <w:sz w:val="22"/>
+                <w:szCs w:val="22"/>
+              </w:rPr>
+              <w:t>TestUtils.dismissCookieConsent</w:t>
+            </w:r>
+            <w:proofErr w:type="spellEnd"/>
+            <w:r>
+              <w:rPr>
+                <w:rFonts w:ascii="Calibri" w:eastAsia="Times New Roman" w:hAnsi="Calibri" w:cs="Calibri"/>
+                <w:color w:val="000000"/>
+                <w:sz w:val="22"/>
+                <w:szCs w:val="22"/>
+              </w:rPr>
+              <w:t xml:space="preserve">() dismisses with JS click fallback on </w:t>
+            </w:r>
+            <w:proofErr w:type="spellStart"/>
+            <w:r>
+              <w:rPr>
+                <w:rFonts w:ascii="Calibri" w:eastAsia="Times New Roman" w:hAnsi="Calibri" w:cs="Calibri"/>
+                <w:color w:val="000000"/>
+                <w:sz w:val="22"/>
+                <w:szCs w:val="22"/>
+              </w:rPr>
+              <w:t>ElementClickInterceptedException</w:t>
+            </w:r>
+            <w:proofErr w:type="spellEnd"/>
           </w:p>
         </w:tc>
       </w:tr>
@@ -7702,14 +9312,85 @@
                 <w:szCs w:val="22"/>
               </w:rPr>
             </w:pPr>
-            <w:r>
-              <w:rPr>
-                <w:rFonts w:ascii="Calibri" w:eastAsia="Times New Roman" w:hAnsi="Calibri" w:cs="Calibri"/>
-                <w:color w:val="000000"/>
-                <w:sz w:val="22"/>
-                <w:szCs w:val="22"/>
-              </w:rPr>
-              <w:t>ChromeOptions: --disable-blink-features=AutomationControlled; excludeSwitches: enable-automation; useAutomationExtension: false</w:t>
+            <w:proofErr w:type="spellStart"/>
+            <w:r>
+              <w:rPr>
+                <w:rFonts w:ascii="Calibri" w:eastAsia="Times New Roman" w:hAnsi="Calibri" w:cs="Calibri"/>
+                <w:color w:val="000000"/>
+                <w:sz w:val="22"/>
+                <w:szCs w:val="22"/>
+              </w:rPr>
+              <w:t>ChromeOptions</w:t>
+            </w:r>
+            <w:proofErr w:type="spellEnd"/>
+            <w:r>
+              <w:rPr>
+                <w:rFonts w:ascii="Calibri" w:eastAsia="Times New Roman" w:hAnsi="Calibri" w:cs="Calibri"/>
+                <w:color w:val="000000"/>
+                <w:sz w:val="22"/>
+                <w:szCs w:val="22"/>
+              </w:rPr>
+              <w:t>: --disable-blink-features=</w:t>
+            </w:r>
+            <w:proofErr w:type="spellStart"/>
+            <w:r>
+              <w:rPr>
+                <w:rFonts w:ascii="Calibri" w:eastAsia="Times New Roman" w:hAnsi="Calibri" w:cs="Calibri"/>
+                <w:color w:val="000000"/>
+                <w:sz w:val="22"/>
+                <w:szCs w:val="22"/>
+              </w:rPr>
+              <w:t>AutomationControlled</w:t>
+            </w:r>
+            <w:proofErr w:type="spellEnd"/>
+            <w:r>
+              <w:rPr>
+                <w:rFonts w:ascii="Calibri" w:eastAsia="Times New Roman" w:hAnsi="Calibri" w:cs="Calibri"/>
+                <w:color w:val="000000"/>
+                <w:sz w:val="22"/>
+                <w:szCs w:val="22"/>
+              </w:rPr>
+              <w:t xml:space="preserve">; </w:t>
+            </w:r>
+            <w:proofErr w:type="spellStart"/>
+            <w:r>
+              <w:rPr>
+                <w:rFonts w:ascii="Calibri" w:eastAsia="Times New Roman" w:hAnsi="Calibri" w:cs="Calibri"/>
+                <w:color w:val="000000"/>
+                <w:sz w:val="22"/>
+                <w:szCs w:val="22"/>
+              </w:rPr>
+              <w:t>excludeSwitches</w:t>
+            </w:r>
+            <w:proofErr w:type="spellEnd"/>
+            <w:r>
+              <w:rPr>
+                <w:rFonts w:ascii="Calibri" w:eastAsia="Times New Roman" w:hAnsi="Calibri" w:cs="Calibri"/>
+                <w:color w:val="000000"/>
+                <w:sz w:val="22"/>
+                <w:szCs w:val="22"/>
+              </w:rPr>
+              <w:t xml:space="preserve">: enable-automation; </w:t>
+            </w:r>
+            <w:proofErr w:type="spellStart"/>
+            <w:r>
+              <w:rPr>
+                <w:rFonts w:ascii="Calibri" w:eastAsia="Times New Roman" w:hAnsi="Calibri" w:cs="Calibri"/>
+                <w:color w:val="000000"/>
+                <w:sz w:val="22"/>
+                <w:szCs w:val="22"/>
+              </w:rPr>
+              <w:t>useAutomationExtension</w:t>
+            </w:r>
+            <w:proofErr w:type="spellEnd"/>
+            <w:r>
+              <w:rPr>
+                <w:rFonts w:ascii="Calibri" w:eastAsia="Times New Roman" w:hAnsi="Calibri" w:cs="Calibri"/>
+                <w:color w:val="000000"/>
+                <w:sz w:val="22"/>
+                <w:szCs w:val="22"/>
+              </w:rPr>
+              <w:t>: false</w:t>
             </w:r>
           </w:p>
         </w:tc>
@@ -7784,14 +9465,25 @@
                 <w:szCs w:val="22"/>
               </w:rPr>
             </w:pPr>
-            <w:r>
-              <w:rPr>
-                <w:rFonts w:ascii="Calibri" w:eastAsia="Times New Roman" w:hAnsi="Calibri" w:cs="Calibri"/>
-                <w:color w:val="000000"/>
-                <w:sz w:val="22"/>
-                <w:szCs w:val="22"/>
-              </w:rPr>
-              <w:t>SignupPageTest navigates to login.gog.com/login where the Create Account link is accessible</w:t>
+            <w:proofErr w:type="spellStart"/>
+            <w:r>
+              <w:rPr>
+                <w:rFonts w:ascii="Calibri" w:eastAsia="Times New Roman" w:hAnsi="Calibri" w:cs="Calibri"/>
+                <w:color w:val="000000"/>
+                <w:sz w:val="22"/>
+                <w:szCs w:val="22"/>
+              </w:rPr>
+              <w:t>SignupPageTest</w:t>
+            </w:r>
+            <w:proofErr w:type="spellEnd"/>
+            <w:r>
+              <w:rPr>
+                <w:rFonts w:ascii="Calibri" w:eastAsia="Times New Roman" w:hAnsi="Calibri" w:cs="Calibri"/>
+                <w:color w:val="000000"/>
+                <w:sz w:val="22"/>
+                <w:szCs w:val="22"/>
+              </w:rPr>
+              <w:t xml:space="preserve"> navigates to login.gog.com/login where the Create Account link is accessible</w:t>
             </w:r>
           </w:p>
         </w:tc>
@@ -7835,7 +9527,27 @@
                 <w:sz w:val="22"/>
                 <w:szCs w:val="22"/>
               </w:rPr>
-              <w:t>UTF-8 BOM in source files causing javac errors</w:t>
+              <w:t xml:space="preserve">UTF-8 BOM in source files causing </w:t>
+            </w:r>
+            <w:proofErr w:type="spellStart"/>
+            <w:r>
+              <w:rPr>
+                <w:rFonts w:ascii="Calibri" w:eastAsia="Times New Roman" w:hAnsi="Calibri" w:cs="Calibri"/>
+                <w:color w:val="000000"/>
+                <w:sz w:val="22"/>
+                <w:szCs w:val="22"/>
+              </w:rPr>
+              <w:t>javac</w:t>
+            </w:r>
+            <w:proofErr w:type="spellEnd"/>
+            <w:r>
+              <w:rPr>
+                <w:rFonts w:ascii="Calibri" w:eastAsia="Times New Roman" w:hAnsi="Calibri" w:cs="Calibri"/>
+                <w:color w:val="000000"/>
+                <w:sz w:val="22"/>
+                <w:szCs w:val="22"/>
+              </w:rPr>
+              <w:t xml:space="preserve"> errors</w:t>
             </w:r>
           </w:p>
         </w:tc>
@@ -7917,12 +9629,37 @@
           <w:color w:val="000000"/>
         </w:rPr>
       </w:pPr>
+      <w:proofErr w:type="spellStart"/>
       <w:r>
         <w:rPr>
           <w:rFonts w:ascii="Consolas" w:hAnsi="Consolas"/>
           <w:color w:val="000000"/>
         </w:rPr>
-        <w:t>src/test/java/com/gog/</w:t>
+        <w:t>src</w:t>
+      </w:r>
+      <w:proofErr w:type="spellEnd"/>
+      <w:r>
+        <w:rPr>
+          <w:rFonts w:ascii="Consolas" w:hAnsi="Consolas"/>
+          <w:color w:val="000000"/>
+        </w:rPr>
+        <w:t>/test/java/com/</w:t>
+      </w:r>
+      <w:proofErr w:type="spellStart"/>
+      <w:r>
+        <w:rPr>
+          <w:rFonts w:ascii="Consolas" w:hAnsi="Consolas"/>
+          <w:color w:val="000000"/>
+        </w:rPr>
+        <w:t>gog</w:t>
+      </w:r>
+      <w:proofErr w:type="spellEnd"/>
+      <w:r>
+        <w:rPr>
+          <w:rFonts w:ascii="Consolas" w:hAnsi="Consolas"/>
+          <w:color w:val="000000"/>
+        </w:rPr>
+        <w:t>/</w:t>
       </w:r>
     </w:p>
     <w:p>
@@ -7958,7 +9695,48 @@
           <w:rFonts w:ascii="Consolas" w:hAnsi="Consolas"/>
           <w:color w:val="000000"/>
         </w:rPr>
-        <w:t>│   ├── BaseTest.java          (ChromeDriver setup/teardown, 20s WebDriverWait)</w:t>
+        <w:t xml:space="preserve">│   ├── BaseTest.java       </w:t>
+      </w:r>
+      <w:proofErr w:type="gramStart"/>
+      <w:r>
+        <w:rPr>
+          <w:rFonts w:ascii="Consolas" w:hAnsi="Consolas"/>
+          <w:color w:val="000000"/>
+        </w:rPr>
+        <w:t xml:space="preserve">   (</w:t>
+      </w:r>
+      <w:proofErr w:type="spellStart"/>
+      <w:proofErr w:type="gramEnd"/>
+      <w:r>
+        <w:rPr>
+          <w:rFonts w:ascii="Consolas" w:hAnsi="Consolas"/>
+          <w:color w:val="000000"/>
+        </w:rPr>
+        <w:t>ChromeDriver</w:t>
+      </w:r>
+      <w:proofErr w:type="spellEnd"/>
+      <w:r>
+        <w:rPr>
+          <w:rFonts w:ascii="Consolas" w:hAnsi="Consolas"/>
+          <w:color w:val="000000"/>
+        </w:rPr>
+        <w:t xml:space="preserve"> setup/teardown, 20s </w:t>
+      </w:r>
+      <w:proofErr w:type="spellStart"/>
+      <w:r>
+        <w:rPr>
+          <w:rFonts w:ascii="Consolas" w:hAnsi="Consolas"/>
+          <w:color w:val="000000"/>
+        </w:rPr>
+        <w:t>WebDriverWait</w:t>
+      </w:r>
+      <w:proofErr w:type="spellEnd"/>
+      <w:r>
+        <w:rPr>
+          <w:rFonts w:ascii="Consolas" w:hAnsi="Consolas"/>
+          <w:color w:val="000000"/>
+        </w:rPr>
+        <w:t>)</w:t>
       </w:r>
     </w:p>
     <w:p>
@@ -7976,7 +9754,23 @@
           <w:rFonts w:ascii="Consolas" w:hAnsi="Consolas"/>
           <w:color w:val="000000"/>
         </w:rPr>
-        <w:t>│   └── AuthenticatedTest.java (extends BaseTest, performs login before tests)</w:t>
+        <w:t xml:space="preserve">│   └── AuthenticatedTest.java (extends </w:t>
+      </w:r>
+      <w:proofErr w:type="spellStart"/>
+      <w:r>
+        <w:rPr>
+          <w:rFonts w:ascii="Consolas" w:hAnsi="Consolas"/>
+          <w:color w:val="000000"/>
+        </w:rPr>
+        <w:t>BaseTest</w:t>
+      </w:r>
+      <w:proofErr w:type="spellEnd"/>
+      <w:r>
+        <w:rPr>
+          <w:rFonts w:ascii="Consolas" w:hAnsi="Consolas"/>
+          <w:color w:val="000000"/>
+        </w:rPr>
+        <w:t>, performs login before tests)</w:t>
       </w:r>
     </w:p>
     <w:p>
@@ -8066,6 +9860,7 @@
           <w:rFonts w:ascii="Consolas" w:hAnsi="Consolas"/>
           <w:color w:val="000000"/>
         </w:rPr>
+        <w:lastRenderedPageBreak/>
         <w:t>│   ├── SearchTest.java</w:t>
       </w:r>
     </w:p>
@@ -8156,7 +9951,6 @@
           <w:rFonts w:ascii="Consolas" w:hAnsi="Consolas"/>
           <w:color w:val="000000"/>
         </w:rPr>
-        <w:lastRenderedPageBreak/>
         <w:t>└── utils/</w:t>
       </w:r>
     </w:p>
@@ -8175,7 +9969,80 @@
           <w:rFonts w:ascii="Consolas" w:hAnsi="Consolas"/>
           <w:color w:val="000000"/>
         </w:rPr>
-        <w:t xml:space="preserve">    └── TestUtils.java         (dismissCookieConsent, performLogin, waitForPageLoad, isElementPresent, pause)</w:t>
+        <w:t xml:space="preserve">    └── TestUtils.java      </w:t>
+      </w:r>
+      <w:proofErr w:type="gramStart"/>
+      <w:r>
+        <w:rPr>
+          <w:rFonts w:ascii="Consolas" w:hAnsi="Consolas"/>
+          <w:color w:val="000000"/>
+        </w:rPr>
+        <w:t xml:space="preserve">   (</w:t>
+      </w:r>
+      <w:proofErr w:type="spellStart"/>
+      <w:proofErr w:type="gramEnd"/>
+      <w:r>
+        <w:rPr>
+          <w:rFonts w:ascii="Consolas" w:hAnsi="Consolas"/>
+          <w:color w:val="000000"/>
+        </w:rPr>
+        <w:t>dismissCookieConsent</w:t>
+      </w:r>
+      <w:proofErr w:type="spellEnd"/>
+      <w:r>
+        <w:rPr>
+          <w:rFonts w:ascii="Consolas" w:hAnsi="Consolas"/>
+          <w:color w:val="000000"/>
+        </w:rPr>
+        <w:t xml:space="preserve">, </w:t>
+      </w:r>
+      <w:proofErr w:type="spellStart"/>
+      <w:r>
+        <w:rPr>
+          <w:rFonts w:ascii="Consolas" w:hAnsi="Consolas"/>
+          <w:color w:val="000000"/>
+        </w:rPr>
+        <w:t>performLogin</w:t>
+      </w:r>
+      <w:proofErr w:type="spellEnd"/>
+      <w:r>
+        <w:rPr>
+          <w:rFonts w:ascii="Consolas" w:hAnsi="Consolas"/>
+          <w:color w:val="000000"/>
+        </w:rPr>
+        <w:t xml:space="preserve">, </w:t>
+      </w:r>
+      <w:proofErr w:type="spellStart"/>
+      <w:r>
+        <w:rPr>
+          <w:rFonts w:ascii="Consolas" w:hAnsi="Consolas"/>
+          <w:color w:val="000000"/>
+        </w:rPr>
+        <w:t>waitForPageLoad</w:t>
+      </w:r>
+      <w:proofErr w:type="spellEnd"/>
+      <w:r>
+        <w:rPr>
+          <w:rFonts w:ascii="Consolas" w:hAnsi="Consolas"/>
+          <w:color w:val="000000"/>
+        </w:rPr>
+        <w:t xml:space="preserve">, </w:t>
+      </w:r>
+      <w:proofErr w:type="spellStart"/>
+      <w:r>
+        <w:rPr>
+          <w:rFonts w:ascii="Consolas" w:hAnsi="Consolas"/>
+          <w:color w:val="000000"/>
+        </w:rPr>
+        <w:t>isElementPresent</w:t>
+      </w:r>
+      <w:proofErr w:type="spellEnd"/>
+      <w:r>
+        <w:rPr>
+          <w:rFonts w:ascii="Consolas" w:hAnsi="Consolas"/>
+          <w:color w:val="000000"/>
+        </w:rPr>
+        <w:t>, pause)</w:t>
       </w:r>
     </w:p>
     <w:p>
@@ -8204,7 +10071,23 @@
           <w:rFonts w:ascii="Consolas" w:hAnsi="Consolas"/>
           <w:color w:val="000000"/>
         </w:rPr>
-        <w:t>testng.xml                     (full suite integration – 8 test nodes, parallel=none)</w:t>
+        <w:t xml:space="preserve">testng.xml                  </w:t>
+      </w:r>
+      <w:proofErr w:type="gramStart"/>
+      <w:r>
+        <w:rPr>
+          <w:rFonts w:ascii="Consolas" w:hAnsi="Consolas"/>
+          <w:color w:val="000000"/>
+        </w:rPr>
+        <w:t xml:space="preserve">   (</w:t>
+      </w:r>
+      <w:proofErr w:type="gramEnd"/>
+      <w:r>
+        <w:rPr>
+          <w:rFonts w:ascii="Consolas" w:hAnsi="Consolas"/>
+          <w:color w:val="000000"/>
+        </w:rPr>
+        <w:t>full suite integration – 8 test nodes, parallel=none)</w:t>
       </w:r>
     </w:p>
     <w:p>
@@ -8222,7 +10105,23 @@
           <w:rFonts w:ascii="Consolas" w:hAnsi="Consolas"/>
           <w:color w:val="000000"/>
         </w:rPr>
-        <w:t>pom.xml                        (Maven build, Selenium 4.18.1, TestNG 7.9.0, Surefire 3.2.5)</w:t>
+        <w:t xml:space="preserve">pom.xml                     </w:t>
+      </w:r>
+      <w:proofErr w:type="gramStart"/>
+      <w:r>
+        <w:rPr>
+          <w:rFonts w:ascii="Consolas" w:hAnsi="Consolas"/>
+          <w:color w:val="000000"/>
+        </w:rPr>
+        <w:t xml:space="preserve">   (</w:t>
+      </w:r>
+      <w:proofErr w:type="gramEnd"/>
+      <w:r>
+        <w:rPr>
+          <w:rFonts w:ascii="Consolas" w:hAnsi="Consolas"/>
+          <w:color w:val="000000"/>
+        </w:rPr>
+        <w:t>Maven build, Selenium 4.18.1, TestNG 7.9.0, Surefire 3.2.5)</w:t>
       </w:r>
     </w:p>
     <w:p>
@@ -8354,13 +10253,23 @@
           <w:lang w:val="fr-FR"/>
         </w:rPr>
       </w:pPr>
+      <w:proofErr w:type="spellStart"/>
       <w:r>
         <w:rPr>
           <w:rFonts w:ascii="Calibri" w:eastAsia="Times New Roman" w:hAnsi="Calibri" w:cs="Calibri"/>
           <w:color w:val="000000"/>
           <w:lang w:val="fr-FR"/>
         </w:rPr>
-        <w:t xml:space="preserve">TestNG Documentation – </w:t>
+        <w:t>TestNG</w:t>
+      </w:r>
+      <w:proofErr w:type="spellEnd"/>
+      <w:r>
+        <w:rPr>
+          <w:rFonts w:ascii="Calibri" w:eastAsia="Times New Roman" w:hAnsi="Calibri" w:cs="Calibri"/>
+          <w:color w:val="000000"/>
+          <w:lang w:val="fr-FR"/>
+        </w:rPr>
+        <w:t xml:space="preserve"> Documentation – </w:t>
       </w:r>
       <w:hyperlink r:id="rId8" w:history="1">
         <w:r>
@@ -8386,12 +10295,37 @@
           <w:color w:val="000000"/>
         </w:rPr>
       </w:pPr>
-      <w:r>
-        <w:rPr>
-          <w:rFonts w:ascii="Calibri" w:eastAsia="Times New Roman" w:hAnsi="Calibri" w:cs="Calibri"/>
-          <w:color w:val="000000"/>
-        </w:rPr>
-        <w:t xml:space="preserve">WebDriverManager (bonigarcia) – </w:t>
+      <w:proofErr w:type="spellStart"/>
+      <w:r>
+        <w:rPr>
+          <w:rFonts w:ascii="Calibri" w:eastAsia="Times New Roman" w:hAnsi="Calibri" w:cs="Calibri"/>
+          <w:color w:val="000000"/>
+        </w:rPr>
+        <w:t>WebDriverManager</w:t>
+      </w:r>
+      <w:proofErr w:type="spellEnd"/>
+      <w:r>
+        <w:rPr>
+          <w:rFonts w:ascii="Calibri" w:eastAsia="Times New Roman" w:hAnsi="Calibri" w:cs="Calibri"/>
+          <w:color w:val="000000"/>
+        </w:rPr>
+        <w:t xml:space="preserve"> (</w:t>
+      </w:r>
+      <w:proofErr w:type="spellStart"/>
+      <w:r>
+        <w:rPr>
+          <w:rFonts w:ascii="Calibri" w:eastAsia="Times New Roman" w:hAnsi="Calibri" w:cs="Calibri"/>
+          <w:color w:val="000000"/>
+        </w:rPr>
+        <w:t>bonigarcia</w:t>
+      </w:r>
+      <w:proofErr w:type="spellEnd"/>
+      <w:r>
+        <w:rPr>
+          <w:rFonts w:ascii="Calibri" w:eastAsia="Times New Roman" w:hAnsi="Calibri" w:cs="Calibri"/>
+          <w:color w:val="000000"/>
+        </w:rPr>
+        <w:t xml:space="preserve">) – </w:t>
       </w:r>
       <w:hyperlink r:id="rId9" w:history="1">
         <w:r>
@@ -8628,6 +10562,119 @@
     </w:lvl>
   </w:abstractNum>
   <w:abstractNum w:abstractNumId="1" w15:restartNumberingAfterBreak="0">
+    <w:nsid w:val="070D3039"/>
+    <w:multiLevelType w:val="hybridMultilevel"/>
+    <w:tmpl w:val="649668A2"/>
+    <w:lvl w:ilvl="0" w:tplc="04090001">
+      <w:start w:val="1"/>
+      <w:numFmt w:val="bullet"/>
+      <w:lvlText w:val=""/>
+      <w:lvlJc w:val="left"/>
+      <w:pPr>
+        <w:ind w:left="720" w:hanging="360"/>
+      </w:pPr>
+      <w:rPr>
+        <w:rFonts w:ascii="Symbol" w:hAnsi="Symbol" w:hint="default"/>
+      </w:rPr>
+    </w:lvl>
+    <w:lvl w:ilvl="1" w:tplc="04090003" w:tentative="1">
+      <w:start w:val="1"/>
+      <w:numFmt w:val="bullet"/>
+      <w:lvlText w:val="o"/>
+      <w:lvlJc w:val="left"/>
+      <w:pPr>
+        <w:ind w:left="1440" w:hanging="360"/>
+      </w:pPr>
+      <w:rPr>
+        <w:rFonts w:ascii="Courier New" w:hAnsi="Courier New" w:cs="Courier New" w:hint="default"/>
+      </w:rPr>
+    </w:lvl>
+    <w:lvl w:ilvl="2" w:tplc="04090005">
+      <w:start w:val="1"/>
+      <w:numFmt w:val="bullet"/>
+      <w:lvlText w:val=""/>
+      <w:lvlJc w:val="left"/>
+      <w:pPr>
+        <w:ind w:left="2160" w:hanging="360"/>
+      </w:pPr>
+      <w:rPr>
+        <w:rFonts w:ascii="Wingdings" w:hAnsi="Wingdings" w:hint="default"/>
+      </w:rPr>
+    </w:lvl>
+    <w:lvl w:ilvl="3" w:tplc="04090001" w:tentative="1">
+      <w:start w:val="1"/>
+      <w:numFmt w:val="bullet"/>
+      <w:lvlText w:val=""/>
+      <w:lvlJc w:val="left"/>
+      <w:pPr>
+        <w:ind w:left="2880" w:hanging="360"/>
+      </w:pPr>
+      <w:rPr>
+        <w:rFonts w:ascii="Symbol" w:hAnsi="Symbol" w:hint="default"/>
+      </w:rPr>
+    </w:lvl>
+    <w:lvl w:ilvl="4" w:tplc="04090003" w:tentative="1">
+      <w:start w:val="1"/>
+      <w:numFmt w:val="bullet"/>
+      <w:lvlText w:val="o"/>
+      <w:lvlJc w:val="left"/>
+      <w:pPr>
+        <w:ind w:left="3600" w:hanging="360"/>
+      </w:pPr>
+      <w:rPr>
+        <w:rFonts w:ascii="Courier New" w:hAnsi="Courier New" w:cs="Courier New" w:hint="default"/>
+      </w:rPr>
+    </w:lvl>
+    <w:lvl w:ilvl="5" w:tplc="04090005" w:tentative="1">
+      <w:start w:val="1"/>
+      <w:numFmt w:val="bullet"/>
+      <w:lvlText w:val=""/>
+      <w:lvlJc w:val="left"/>
+      <w:pPr>
+        <w:ind w:left="4320" w:hanging="360"/>
+      </w:pPr>
+      <w:rPr>
+        <w:rFonts w:ascii="Wingdings" w:hAnsi="Wingdings" w:hint="default"/>
+      </w:rPr>
+    </w:lvl>
+    <w:lvl w:ilvl="6" w:tplc="04090001" w:tentative="1">
+      <w:start w:val="1"/>
+      <w:numFmt w:val="bullet"/>
+      <w:lvlText w:val=""/>
+      <w:lvlJc w:val="left"/>
+      <w:pPr>
+        <w:ind w:left="5040" w:hanging="360"/>
+      </w:pPr>
+      <w:rPr>
+        <w:rFonts w:ascii="Symbol" w:hAnsi="Symbol" w:hint="default"/>
+      </w:rPr>
+    </w:lvl>
+    <w:lvl w:ilvl="7" w:tplc="04090003" w:tentative="1">
+      <w:start w:val="1"/>
+      <w:numFmt w:val="bullet"/>
+      <w:lvlText w:val="o"/>
+      <w:lvlJc w:val="left"/>
+      <w:pPr>
+        <w:ind w:left="5760" w:hanging="360"/>
+      </w:pPr>
+      <w:rPr>
+        <w:rFonts w:ascii="Courier New" w:hAnsi="Courier New" w:cs="Courier New" w:hint="default"/>
+      </w:rPr>
+    </w:lvl>
+    <w:lvl w:ilvl="8" w:tplc="04090005" w:tentative="1">
+      <w:start w:val="1"/>
+      <w:numFmt w:val="bullet"/>
+      <w:lvlText w:val=""/>
+      <w:lvlJc w:val="left"/>
+      <w:pPr>
+        <w:ind w:left="6480" w:hanging="360"/>
+      </w:pPr>
+      <w:rPr>
+        <w:rFonts w:ascii="Wingdings" w:hAnsi="Wingdings" w:hint="default"/>
+      </w:rPr>
+    </w:lvl>
+  </w:abstractNum>
+  <w:abstractNum w:abstractNumId="2" w15:restartNumberingAfterBreak="0">
     <w:nsid w:val="0C210A42"/>
     <w:multiLevelType w:val="multilevel"/>
     <w:tmpl w:val="90F8F146"/>
@@ -8776,7 +10823,7 @@
       </w:rPr>
     </w:lvl>
   </w:abstractNum>
-  <w:abstractNum w:abstractNumId="2" w15:restartNumberingAfterBreak="0">
+  <w:abstractNum w:abstractNumId="3" w15:restartNumberingAfterBreak="0">
     <w:nsid w:val="12836F91"/>
     <w:multiLevelType w:val="multilevel"/>
     <w:tmpl w:val="C2CED6A8"/>
@@ -8925,7 +10972,147 @@
       </w:rPr>
     </w:lvl>
   </w:abstractNum>
-  <w:abstractNum w:abstractNumId="3" w15:restartNumberingAfterBreak="0">
+  <w:abstractNum w:abstractNumId="4" w15:restartNumberingAfterBreak="0">
+    <w:nsid w:val="17967934"/>
+    <w:multiLevelType w:val="hybridMultilevel"/>
+    <w:tmpl w:val="3A5E9070"/>
+    <w:lvl w:ilvl="0" w:tplc="A6F22E7E">
+      <w:start w:val="1"/>
+      <w:numFmt w:val="bullet"/>
+      <w:lvlText w:val=""/>
+      <w:lvlJc w:val="left"/>
+      <w:pPr>
+        <w:tabs>
+          <w:tab w:val="num" w:pos="720"/>
+        </w:tabs>
+        <w:ind w:left="720" w:hanging="360"/>
+      </w:pPr>
+      <w:rPr>
+        <w:rFonts w:ascii="Wingdings" w:hAnsi="Wingdings" w:hint="default"/>
+      </w:rPr>
+    </w:lvl>
+    <w:lvl w:ilvl="1" w:tplc="E4FE8A8C" w:tentative="1">
+      <w:start w:val="1"/>
+      <w:numFmt w:val="bullet"/>
+      <w:lvlText w:val=""/>
+      <w:lvlJc w:val="left"/>
+      <w:pPr>
+        <w:tabs>
+          <w:tab w:val="num" w:pos="1440"/>
+        </w:tabs>
+        <w:ind w:left="1440" w:hanging="360"/>
+      </w:pPr>
+      <w:rPr>
+        <w:rFonts w:ascii="Wingdings" w:hAnsi="Wingdings" w:hint="default"/>
+      </w:rPr>
+    </w:lvl>
+    <w:lvl w:ilvl="2" w:tplc="8C0E9D56">
+      <w:start w:val="1"/>
+      <w:numFmt w:val="bullet"/>
+      <w:lvlText w:val=""/>
+      <w:lvlJc w:val="left"/>
+      <w:pPr>
+        <w:tabs>
+          <w:tab w:val="num" w:pos="2160"/>
+        </w:tabs>
+        <w:ind w:left="2160" w:hanging="360"/>
+      </w:pPr>
+      <w:rPr>
+        <w:rFonts w:ascii="Wingdings" w:hAnsi="Wingdings" w:hint="default"/>
+      </w:rPr>
+    </w:lvl>
+    <w:lvl w:ilvl="3" w:tplc="6CDA470A" w:tentative="1">
+      <w:start w:val="1"/>
+      <w:numFmt w:val="bullet"/>
+      <w:lvlText w:val=""/>
+      <w:lvlJc w:val="left"/>
+      <w:pPr>
+        <w:tabs>
+          <w:tab w:val="num" w:pos="2880"/>
+        </w:tabs>
+        <w:ind w:left="2880" w:hanging="360"/>
+      </w:pPr>
+      <w:rPr>
+        <w:rFonts w:ascii="Wingdings" w:hAnsi="Wingdings" w:hint="default"/>
+      </w:rPr>
+    </w:lvl>
+    <w:lvl w:ilvl="4" w:tplc="D59C7168" w:tentative="1">
+      <w:start w:val="1"/>
+      <w:numFmt w:val="bullet"/>
+      <w:lvlText w:val=""/>
+      <w:lvlJc w:val="left"/>
+      <w:pPr>
+        <w:tabs>
+          <w:tab w:val="num" w:pos="3600"/>
+        </w:tabs>
+        <w:ind w:left="3600" w:hanging="360"/>
+      </w:pPr>
+      <w:rPr>
+        <w:rFonts w:ascii="Wingdings" w:hAnsi="Wingdings" w:hint="default"/>
+      </w:rPr>
+    </w:lvl>
+    <w:lvl w:ilvl="5" w:tplc="0BCA8004" w:tentative="1">
+      <w:start w:val="1"/>
+      <w:numFmt w:val="bullet"/>
+      <w:lvlText w:val=""/>
+      <w:lvlJc w:val="left"/>
+      <w:pPr>
+        <w:tabs>
+          <w:tab w:val="num" w:pos="4320"/>
+        </w:tabs>
+        <w:ind w:left="4320" w:hanging="360"/>
+      </w:pPr>
+      <w:rPr>
+        <w:rFonts w:ascii="Wingdings" w:hAnsi="Wingdings" w:hint="default"/>
+      </w:rPr>
+    </w:lvl>
+    <w:lvl w:ilvl="6" w:tplc="BB2C21C0" w:tentative="1">
+      <w:start w:val="1"/>
+      <w:numFmt w:val="bullet"/>
+      <w:lvlText w:val=""/>
+      <w:lvlJc w:val="left"/>
+      <w:pPr>
+        <w:tabs>
+          <w:tab w:val="num" w:pos="5040"/>
+        </w:tabs>
+        <w:ind w:left="5040" w:hanging="360"/>
+      </w:pPr>
+      <w:rPr>
+        <w:rFonts w:ascii="Wingdings" w:hAnsi="Wingdings" w:hint="default"/>
+      </w:rPr>
+    </w:lvl>
+    <w:lvl w:ilvl="7" w:tplc="468E01F4" w:tentative="1">
+      <w:start w:val="1"/>
+      <w:numFmt w:val="bullet"/>
+      <w:lvlText w:val=""/>
+      <w:lvlJc w:val="left"/>
+      <w:pPr>
+        <w:tabs>
+          <w:tab w:val="num" w:pos="5760"/>
+        </w:tabs>
+        <w:ind w:left="5760" w:hanging="360"/>
+      </w:pPr>
+      <w:rPr>
+        <w:rFonts w:ascii="Wingdings" w:hAnsi="Wingdings" w:hint="default"/>
+      </w:rPr>
+    </w:lvl>
+    <w:lvl w:ilvl="8" w:tplc="3F8E8900" w:tentative="1">
+      <w:start w:val="1"/>
+      <w:numFmt w:val="bullet"/>
+      <w:lvlText w:val=""/>
+      <w:lvlJc w:val="left"/>
+      <w:pPr>
+        <w:tabs>
+          <w:tab w:val="num" w:pos="6480"/>
+        </w:tabs>
+        <w:ind w:left="6480" w:hanging="360"/>
+      </w:pPr>
+      <w:rPr>
+        <w:rFonts w:ascii="Wingdings" w:hAnsi="Wingdings" w:hint="default"/>
+      </w:rPr>
+    </w:lvl>
+  </w:abstractNum>
+  <w:abstractNum w:abstractNumId="5" w15:restartNumberingAfterBreak="0">
     <w:nsid w:val="1DCA75AC"/>
     <w:multiLevelType w:val="multilevel"/>
     <w:tmpl w:val="3392D482"/>
@@ -9074,7 +11261,7 @@
       </w:rPr>
     </w:lvl>
   </w:abstractNum>
-  <w:abstractNum w:abstractNumId="4" w15:restartNumberingAfterBreak="0">
+  <w:abstractNum w:abstractNumId="6" w15:restartNumberingAfterBreak="0">
     <w:nsid w:val="1DDC39D5"/>
     <w:multiLevelType w:val="multilevel"/>
     <w:tmpl w:val="10F87E58"/>
@@ -9223,7 +11410,7 @@
       </w:rPr>
     </w:lvl>
   </w:abstractNum>
-  <w:abstractNum w:abstractNumId="5" w15:restartNumberingAfterBreak="0">
+  <w:abstractNum w:abstractNumId="7" w15:restartNumberingAfterBreak="0">
     <w:nsid w:val="1F0245A2"/>
     <w:multiLevelType w:val="multilevel"/>
     <w:tmpl w:val="3D58B952"/>
@@ -9372,7 +11559,7 @@
       </w:rPr>
     </w:lvl>
   </w:abstractNum>
-  <w:abstractNum w:abstractNumId="6" w15:restartNumberingAfterBreak="0">
+  <w:abstractNum w:abstractNumId="8" w15:restartNumberingAfterBreak="0">
     <w:nsid w:val="2AC468A6"/>
     <w:multiLevelType w:val="multilevel"/>
     <w:tmpl w:val="0AF84B24"/>
@@ -9521,7 +11708,7 @@
       </w:rPr>
     </w:lvl>
   </w:abstractNum>
-  <w:abstractNum w:abstractNumId="7" w15:restartNumberingAfterBreak="0">
+  <w:abstractNum w:abstractNumId="9" w15:restartNumberingAfterBreak="0">
     <w:nsid w:val="36AB0F9C"/>
     <w:multiLevelType w:val="multilevel"/>
     <w:tmpl w:val="14AA427C"/>
@@ -9670,7 +11857,7 @@
       </w:rPr>
     </w:lvl>
   </w:abstractNum>
-  <w:abstractNum w:abstractNumId="8" w15:restartNumberingAfterBreak="0">
+  <w:abstractNum w:abstractNumId="10" w15:restartNumberingAfterBreak="0">
     <w:nsid w:val="3B7C3901"/>
     <w:multiLevelType w:val="multilevel"/>
     <w:tmpl w:val="23BC45A4"/>
@@ -9819,7 +12006,120 @@
       </w:rPr>
     </w:lvl>
   </w:abstractNum>
-  <w:abstractNum w:abstractNumId="9" w15:restartNumberingAfterBreak="0">
+  <w:abstractNum w:abstractNumId="11" w15:restartNumberingAfterBreak="0">
+    <w:nsid w:val="40FE047E"/>
+    <w:multiLevelType w:val="hybridMultilevel"/>
+    <w:tmpl w:val="E67A95D8"/>
+    <w:lvl w:ilvl="0" w:tplc="04090001">
+      <w:start w:val="1"/>
+      <w:numFmt w:val="bullet"/>
+      <w:lvlText w:val=""/>
+      <w:lvlJc w:val="left"/>
+      <w:pPr>
+        <w:ind w:left="3660" w:hanging="360"/>
+      </w:pPr>
+      <w:rPr>
+        <w:rFonts w:ascii="Symbol" w:hAnsi="Symbol" w:hint="default"/>
+      </w:rPr>
+    </w:lvl>
+    <w:lvl w:ilvl="1" w:tplc="04090003" w:tentative="1">
+      <w:start w:val="1"/>
+      <w:numFmt w:val="bullet"/>
+      <w:lvlText w:val="o"/>
+      <w:lvlJc w:val="left"/>
+      <w:pPr>
+        <w:ind w:left="4380" w:hanging="360"/>
+      </w:pPr>
+      <w:rPr>
+        <w:rFonts w:ascii="Courier New" w:hAnsi="Courier New" w:cs="Courier New" w:hint="default"/>
+      </w:rPr>
+    </w:lvl>
+    <w:lvl w:ilvl="2" w:tplc="04090005" w:tentative="1">
+      <w:start w:val="1"/>
+      <w:numFmt w:val="bullet"/>
+      <w:lvlText w:val=""/>
+      <w:lvlJc w:val="left"/>
+      <w:pPr>
+        <w:ind w:left="5100" w:hanging="360"/>
+      </w:pPr>
+      <w:rPr>
+        <w:rFonts w:ascii="Wingdings" w:hAnsi="Wingdings" w:hint="default"/>
+      </w:rPr>
+    </w:lvl>
+    <w:lvl w:ilvl="3" w:tplc="04090001" w:tentative="1">
+      <w:start w:val="1"/>
+      <w:numFmt w:val="bullet"/>
+      <w:lvlText w:val=""/>
+      <w:lvlJc w:val="left"/>
+      <w:pPr>
+        <w:ind w:left="5820" w:hanging="360"/>
+      </w:pPr>
+      <w:rPr>
+        <w:rFonts w:ascii="Symbol" w:hAnsi="Symbol" w:hint="default"/>
+      </w:rPr>
+    </w:lvl>
+    <w:lvl w:ilvl="4" w:tplc="04090003" w:tentative="1">
+      <w:start w:val="1"/>
+      <w:numFmt w:val="bullet"/>
+      <w:lvlText w:val="o"/>
+      <w:lvlJc w:val="left"/>
+      <w:pPr>
+        <w:ind w:left="6540" w:hanging="360"/>
+      </w:pPr>
+      <w:rPr>
+        <w:rFonts w:ascii="Courier New" w:hAnsi="Courier New" w:cs="Courier New" w:hint="default"/>
+      </w:rPr>
+    </w:lvl>
+    <w:lvl w:ilvl="5" w:tplc="04090005" w:tentative="1">
+      <w:start w:val="1"/>
+      <w:numFmt w:val="bullet"/>
+      <w:lvlText w:val=""/>
+      <w:lvlJc w:val="left"/>
+      <w:pPr>
+        <w:ind w:left="7260" w:hanging="360"/>
+      </w:pPr>
+      <w:rPr>
+        <w:rFonts w:ascii="Wingdings" w:hAnsi="Wingdings" w:hint="default"/>
+      </w:rPr>
+    </w:lvl>
+    <w:lvl w:ilvl="6" w:tplc="04090001" w:tentative="1">
+      <w:start w:val="1"/>
+      <w:numFmt w:val="bullet"/>
+      <w:lvlText w:val=""/>
+      <w:lvlJc w:val="left"/>
+      <w:pPr>
+        <w:ind w:left="7980" w:hanging="360"/>
+      </w:pPr>
+      <w:rPr>
+        <w:rFonts w:ascii="Symbol" w:hAnsi="Symbol" w:hint="default"/>
+      </w:rPr>
+    </w:lvl>
+    <w:lvl w:ilvl="7" w:tplc="04090003" w:tentative="1">
+      <w:start w:val="1"/>
+      <w:numFmt w:val="bullet"/>
+      <w:lvlText w:val="o"/>
+      <w:lvlJc w:val="left"/>
+      <w:pPr>
+        <w:ind w:left="8700" w:hanging="360"/>
+      </w:pPr>
+      <w:rPr>
+        <w:rFonts w:ascii="Courier New" w:hAnsi="Courier New" w:cs="Courier New" w:hint="default"/>
+      </w:rPr>
+    </w:lvl>
+    <w:lvl w:ilvl="8" w:tplc="04090005" w:tentative="1">
+      <w:start w:val="1"/>
+      <w:numFmt w:val="bullet"/>
+      <w:lvlText w:val=""/>
+      <w:lvlJc w:val="left"/>
+      <w:pPr>
+        <w:ind w:left="9420" w:hanging="360"/>
+      </w:pPr>
+      <w:rPr>
+        <w:rFonts w:ascii="Wingdings" w:hAnsi="Wingdings" w:hint="default"/>
+      </w:rPr>
+    </w:lvl>
+  </w:abstractNum>
+  <w:abstractNum w:abstractNumId="12" w15:restartNumberingAfterBreak="0">
     <w:nsid w:val="4C8E3774"/>
     <w:multiLevelType w:val="multilevel"/>
     <w:tmpl w:val="2B12C638"/>
@@ -9968,7 +12268,346 @@
       </w:rPr>
     </w:lvl>
   </w:abstractNum>
-  <w:abstractNum w:abstractNumId="10" w15:restartNumberingAfterBreak="0">
+  <w:abstractNum w:abstractNumId="13" w15:restartNumberingAfterBreak="0">
+    <w:nsid w:val="50CA1872"/>
+    <w:multiLevelType w:val="hybridMultilevel"/>
+    <w:tmpl w:val="657A8BDE"/>
+    <w:lvl w:ilvl="0" w:tplc="04090001">
+      <w:start w:val="1"/>
+      <w:numFmt w:val="bullet"/>
+      <w:lvlText w:val=""/>
+      <w:lvlJc w:val="left"/>
+      <w:pPr>
+        <w:ind w:left="720" w:hanging="360"/>
+      </w:pPr>
+      <w:rPr>
+        <w:rFonts w:ascii="Symbol" w:hAnsi="Symbol" w:hint="default"/>
+      </w:rPr>
+    </w:lvl>
+    <w:lvl w:ilvl="1" w:tplc="04090003">
+      <w:start w:val="1"/>
+      <w:numFmt w:val="bullet"/>
+      <w:lvlText w:val="o"/>
+      <w:lvlJc w:val="left"/>
+      <w:pPr>
+        <w:ind w:left="1440" w:hanging="360"/>
+      </w:pPr>
+      <w:rPr>
+        <w:rFonts w:ascii="Courier New" w:hAnsi="Courier New" w:cs="Courier New" w:hint="default"/>
+      </w:rPr>
+    </w:lvl>
+    <w:lvl w:ilvl="2" w:tplc="04090005">
+      <w:start w:val="1"/>
+      <w:numFmt w:val="bullet"/>
+      <w:lvlText w:val=""/>
+      <w:lvlJc w:val="left"/>
+      <w:pPr>
+        <w:ind w:left="2160" w:hanging="360"/>
+      </w:pPr>
+      <w:rPr>
+        <w:rFonts w:ascii="Wingdings" w:hAnsi="Wingdings" w:hint="default"/>
+      </w:rPr>
+    </w:lvl>
+    <w:lvl w:ilvl="3" w:tplc="04090001" w:tentative="1">
+      <w:start w:val="1"/>
+      <w:numFmt w:val="bullet"/>
+      <w:lvlText w:val=""/>
+      <w:lvlJc w:val="left"/>
+      <w:pPr>
+        <w:ind w:left="2880" w:hanging="360"/>
+      </w:pPr>
+      <w:rPr>
+        <w:rFonts w:ascii="Symbol" w:hAnsi="Symbol" w:hint="default"/>
+      </w:rPr>
+    </w:lvl>
+    <w:lvl w:ilvl="4" w:tplc="04090003" w:tentative="1">
+      <w:start w:val="1"/>
+      <w:numFmt w:val="bullet"/>
+      <w:lvlText w:val="o"/>
+      <w:lvlJc w:val="left"/>
+      <w:pPr>
+        <w:ind w:left="3600" w:hanging="360"/>
+      </w:pPr>
+      <w:rPr>
+        <w:rFonts w:ascii="Courier New" w:hAnsi="Courier New" w:cs="Courier New" w:hint="default"/>
+      </w:rPr>
+    </w:lvl>
+    <w:lvl w:ilvl="5" w:tplc="04090005" w:tentative="1">
+      <w:start w:val="1"/>
+      <w:numFmt w:val="bullet"/>
+      <w:lvlText w:val=""/>
+      <w:lvlJc w:val="left"/>
+      <w:pPr>
+        <w:ind w:left="4320" w:hanging="360"/>
+      </w:pPr>
+      <w:rPr>
+        <w:rFonts w:ascii="Wingdings" w:hAnsi="Wingdings" w:hint="default"/>
+      </w:rPr>
+    </w:lvl>
+    <w:lvl w:ilvl="6" w:tplc="04090001" w:tentative="1">
+      <w:start w:val="1"/>
+      <w:numFmt w:val="bullet"/>
+      <w:lvlText w:val=""/>
+      <w:lvlJc w:val="left"/>
+      <w:pPr>
+        <w:ind w:left="5040" w:hanging="360"/>
+      </w:pPr>
+      <w:rPr>
+        <w:rFonts w:ascii="Symbol" w:hAnsi="Symbol" w:hint="default"/>
+      </w:rPr>
+    </w:lvl>
+    <w:lvl w:ilvl="7" w:tplc="04090003" w:tentative="1">
+      <w:start w:val="1"/>
+      <w:numFmt w:val="bullet"/>
+      <w:lvlText w:val="o"/>
+      <w:lvlJc w:val="left"/>
+      <w:pPr>
+        <w:ind w:left="5760" w:hanging="360"/>
+      </w:pPr>
+      <w:rPr>
+        <w:rFonts w:ascii="Courier New" w:hAnsi="Courier New" w:cs="Courier New" w:hint="default"/>
+      </w:rPr>
+    </w:lvl>
+    <w:lvl w:ilvl="8" w:tplc="04090005" w:tentative="1">
+      <w:start w:val="1"/>
+      <w:numFmt w:val="bullet"/>
+      <w:lvlText w:val=""/>
+      <w:lvlJc w:val="left"/>
+      <w:pPr>
+        <w:ind w:left="6480" w:hanging="360"/>
+      </w:pPr>
+      <w:rPr>
+        <w:rFonts w:ascii="Wingdings" w:hAnsi="Wingdings" w:hint="default"/>
+      </w:rPr>
+    </w:lvl>
+  </w:abstractNum>
+  <w:abstractNum w:abstractNumId="14" w15:restartNumberingAfterBreak="0">
+    <w:nsid w:val="5D263262"/>
+    <w:multiLevelType w:val="hybridMultilevel"/>
+    <w:tmpl w:val="44865478"/>
+    <w:lvl w:ilvl="0" w:tplc="04090001">
+      <w:start w:val="1"/>
+      <w:numFmt w:val="bullet"/>
+      <w:lvlText w:val=""/>
+      <w:lvlJc w:val="left"/>
+      <w:pPr>
+        <w:ind w:left="720" w:hanging="360"/>
+      </w:pPr>
+      <w:rPr>
+        <w:rFonts w:ascii="Symbol" w:hAnsi="Symbol" w:hint="default"/>
+      </w:rPr>
+    </w:lvl>
+    <w:lvl w:ilvl="1" w:tplc="04090003" w:tentative="1">
+      <w:start w:val="1"/>
+      <w:numFmt w:val="bullet"/>
+      <w:lvlText w:val="o"/>
+      <w:lvlJc w:val="left"/>
+      <w:pPr>
+        <w:ind w:left="1440" w:hanging="360"/>
+      </w:pPr>
+      <w:rPr>
+        <w:rFonts w:ascii="Courier New" w:hAnsi="Courier New" w:cs="Courier New" w:hint="default"/>
+      </w:rPr>
+    </w:lvl>
+    <w:lvl w:ilvl="2" w:tplc="04090005" w:tentative="1">
+      <w:start w:val="1"/>
+      <w:numFmt w:val="bullet"/>
+      <w:lvlText w:val=""/>
+      <w:lvlJc w:val="left"/>
+      <w:pPr>
+        <w:ind w:left="2160" w:hanging="360"/>
+      </w:pPr>
+      <w:rPr>
+        <w:rFonts w:ascii="Wingdings" w:hAnsi="Wingdings" w:hint="default"/>
+      </w:rPr>
+    </w:lvl>
+    <w:lvl w:ilvl="3" w:tplc="04090001" w:tentative="1">
+      <w:start w:val="1"/>
+      <w:numFmt w:val="bullet"/>
+      <w:lvlText w:val=""/>
+      <w:lvlJc w:val="left"/>
+      <w:pPr>
+        <w:ind w:left="2880" w:hanging="360"/>
+      </w:pPr>
+      <w:rPr>
+        <w:rFonts w:ascii="Symbol" w:hAnsi="Symbol" w:hint="default"/>
+      </w:rPr>
+    </w:lvl>
+    <w:lvl w:ilvl="4" w:tplc="04090003" w:tentative="1">
+      <w:start w:val="1"/>
+      <w:numFmt w:val="bullet"/>
+      <w:lvlText w:val="o"/>
+      <w:lvlJc w:val="left"/>
+      <w:pPr>
+        <w:ind w:left="3600" w:hanging="360"/>
+      </w:pPr>
+      <w:rPr>
+        <w:rFonts w:ascii="Courier New" w:hAnsi="Courier New" w:cs="Courier New" w:hint="default"/>
+      </w:rPr>
+    </w:lvl>
+    <w:lvl w:ilvl="5" w:tplc="04090005" w:tentative="1">
+      <w:start w:val="1"/>
+      <w:numFmt w:val="bullet"/>
+      <w:lvlText w:val=""/>
+      <w:lvlJc w:val="left"/>
+      <w:pPr>
+        <w:ind w:left="4320" w:hanging="360"/>
+      </w:pPr>
+      <w:rPr>
+        <w:rFonts w:ascii="Wingdings" w:hAnsi="Wingdings" w:hint="default"/>
+      </w:rPr>
+    </w:lvl>
+    <w:lvl w:ilvl="6" w:tplc="04090001" w:tentative="1">
+      <w:start w:val="1"/>
+      <w:numFmt w:val="bullet"/>
+      <w:lvlText w:val=""/>
+      <w:lvlJc w:val="left"/>
+      <w:pPr>
+        <w:ind w:left="5040" w:hanging="360"/>
+      </w:pPr>
+      <w:rPr>
+        <w:rFonts w:ascii="Symbol" w:hAnsi="Symbol" w:hint="default"/>
+      </w:rPr>
+    </w:lvl>
+    <w:lvl w:ilvl="7" w:tplc="04090003" w:tentative="1">
+      <w:start w:val="1"/>
+      <w:numFmt w:val="bullet"/>
+      <w:lvlText w:val="o"/>
+      <w:lvlJc w:val="left"/>
+      <w:pPr>
+        <w:ind w:left="5760" w:hanging="360"/>
+      </w:pPr>
+      <w:rPr>
+        <w:rFonts w:ascii="Courier New" w:hAnsi="Courier New" w:cs="Courier New" w:hint="default"/>
+      </w:rPr>
+    </w:lvl>
+    <w:lvl w:ilvl="8" w:tplc="04090005" w:tentative="1">
+      <w:start w:val="1"/>
+      <w:numFmt w:val="bullet"/>
+      <w:lvlText w:val=""/>
+      <w:lvlJc w:val="left"/>
+      <w:pPr>
+        <w:ind w:left="6480" w:hanging="360"/>
+      </w:pPr>
+      <w:rPr>
+        <w:rFonts w:ascii="Wingdings" w:hAnsi="Wingdings" w:hint="default"/>
+      </w:rPr>
+    </w:lvl>
+  </w:abstractNum>
+  <w:abstractNum w:abstractNumId="15" w15:restartNumberingAfterBreak="0">
+    <w:nsid w:val="602A75A5"/>
+    <w:multiLevelType w:val="hybridMultilevel"/>
+    <w:tmpl w:val="119254BC"/>
+    <w:lvl w:ilvl="0" w:tplc="04090001">
+      <w:start w:val="1"/>
+      <w:numFmt w:val="bullet"/>
+      <w:lvlText w:val=""/>
+      <w:lvlJc w:val="left"/>
+      <w:pPr>
+        <w:ind w:left="720" w:hanging="360"/>
+      </w:pPr>
+      <w:rPr>
+        <w:rFonts w:ascii="Symbol" w:hAnsi="Symbol" w:hint="default"/>
+      </w:rPr>
+    </w:lvl>
+    <w:lvl w:ilvl="1" w:tplc="04090003">
+      <w:start w:val="1"/>
+      <w:numFmt w:val="bullet"/>
+      <w:lvlText w:val="o"/>
+      <w:lvlJc w:val="left"/>
+      <w:pPr>
+        <w:ind w:left="1440" w:hanging="360"/>
+      </w:pPr>
+      <w:rPr>
+        <w:rFonts w:ascii="Courier New" w:hAnsi="Courier New" w:cs="Courier New" w:hint="default"/>
+      </w:rPr>
+    </w:lvl>
+    <w:lvl w:ilvl="2" w:tplc="04090005" w:tentative="1">
+      <w:start w:val="1"/>
+      <w:numFmt w:val="bullet"/>
+      <w:lvlText w:val=""/>
+      <w:lvlJc w:val="left"/>
+      <w:pPr>
+        <w:ind w:left="2160" w:hanging="360"/>
+      </w:pPr>
+      <w:rPr>
+        <w:rFonts w:ascii="Wingdings" w:hAnsi="Wingdings" w:hint="default"/>
+      </w:rPr>
+    </w:lvl>
+    <w:lvl w:ilvl="3" w:tplc="04090001" w:tentative="1">
+      <w:start w:val="1"/>
+      <w:numFmt w:val="bullet"/>
+      <w:lvlText w:val=""/>
+      <w:lvlJc w:val="left"/>
+      <w:pPr>
+        <w:ind w:left="2880" w:hanging="360"/>
+      </w:pPr>
+      <w:rPr>
+        <w:rFonts w:ascii="Symbol" w:hAnsi="Symbol" w:hint="default"/>
+      </w:rPr>
+    </w:lvl>
+    <w:lvl w:ilvl="4" w:tplc="04090003" w:tentative="1">
+      <w:start w:val="1"/>
+      <w:numFmt w:val="bullet"/>
+      <w:lvlText w:val="o"/>
+      <w:lvlJc w:val="left"/>
+      <w:pPr>
+        <w:ind w:left="3600" w:hanging="360"/>
+      </w:pPr>
+      <w:rPr>
+        <w:rFonts w:ascii="Courier New" w:hAnsi="Courier New" w:cs="Courier New" w:hint="default"/>
+      </w:rPr>
+    </w:lvl>
+    <w:lvl w:ilvl="5" w:tplc="04090005" w:tentative="1">
+      <w:start w:val="1"/>
+      <w:numFmt w:val="bullet"/>
+      <w:lvlText w:val=""/>
+      <w:lvlJc w:val="left"/>
+      <w:pPr>
+        <w:ind w:left="4320" w:hanging="360"/>
+      </w:pPr>
+      <w:rPr>
+        <w:rFonts w:ascii="Wingdings" w:hAnsi="Wingdings" w:hint="default"/>
+      </w:rPr>
+    </w:lvl>
+    <w:lvl w:ilvl="6" w:tplc="04090001" w:tentative="1">
+      <w:start w:val="1"/>
+      <w:numFmt w:val="bullet"/>
+      <w:lvlText w:val=""/>
+      <w:lvlJc w:val="left"/>
+      <w:pPr>
+        <w:ind w:left="5040" w:hanging="360"/>
+      </w:pPr>
+      <w:rPr>
+        <w:rFonts w:ascii="Symbol" w:hAnsi="Symbol" w:hint="default"/>
+      </w:rPr>
+    </w:lvl>
+    <w:lvl w:ilvl="7" w:tplc="04090003" w:tentative="1">
+      <w:start w:val="1"/>
+      <w:numFmt w:val="bullet"/>
+      <w:lvlText w:val="o"/>
+      <w:lvlJc w:val="left"/>
+      <w:pPr>
+        <w:ind w:left="5760" w:hanging="360"/>
+      </w:pPr>
+      <w:rPr>
+        <w:rFonts w:ascii="Courier New" w:hAnsi="Courier New" w:cs="Courier New" w:hint="default"/>
+      </w:rPr>
+    </w:lvl>
+    <w:lvl w:ilvl="8" w:tplc="04090005" w:tentative="1">
+      <w:start w:val="1"/>
+      <w:numFmt w:val="bullet"/>
+      <w:lvlText w:val=""/>
+      <w:lvlJc w:val="left"/>
+      <w:pPr>
+        <w:ind w:left="6480" w:hanging="360"/>
+      </w:pPr>
+      <w:rPr>
+        <w:rFonts w:ascii="Wingdings" w:hAnsi="Wingdings" w:hint="default"/>
+      </w:rPr>
+    </w:lvl>
+  </w:abstractNum>
+  <w:abstractNum w:abstractNumId="16" w15:restartNumberingAfterBreak="0">
     <w:nsid w:val="642947B9"/>
     <w:multiLevelType w:val="multilevel"/>
     <w:tmpl w:val="83246236"/>
@@ -10117,7 +12756,7 @@
       </w:rPr>
     </w:lvl>
   </w:abstractNum>
-  <w:abstractNum w:abstractNumId="11" w15:restartNumberingAfterBreak="0">
+  <w:abstractNum w:abstractNumId="17" w15:restartNumberingAfterBreak="0">
     <w:nsid w:val="6FAF5B8C"/>
     <w:multiLevelType w:val="multilevel"/>
     <w:tmpl w:val="A8D8098A"/>
@@ -10266,41 +12905,316 @@
       </w:rPr>
     </w:lvl>
   </w:abstractNum>
+  <w:abstractNum w:abstractNumId="18" w15:restartNumberingAfterBreak="0">
+    <w:nsid w:val="729E797E"/>
+    <w:multiLevelType w:val="hybridMultilevel"/>
+    <w:tmpl w:val="3B907CF6"/>
+    <w:lvl w:ilvl="0" w:tplc="04090001">
+      <w:start w:val="1"/>
+      <w:numFmt w:val="bullet"/>
+      <w:lvlText w:val=""/>
+      <w:lvlJc w:val="left"/>
+      <w:pPr>
+        <w:ind w:left="720" w:hanging="360"/>
+      </w:pPr>
+      <w:rPr>
+        <w:rFonts w:ascii="Symbol" w:hAnsi="Symbol" w:hint="default"/>
+      </w:rPr>
+    </w:lvl>
+    <w:lvl w:ilvl="1" w:tplc="04090003" w:tentative="1">
+      <w:start w:val="1"/>
+      <w:numFmt w:val="bullet"/>
+      <w:lvlText w:val="o"/>
+      <w:lvlJc w:val="left"/>
+      <w:pPr>
+        <w:ind w:left="1440" w:hanging="360"/>
+      </w:pPr>
+      <w:rPr>
+        <w:rFonts w:ascii="Courier New" w:hAnsi="Courier New" w:cs="Courier New" w:hint="default"/>
+      </w:rPr>
+    </w:lvl>
+    <w:lvl w:ilvl="2" w:tplc="04090005" w:tentative="1">
+      <w:start w:val="1"/>
+      <w:numFmt w:val="bullet"/>
+      <w:lvlText w:val=""/>
+      <w:lvlJc w:val="left"/>
+      <w:pPr>
+        <w:ind w:left="2160" w:hanging="360"/>
+      </w:pPr>
+      <w:rPr>
+        <w:rFonts w:ascii="Wingdings" w:hAnsi="Wingdings" w:hint="default"/>
+      </w:rPr>
+    </w:lvl>
+    <w:lvl w:ilvl="3" w:tplc="04090001" w:tentative="1">
+      <w:start w:val="1"/>
+      <w:numFmt w:val="bullet"/>
+      <w:lvlText w:val=""/>
+      <w:lvlJc w:val="left"/>
+      <w:pPr>
+        <w:ind w:left="2880" w:hanging="360"/>
+      </w:pPr>
+      <w:rPr>
+        <w:rFonts w:ascii="Symbol" w:hAnsi="Symbol" w:hint="default"/>
+      </w:rPr>
+    </w:lvl>
+    <w:lvl w:ilvl="4" w:tplc="04090003" w:tentative="1">
+      <w:start w:val="1"/>
+      <w:numFmt w:val="bullet"/>
+      <w:lvlText w:val="o"/>
+      <w:lvlJc w:val="left"/>
+      <w:pPr>
+        <w:ind w:left="3600" w:hanging="360"/>
+      </w:pPr>
+      <w:rPr>
+        <w:rFonts w:ascii="Courier New" w:hAnsi="Courier New" w:cs="Courier New" w:hint="default"/>
+      </w:rPr>
+    </w:lvl>
+    <w:lvl w:ilvl="5" w:tplc="04090005" w:tentative="1">
+      <w:start w:val="1"/>
+      <w:numFmt w:val="bullet"/>
+      <w:lvlText w:val=""/>
+      <w:lvlJc w:val="left"/>
+      <w:pPr>
+        <w:ind w:left="4320" w:hanging="360"/>
+      </w:pPr>
+      <w:rPr>
+        <w:rFonts w:ascii="Wingdings" w:hAnsi="Wingdings" w:hint="default"/>
+      </w:rPr>
+    </w:lvl>
+    <w:lvl w:ilvl="6" w:tplc="04090001" w:tentative="1">
+      <w:start w:val="1"/>
+      <w:numFmt w:val="bullet"/>
+      <w:lvlText w:val=""/>
+      <w:lvlJc w:val="left"/>
+      <w:pPr>
+        <w:ind w:left="5040" w:hanging="360"/>
+      </w:pPr>
+      <w:rPr>
+        <w:rFonts w:ascii="Symbol" w:hAnsi="Symbol" w:hint="default"/>
+      </w:rPr>
+    </w:lvl>
+    <w:lvl w:ilvl="7" w:tplc="04090003" w:tentative="1">
+      <w:start w:val="1"/>
+      <w:numFmt w:val="bullet"/>
+      <w:lvlText w:val="o"/>
+      <w:lvlJc w:val="left"/>
+      <w:pPr>
+        <w:ind w:left="5760" w:hanging="360"/>
+      </w:pPr>
+      <w:rPr>
+        <w:rFonts w:ascii="Courier New" w:hAnsi="Courier New" w:cs="Courier New" w:hint="default"/>
+      </w:rPr>
+    </w:lvl>
+    <w:lvl w:ilvl="8" w:tplc="04090005" w:tentative="1">
+      <w:start w:val="1"/>
+      <w:numFmt w:val="bullet"/>
+      <w:lvlText w:val=""/>
+      <w:lvlJc w:val="left"/>
+      <w:pPr>
+        <w:ind w:left="6480" w:hanging="360"/>
+      </w:pPr>
+      <w:rPr>
+        <w:rFonts w:ascii="Wingdings" w:hAnsi="Wingdings" w:hint="default"/>
+      </w:rPr>
+    </w:lvl>
+  </w:abstractNum>
+  <w:abstractNum w:abstractNumId="19" w15:restartNumberingAfterBreak="0">
+    <w:nsid w:val="7D853D8E"/>
+    <w:multiLevelType w:val="hybridMultilevel"/>
+    <w:tmpl w:val="77F8EFFC"/>
+    <w:lvl w:ilvl="0" w:tplc="446EA4AA">
+      <w:start w:val="1"/>
+      <w:numFmt w:val="bullet"/>
+      <w:lvlText w:val="•"/>
+      <w:lvlJc w:val="left"/>
+      <w:pPr>
+        <w:tabs>
+          <w:tab w:val="num" w:pos="720"/>
+        </w:tabs>
+        <w:ind w:left="720" w:hanging="360"/>
+      </w:pPr>
+      <w:rPr>
+        <w:rFonts w:ascii="Arial" w:hAnsi="Arial" w:hint="default"/>
+      </w:rPr>
+    </w:lvl>
+    <w:lvl w:ilvl="1" w:tplc="B6848628">
+      <w:numFmt w:val="bullet"/>
+      <w:lvlText w:val="o"/>
+      <w:lvlJc w:val="left"/>
+      <w:pPr>
+        <w:tabs>
+          <w:tab w:val="num" w:pos="1440"/>
+        </w:tabs>
+        <w:ind w:left="1440" w:hanging="360"/>
+      </w:pPr>
+      <w:rPr>
+        <w:rFonts w:ascii="Courier New" w:hAnsi="Courier New" w:hint="default"/>
+      </w:rPr>
+    </w:lvl>
+    <w:lvl w:ilvl="2" w:tplc="27321ECA">
+      <w:numFmt w:val="bullet"/>
+      <w:lvlText w:val=""/>
+      <w:lvlJc w:val="left"/>
+      <w:pPr>
+        <w:tabs>
+          <w:tab w:val="num" w:pos="2160"/>
+        </w:tabs>
+        <w:ind w:left="2160" w:hanging="360"/>
+      </w:pPr>
+      <w:rPr>
+        <w:rFonts w:ascii="Wingdings" w:hAnsi="Wingdings" w:hint="default"/>
+      </w:rPr>
+    </w:lvl>
+    <w:lvl w:ilvl="3" w:tplc="AC3285BE" w:tentative="1">
+      <w:start w:val="1"/>
+      <w:numFmt w:val="bullet"/>
+      <w:lvlText w:val="•"/>
+      <w:lvlJc w:val="left"/>
+      <w:pPr>
+        <w:tabs>
+          <w:tab w:val="num" w:pos="2880"/>
+        </w:tabs>
+        <w:ind w:left="2880" w:hanging="360"/>
+      </w:pPr>
+      <w:rPr>
+        <w:rFonts w:ascii="Arial" w:hAnsi="Arial" w:hint="default"/>
+      </w:rPr>
+    </w:lvl>
+    <w:lvl w:ilvl="4" w:tplc="4300D954" w:tentative="1">
+      <w:start w:val="1"/>
+      <w:numFmt w:val="bullet"/>
+      <w:lvlText w:val="•"/>
+      <w:lvlJc w:val="left"/>
+      <w:pPr>
+        <w:tabs>
+          <w:tab w:val="num" w:pos="3600"/>
+        </w:tabs>
+        <w:ind w:left="3600" w:hanging="360"/>
+      </w:pPr>
+      <w:rPr>
+        <w:rFonts w:ascii="Arial" w:hAnsi="Arial" w:hint="default"/>
+      </w:rPr>
+    </w:lvl>
+    <w:lvl w:ilvl="5" w:tplc="EE92E12C" w:tentative="1">
+      <w:start w:val="1"/>
+      <w:numFmt w:val="bullet"/>
+      <w:lvlText w:val="•"/>
+      <w:lvlJc w:val="left"/>
+      <w:pPr>
+        <w:tabs>
+          <w:tab w:val="num" w:pos="4320"/>
+        </w:tabs>
+        <w:ind w:left="4320" w:hanging="360"/>
+      </w:pPr>
+      <w:rPr>
+        <w:rFonts w:ascii="Arial" w:hAnsi="Arial" w:hint="default"/>
+      </w:rPr>
+    </w:lvl>
+    <w:lvl w:ilvl="6" w:tplc="DB249DC2" w:tentative="1">
+      <w:start w:val="1"/>
+      <w:numFmt w:val="bullet"/>
+      <w:lvlText w:val="•"/>
+      <w:lvlJc w:val="left"/>
+      <w:pPr>
+        <w:tabs>
+          <w:tab w:val="num" w:pos="5040"/>
+        </w:tabs>
+        <w:ind w:left="5040" w:hanging="360"/>
+      </w:pPr>
+      <w:rPr>
+        <w:rFonts w:ascii="Arial" w:hAnsi="Arial" w:hint="default"/>
+      </w:rPr>
+    </w:lvl>
+    <w:lvl w:ilvl="7" w:tplc="8A4645C4" w:tentative="1">
+      <w:start w:val="1"/>
+      <w:numFmt w:val="bullet"/>
+      <w:lvlText w:val="•"/>
+      <w:lvlJc w:val="left"/>
+      <w:pPr>
+        <w:tabs>
+          <w:tab w:val="num" w:pos="5760"/>
+        </w:tabs>
+        <w:ind w:left="5760" w:hanging="360"/>
+      </w:pPr>
+      <w:rPr>
+        <w:rFonts w:ascii="Arial" w:hAnsi="Arial" w:hint="default"/>
+      </w:rPr>
+    </w:lvl>
+    <w:lvl w:ilvl="8" w:tplc="CFBAC7CE" w:tentative="1">
+      <w:start w:val="1"/>
+      <w:numFmt w:val="bullet"/>
+      <w:lvlText w:val="•"/>
+      <w:lvlJc w:val="left"/>
+      <w:pPr>
+        <w:tabs>
+          <w:tab w:val="num" w:pos="6480"/>
+        </w:tabs>
+        <w:ind w:left="6480" w:hanging="360"/>
+      </w:pPr>
+      <w:rPr>
+        <w:rFonts w:ascii="Arial" w:hAnsi="Arial" w:hint="default"/>
+      </w:rPr>
+    </w:lvl>
+  </w:abstractNum>
   <w:num w:numId="1" w16cid:durableId="1032999739">
-    <w:abstractNumId w:val="4"/>
+    <w:abstractNumId w:val="6"/>
   </w:num>
   <w:num w:numId="2" w16cid:durableId="1645424980">
-    <w:abstractNumId w:val="9"/>
+    <w:abstractNumId w:val="12"/>
   </w:num>
   <w:num w:numId="3" w16cid:durableId="1425767280">
-    <w:abstractNumId w:val="2"/>
+    <w:abstractNumId w:val="3"/>
   </w:num>
   <w:num w:numId="4" w16cid:durableId="296685975">
-    <w:abstractNumId w:val="8"/>
+    <w:abstractNumId w:val="10"/>
   </w:num>
   <w:num w:numId="5" w16cid:durableId="2114740526">
     <w:abstractNumId w:val="0"/>
   </w:num>
   <w:num w:numId="6" w16cid:durableId="529608659">
-    <w:abstractNumId w:val="10"/>
+    <w:abstractNumId w:val="16"/>
   </w:num>
   <w:num w:numId="7" w16cid:durableId="912542188">
+    <w:abstractNumId w:val="17"/>
+  </w:num>
+  <w:num w:numId="8" w16cid:durableId="2142308325">
+    <w:abstractNumId w:val="9"/>
+  </w:num>
+  <w:num w:numId="9" w16cid:durableId="121652035">
+    <w:abstractNumId w:val="5"/>
+  </w:num>
+  <w:num w:numId="10" w16cid:durableId="2134052821">
+    <w:abstractNumId w:val="8"/>
+  </w:num>
+  <w:num w:numId="11" w16cid:durableId="1744794894">
+    <w:abstractNumId w:val="2"/>
+  </w:num>
+  <w:num w:numId="12" w16cid:durableId="100298794">
+    <w:abstractNumId w:val="7"/>
+  </w:num>
+  <w:num w:numId="13" w16cid:durableId="1150244367">
     <w:abstractNumId w:val="11"/>
   </w:num>
-  <w:num w:numId="8" w16cid:durableId="2142308325">
-    <w:abstractNumId w:val="7"/>
+  <w:num w:numId="14" w16cid:durableId="944115971">
+    <w:abstractNumId w:val="14"/>
   </w:num>
-  <w:num w:numId="9" w16cid:durableId="121652035">
-    <w:abstractNumId w:val="3"/>
+  <w:num w:numId="15" w16cid:durableId="448745219">
+    <w:abstractNumId w:val="18"/>
   </w:num>
-  <w:num w:numId="10" w16cid:durableId="2134052821">
-    <w:abstractNumId w:val="6"/>
+  <w:num w:numId="16" w16cid:durableId="1098215183">
+    <w:abstractNumId w:val="15"/>
   </w:num>
-  <w:num w:numId="11" w16cid:durableId="1744794894">
+  <w:num w:numId="17" w16cid:durableId="1625698933">
+    <w:abstractNumId w:val="19"/>
+  </w:num>
+  <w:num w:numId="18" w16cid:durableId="546256217">
+    <w:abstractNumId w:val="4"/>
+  </w:num>
+  <w:num w:numId="19" w16cid:durableId="691296435">
     <w:abstractNumId w:val="1"/>
   </w:num>
-  <w:num w:numId="12" w16cid:durableId="100298794">
-    <w:abstractNumId w:val="5"/>
+  <w:num w:numId="20" w16cid:durableId="83263311">
+    <w:abstractNumId w:val="13"/>
   </w:num>
 </w:numbering>
 </file>
@@ -10760,7 +13674,6 @@
   <w:style w:type="character" w:default="1" w:styleId="DefaultParagraphFont">
     <w:name w:val="Default Paragraph Font"/>
     <w:uiPriority w:val="1"/>
-    <w:semiHidden/>
     <w:unhideWhenUsed/>
   </w:style>
   <w:style w:type="table" w:default="1" w:styleId="TableNormal">
@@ -10833,7 +13746,6 @@
     <w:name w:val="Normal (Web)"/>
     <w:basedOn w:val="Normal"/>
     <w:uiPriority w:val="99"/>
-    <w:semiHidden/>
     <w:unhideWhenUsed/>
     <w:pPr>
       <w:spacing w:before="120" w:after="120"/>
@@ -10997,6 +13909,28 @@
     <w:semiHidden/>
     <w:rPr>
       <w:rFonts w:ascii="Consolas" w:eastAsiaTheme="minorEastAsia" w:hAnsi="Consolas"/>
+    </w:rPr>
+  </w:style>
+  <w:style w:type="paragraph" w:styleId="ListParagraph">
+    <w:name w:val="List Paragraph"/>
+    <w:basedOn w:val="Normal"/>
+    <w:uiPriority w:val="34"/>
+    <w:qFormat/>
+    <w:rsid w:val="000655C0"/>
+    <w:pPr>
+      <w:ind w:left="720"/>
+      <w:contextualSpacing/>
+    </w:pPr>
+  </w:style>
+  <w:style w:type="paragraph" w:styleId="NoSpacing">
+    <w:name w:val="No Spacing"/>
+    <w:uiPriority w:val="1"/>
+    <w:qFormat/>
+    <w:rsid w:val="000655C0"/>
+    <w:rPr>
+      <w:rFonts w:eastAsiaTheme="minorEastAsia"/>
+      <w:sz w:val="24"/>
+      <w:szCs w:val="24"/>
     </w:rPr>
   </w:style>
 </w:styles>

</xml_diff>